<commit_message>
docs(paper): introduce ChronoSentry model name, unique mathematical notation, improved equation formatting, and 20 literature citations
</commit_message>
<xml_diff>
--- a/paper/The_Self_Auditing_Ledger_Paper.docx
+++ b/paper/The_Self_Auditing_Ledger_Paper.docx
@@ -14,7 +14,7 @@
           <w:color w:val="1B365D"/>
           <w:sz w:val="34"/>
         </w:rPr>
-        <w:t>The Self-Auditing Ledger: Leakage-Free Temporal Graph Topology for ERP Fraud Detection, with a Production Audit Console</w:t>
+        <w:t>ChronoSentry: Leakage-Free Temporal Graph Topology for Streaming ERP Fraud Detection, with a Production Continuous Audit Console</w:t>
       </w:r>
     </w:p>
     <w:p>
@@ -69,7 +69,7 @@
           <w:color w:val="2D3748"/>
           <w:sz w:val="19"/>
         </w:rPr>
-        <w:t>Graph-based fraud detection methods are frequently proposed without an explicit audit of temporal leakage, and rarely evaluated with a controlled, same-architecture ablation that isolates the marginal value of graph structure from the tabular signal it is layered on top of. This paper presents a leakage-free streaming temporal-topology feature engine—enforcing a formal read-then-insert invariant so that a transaction's features can never depend on information from its own future—and subjects it to a rigorous within-dataset ablation across three heterogeneous financial datasets (Dataset 1: BankSim bipartite payment simulator, Dataset 2: IBM AML multi-hop transfer network, and Dataset 3: SAP Würzburg real general-ledger export). The central finding is conditional, not universal: graph topology adds substantial, leakage-free predictive value on BankSim (+11.7% relative PR-AUC) and synthetic ERP (+213%), is uninformative on IBM AML whose tabular baseline is already saturated (PR-AUC ≈ 0.992), and actively degrades SAP Würzburg (-54.6%). We report this honestly, including the finding that hand-crafted cycle-detection features carry near-zero gain importance on all three datasets, that a learned temporal graph network (TGN) does not beat hand-crafted topology on real data, and that naive synthetic-data augmentation measurably harms real-dataset performance. Furthermore, to address cross-institutional banking privacy barriers (GDPR/GLBA), we introduce a Privacy-Preserving Federated Learning architecture with empirical validation reliability weighting (FedProx), recovering 98.91% of the centralized upper bound's performance without sharing raw customer transactions. Finally, we describe and empirically verify a production Procure-to-Pay ERP with a forensic audit console that serves this leakage-free feature computation live against real transactions with sub-2.5ms latency, backed by database-enforced financial-integrity invariants.</w:t>
+        <w:t>Graph-based fraud detection methods are frequently proposed without an explicit audit of temporal leakage, and rarely evaluated with a controlled, same-architecture ablation that isolates the marginal value of graph structure from the tabular signal it is layered on top of. This paper presents ChronoSentry (Chronologically-Hardened Sentry for Streaming Ledger Forensics): an end-to-end framework featuring a leakage-free streaming temporal-topology feature engine that enforces a formal read-then-insert invariant so that a transaction's features can never depend on information from its own future. We subject ChronoSentry to a rigorous within-dataset ablation across three heterogeneous financial datasets (Dataset 1: BankSim bipartite payment simulator, Dataset 2: IBM AML multi-hop transfer network, and Dataset 3: SAP Würzburg real general-ledger export). The central finding is conditional, not universal: graph topology adds substantial, leakage-free predictive value on BankSim (+11.7% relative PR-AUC) and synthetic ERP (+213%), is uninformative on IBM AML whose tabular baseline is already saturated (PR-AUC ≈ 0.992), and actively degrades SAP Würzburg (-54.6%). We report this honestly, including the finding that hand-crafted cycle-detection features carry near-zero gain importance on all three datasets, that a learned temporal graph network (TGN) does not beat hand-crafted topology on real data, and that naive synthetic-data augmentation measurably harms real-dataset performance. Furthermore, to address cross-institutional banking privacy barriers (GDPR/GLBA), ChronoSentry introduces a Privacy-Preserving Federated Learning architecture with empirical validation reliability weighting (FedProx), recovering 98.91% of the centralized upper bound's performance without sharing raw customer transactions. Finally, we describe and empirically verify a production Procure-to-Pay ERP with a forensic audit console that serves this leakage-free feature computation live against real transactions with sub-2.5ms latency, backed by database-enforced financial-integrity invariants.</w:t>
       </w:r>
     </w:p>
     <w:p>
@@ -92,7 +92,7 @@
           <w:color w:val="2D3748"/>
           <w:sz w:val="19"/>
         </w:rPr>
-        <w:t>fraud detection, temporal graphs, data leakage, anti-money laundering, explainable AI, continuous auditing, ERP systems, XGBoost, federated learning, synthetic data.</w:t>
+        <w:t>fraud detection, temporal graphs, data leakage, anti-money laundering, explainable AI, continuous auditing, ERP systems, XGBoost, federated learning, synthetic data, ChronoSentry.</w:t>
       </w:r>
     </w:p>
     <w:p>
@@ -122,7 +122,7 @@
           <w:color w:val="2D3748"/>
           <w:sz w:val="20"/>
         </w:rPr>
-        <w:t>Financial statement fraud, procurement deception, and money laundering impose global economic losses exceeding hundreds of billions of dollars annually. Modern enterprise resource planning (ERP) architectures record millions of double-entry ledger postings daily. Yet, automated auditing controls continue to rely predominantly on static heuristic threshold rules (e.g., flagging transfers strictly above $10,000) or shallow row-level tabular classifiers. These approaches analyze transactions in isolation, remaining fundamentally blind to coordinated structural fraud typologies—such as multi-hop layering chains, smurfing distributions, and accounts-receivable lapping schemes (where misappropriated funds are concealed by systematically misapplying subsequent customer remittances).</w:t>
+        <w:t>Financial statement fraud, procurement deception, and money laundering impose global economic losses exceeding hundreds of billions of dollars annually. Modern enterprise resource planning (ERP) architectures record millions of double-entry ledger postings daily. Yet, automated auditing controls continue to rely predominantly on static heuristic threshold rules (e.g., flagging transfers strictly above $10,000) or shallow row-level tabular classifiers [2]. These approaches analyze transactions in isolation, remaining fundamentally blind to coordinated structural fraud typologies—such as multi-hop layering chains, smurfing distributions, and accounts-receivable lapping schemes (where misappropriated funds are concealed by systematically misapplying subsequent customer remittances) [1, 2].</w:t>
       </w:r>
     </w:p>
     <w:p>
@@ -137,7 +137,7 @@
           <w:color w:val="2D3748"/>
           <w:sz w:val="20"/>
         </w:rPr>
-        <w:t>Graph Neural Networks (GNNs) and temporal graph representation learning have emerged as the primary research paradigm for relational financial fraud detection. However, our systematic analysis of published literature reveals three pervasive methodological crises:</w:t>
+        <w:t>Graph Neural Networks (GNNs) and temporal graph representation learning have emerged as the primary research paradigm for relational financial fraud detection [3, 4]. However, our systematic analysis of published literature reveals three pervasive methodological crises:</w:t>
       </w:r>
     </w:p>
     <w:p>
@@ -161,7 +161,7 @@
           <w:color w:val="2D3748"/>
           <w:sz w:val="20"/>
         </w:rPr>
-        <w:t>Standard academic graph benchmarks routinely construct static graph representations over an entire dataset span prior to feature extraction. Consequently, topological indicators (e.g., node degrees, PageRank, k-hop neighborhood embeddings) computed for historical transactions incorporate edges from their own future. When models trained on these contaminated graphs are deployed in production streaming pipelines, their laboratory performance collapses catastrophically.</w:t>
+        <w:t>Standard academic graph benchmarks routinely construct static graph representations over an entire dataset span prior to feature extraction. Consequently, topological indicators (e.g., node degrees, PageRank, k-hop neighborhood embeddings) computed for historical transactions incorporate edges from their own future. When models trained on these contaminated graphs are deployed in production streaming pipelines, their laboratory performance collapses catastrophically [5].</w:t>
       </w:r>
     </w:p>
     <w:p>
@@ -185,7 +185,7 @@
           <w:color w:val="2D3748"/>
           <w:sz w:val="20"/>
         </w:rPr>
-        <w:t>Papers proposing novel graph architectures routinely compare against weak tabular baselines lacking domain-standard feature engineering, failing to control for whether performance gains stem from genuine topological structure or simply from raw monetary amount distributions.</w:t>
+        <w:t>Papers proposing novel graph architectures routinely compare against weak tabular baselines lacking domain-standard feature engineering, failing to control for whether performance gains stem from genuine topological structure or simply from raw monetary amount distributions [17, 19].</w:t>
       </w:r>
     </w:p>
     <w:p>
@@ -209,7 +209,7 @@
           <w:color w:val="2D3748"/>
           <w:sz w:val="20"/>
         </w:rPr>
-        <w:t>Deep graph architectures lack exact, polynomial-time attribution methods. Under strict statutory regulations (Sarbanes-Oxley Act, Basel III, GDPR Article 22), forensic auditors cannot legally act upon black-box risk scores without verifiable, reconstructable evidence trails.</w:t>
+        <w:t>Deep graph architectures (e.g., GCN [6], GAT [7], EvolveGCN [8]) lack exact, polynomial-time attribution methods. Under strict statutory regulations (Sarbanes-Oxley Act, Basel III, GDPR Article 22), forensic auditors cannot legally act upon black-box risk scores without verifiable, reconstructable evidence trails [9, 10, 18].</w:t>
       </w:r>
     </w:p>
     <w:p>
@@ -224,7 +224,7 @@
           <w:color w:val="2D3748"/>
           <w:sz w:val="20"/>
         </w:rPr>
-        <w:t>To resolve these challenges, this paper presents the Self-Auditing Ledger: a comprehensive framework combining a streaming, leakage-free temporal topology engine, exact tree-native explainability, privacy-preserving federated score consensus, and an enterprise-grade continuous auditing console.</w:t>
+        <w:t>To resolve these challenges, this paper presents ChronoSentry (Chronologically-Hardened Sentry for Streaming Ledger Forensics): a comprehensive framework combining a streaming, leakage-free temporal topology engine, exact tree-native explainability, privacy-preserving federated score consensus, and an enterprise-grade continuous auditing console.</w:t>
       </w:r>
     </w:p>
     <w:p>
@@ -269,7 +269,7 @@
           <w:color w:val="1B365D"/>
           <w:sz w:val="25"/>
         </w:rPr>
-        <w:t>3. Proposed Model</w:t>
+        <w:t>3. Proposed Model (ChronoSentry)</w:t>
       </w:r>
     </w:p>
     <w:p>
@@ -325,7 +325,7 @@
           <w:color w:val="2D3748"/>
           <w:sz w:val="17"/>
         </w:rPr>
-        <w:t>Fig. 1: End-to-end architectural pipeline of the Self-Auditing Ledger: from raw ERP/banking transaction ingestion and bipartite graph projection, through the streaming leakage-free temporal topology engine and continuous TGN embedding extraction, to imbalance-aware gradient-boosted tree scoring, TreeSHAP forensic alert packet synthesis, and privacy-preserving federated consensus.</w:t>
+        <w:t>Fig. 1: End-to-end architectural pipeline of the ChronoSentry framework: from raw ERP/banking transaction ingestion and bipartite graph projection, through the streaming leakage-free temporal topology engine and continuous TGN embedding extraction, to imbalance-aware gradient-boosted tree scoring, TreeSHAP forensic alert packet synthesis, and privacy-preserving federated consensus.</w:t>
       </w:r>
     </w:p>
     <w:p>
@@ -355,7 +355,80 @@
           <w:color w:val="2D3748"/>
           <w:sz w:val="20"/>
         </w:rPr>
-        <w:t>The proposed architecture bridges dynamic transactional multigraphs, continuous temporal graph neural networks, gradient-boosted decision trees, and regulatory forensic auditing (Fig. 1). The transaction stream is modeled as a directed temporal multigraph G = (V, E, T), where vertices V represent accounts, counterparties, or general-ledger entities, and edges e_i = (u_i, v_i, t_i, a_i) ∈ E represent timestamped monetary transfers of amount a_i &gt; 0 at integer epoch seconds t_i ∈ T.</w:t>
+        <w:t>The proposed ChronoSentry architecture bridges dynamic transactional multigraphs, continuous temporal graph representations, gradient-boosted decision trees, and regulatory forensic auditing (Fig. 1). We model the incoming transactional ledger as a directed temporal streaming multigraph:</w:t>
+      </w:r>
+    </w:p>
+    <w:tbl>
+      <w:tblPr>
+        <w:tblW w:type="auto" w:w="0"/>
+        <w:jc w:val="center"/>
+        <w:tblLook w:firstColumn="1" w:firstRow="1" w:lastColumn="0" w:lastRow="0" w:noHBand="0" w:noVBand="1" w:val="04A0"/>
+      </w:tblPr>
+      <w:tblGrid>
+        <w:gridCol w:w="10080"/>
+      </w:tblGrid>
+      <w:tr>
+        <w:tc>
+          <w:tcPr>
+            <w:tcW w:type="dxa" w:w="9360"/>
+            <w:shd w:fill="F8FAFC"/>
+            <w:tcBorders>
+              <w:top w:val="none"/>
+              <w:left w:val="single" w:sz="18" w:space="0" w:color="2B6CB0"/>
+              <w:bottom w:val="none"/>
+              <w:right w:val="none"/>
+            </w:tcBorders>
+            <w:tcMar>
+              <w:top w:w="80" w:type="dxa"/>
+              <w:left w:w="140" w:type="dxa"/>
+              <w:bottom w:w="80" w:type="dxa"/>
+              <w:right w:w="100" w:type="dxa"/>
+            </w:tcMar>
+          </w:tcPr>
+          <w:p>
+            <w:pPr>
+              <w:spacing w:before="40" w:after="40" w:line="276" w:lineRule="auto"/>
+            </w:pPr>
+            <w:r>
+              <w:rPr>
+                <w:rFonts w:ascii="Consolas" w:hAnsi="Consolas"/>
+                <w:b/>
+                <w:color w:val="1B365D"/>
+                <w:sz w:val="19"/>
+              </w:rPr>
+              <w:t>𝔊 = (𝒜, 𝒳, 𝕋)</w:t>
+            </w:r>
+            <w:r>
+              <w:rPr>
+                <w:rFonts w:ascii="Calibri" w:hAnsi="Calibri"/>
+                <w:i/>
+                <w:color w:val="718096"/>
+                <w:sz w:val="19"/>
+              </w:rPr>
+              <w:t xml:space="preserve">    (1)</w:t>
+            </w:r>
+          </w:p>
+        </w:tc>
+      </w:tr>
+    </w:tbl>
+    <w:p>
+      <w:pPr>
+        <w:spacing w:after="40"/>
+      </w:pPr>
+    </w:p>
+    <w:p>
+      <w:pPr>
+        <w:spacing w:after="80" w:line="276" w:lineRule="auto"/>
+        <w:jc w:val="both"/>
+      </w:pPr>
+      <w:r>
+        <w:rPr>
+          <w:rFonts w:ascii="Calibri" w:hAnsi="Calibri"/>
+          <w:i w:val="0"/>
+          <w:color w:val="2D3748"/>
+          <w:sz w:val="20"/>
+        </w:rPr>
+        <w:t>where 𝒜 = {α_1, α_2, ..., α_|𝒜|} denotes the universe of financial ledger accounts, counterparties, or general-ledger entities, and 𝕋 = {τ_1, τ_2, ...} ⊂ ℕ represents strictly ordered epoch posting timestamps (τ_k ≤ τ_{k+1}).</w:t>
       </w:r>
     </w:p>
     <w:p>
@@ -370,7 +443,95 @@
           <w:color w:val="2D3748"/>
           <w:sz w:val="20"/>
         </w:rPr>
-        <w:t>The architecture comprises six tightly coupled operational modules:</w:t>
+        <w:t>Each transactional edge is represented as an ordered quintuple:</w:t>
+      </w:r>
+    </w:p>
+    <w:tbl>
+      <w:tblPr>
+        <w:tblW w:type="auto" w:w="0"/>
+        <w:jc w:val="center"/>
+        <w:tblLook w:firstColumn="1" w:firstRow="1" w:lastColumn="0" w:lastRow="0" w:noHBand="0" w:noVBand="1" w:val="04A0"/>
+      </w:tblPr>
+      <w:tblGrid>
+        <w:gridCol w:w="10080"/>
+      </w:tblGrid>
+      <w:tr>
+        <w:tc>
+          <w:tcPr>
+            <w:tcW w:type="dxa" w:w="9360"/>
+            <w:shd w:fill="F8FAFC"/>
+            <w:tcBorders>
+              <w:top w:val="none"/>
+              <w:left w:val="single" w:sz="18" w:space="0" w:color="2B6CB0"/>
+              <w:bottom w:val="none"/>
+              <w:right w:val="none"/>
+            </w:tcBorders>
+            <w:tcMar>
+              <w:top w:w="80" w:type="dxa"/>
+              <w:left w:w="140" w:type="dxa"/>
+              <w:bottom w:w="80" w:type="dxa"/>
+              <w:right w:w="100" w:type="dxa"/>
+            </w:tcMar>
+          </w:tcPr>
+          <w:p>
+            <w:pPr>
+              <w:spacing w:before="40" w:after="40" w:line="276" w:lineRule="auto"/>
+            </w:pPr>
+            <w:r>
+              <w:rPr>
+                <w:rFonts w:ascii="Consolas" w:hAnsi="Consolas"/>
+                <w:b/>
+                <w:color w:val="1B365D"/>
+                <w:sz w:val="19"/>
+              </w:rPr>
+              <w:t>ξ_k = (𝔰_k, 𝔡_k, τ_k, ν_k, c_k) ∈ 𝒳</w:t>
+            </w:r>
+            <w:r>
+              <w:rPr>
+                <w:rFonts w:ascii="Calibri" w:hAnsi="Calibri"/>
+                <w:i/>
+                <w:color w:val="718096"/>
+                <w:sz w:val="19"/>
+              </w:rPr>
+              <w:t xml:space="preserve">    (2)</w:t>
+            </w:r>
+          </w:p>
+        </w:tc>
+      </w:tr>
+    </w:tbl>
+    <w:p>
+      <w:pPr>
+        <w:spacing w:after="40"/>
+      </w:pPr>
+    </w:p>
+    <w:p>
+      <w:pPr>
+        <w:spacing w:after="80" w:line="276" w:lineRule="auto"/>
+        <w:jc w:val="both"/>
+      </w:pPr>
+      <w:r>
+        <w:rPr>
+          <w:rFonts w:ascii="Calibri" w:hAnsi="Calibri"/>
+          <w:i w:val="0"/>
+          <w:color w:val="2D3748"/>
+          <w:sz w:val="20"/>
+        </w:rPr>
+        <w:t>where 𝔰_k ∈ 𝒜 is the debiting source entity, 𝔡_k ∈ 𝒜 is the crediting destination counterparty, τ_k ∈ 𝕋 is the posting epoch timestamp, ν_k ∈ ℝ^+ is the positive monetary transfer volume, and c_k ∈ ℝ^{d_c} encodes ledger categorical attributes (posting key, document voucher type). Unlike Rossi et al. [4] who define dynamic interaction graphs with generic vertex indices (u, v) and continuous time vectors e_{uv}(t), our formulation explicitly anchors monetary flow ν_k and accounting metadata c_k over discrete ledger spaces 𝒜.</w:t>
+      </w:r>
+    </w:p>
+    <w:p>
+      <w:pPr>
+        <w:spacing w:after="80" w:line="276" w:lineRule="auto"/>
+        <w:jc w:val="both"/>
+      </w:pPr>
+      <w:r>
+        <w:rPr>
+          <w:rFonts w:ascii="Calibri" w:hAnsi="Calibri"/>
+          <w:i w:val="0"/>
+          <w:color w:val="2D3748"/>
+          <w:sz w:val="20"/>
+        </w:rPr>
+        <w:t>ChronoSentry comprises six tightly coupled operational modules:</w:t>
       </w:r>
     </w:p>
     <w:p>
@@ -418,7 +579,7 @@
           <w:color w:val="2D3748"/>
           <w:sz w:val="20"/>
         </w:rPr>
-        <w:t>Evaluates sliding-window structural metrics solely against historical graph state G_{&lt; t_i}.</w:t>
+        <w:t>Evaluates sliding-window structural metrics solely against historical graph state 𝔊_{&lt; τ_k}.</w:t>
       </w:r>
     </w:p>
     <w:p>
@@ -568,7 +729,7 @@
           <w:color w:val="2D3748"/>
           <w:sz w:val="20"/>
         </w:rPr>
-        <w:t>Timestamps are coerced to integer epoch seconds; monetary amounts a_i &gt; 0 are converted to double-precision floats; categorical metadata (payment channels, transaction types) are dictionary-encoded with reserved unseen-category indices.</w:t>
+        <w:t>Timestamps are coerced to integer epoch seconds; monetary amounts ν_k &gt; 0 are converted to double-precision floats; categorical metadata are dictionary-encoded with reserved unseen-category indices.</w:t>
       </w:r>
     </w:p>
     <w:p>
@@ -592,7 +753,7 @@
           <w:color w:val="2D3748"/>
           <w:sz w:val="20"/>
         </w:rPr>
-        <w:t>Transactions are sorted by the composite key (t_i, tx_id). The data is partitioned into strictly ordered chronological splits: 60% training (t &lt; T_1), 20% validation (T_1 ≤ t &lt; T_2), and 20% held-out test (t ≥ T_2). No shuffling, random cross-validation, or bidirectional temporal imputation is permitted.</w:t>
+        <w:t>Transactions are sorted by the composite key (τ_k, tx_id). The data is partitioned into strictly ordered chronological splits: 60% training (τ &lt; T_1), 20% validation (T_1 ≤ τ &lt; T_2), and 20% held-out test (τ ≥ T_2). No shuffling, random cross-validation, or bidirectional temporal imputation is permitted.</w:t>
       </w:r>
     </w:p>
     <w:p>
@@ -616,7 +777,196 @@
           <w:color w:val="2D3748"/>
           <w:sz w:val="20"/>
         </w:rPr>
-        <w:t>All feature scaling factors and running z-scores are computed using Welford's algorithm over past observations only: μ_k = μ_{k-1} + (a_k - μ_{k-1})/k, M_{2,k} = M_{2,k-1} + (a_k - μ_{k-1})(a_k - μ_k), z_k = (a_k - μ_k) / sqrt(M_{2,k}/(k-1)). No whole-dataset normalization or future statistics ever contaminate historical feature rows.</w:t>
+        <w:t>All feature scaling factors and running z-scores are computed using an entity-conditioned expanding estimator [20] over the causal historical set ℍ_k(𝔰_k) = {j &lt; k : 𝔰_j = 𝔰_k} with cardinality n_k = |ℍ_k(𝔰_k)| + 1:</w:t>
+      </w:r>
+    </w:p>
+    <w:tbl>
+      <w:tblPr>
+        <w:tblW w:type="auto" w:w="0"/>
+        <w:jc w:val="center"/>
+        <w:tblLook w:firstColumn="1" w:firstRow="1" w:lastColumn="0" w:lastRow="0" w:noHBand="0" w:noVBand="1" w:val="04A0"/>
+      </w:tblPr>
+      <w:tblGrid>
+        <w:gridCol w:w="10080"/>
+      </w:tblGrid>
+      <w:tr>
+        <w:tc>
+          <w:tcPr>
+            <w:tcW w:type="dxa" w:w="9360"/>
+            <w:shd w:fill="F8FAFC"/>
+            <w:tcBorders>
+              <w:top w:val="none"/>
+              <w:left w:val="single" w:sz="18" w:space="0" w:color="2B6CB0"/>
+              <w:bottom w:val="none"/>
+              <w:right w:val="none"/>
+            </w:tcBorders>
+            <w:tcMar>
+              <w:top w:w="80" w:type="dxa"/>
+              <w:left w:w="140" w:type="dxa"/>
+              <w:bottom w:w="80" w:type="dxa"/>
+              <w:right w:w="100" w:type="dxa"/>
+            </w:tcMar>
+          </w:tcPr>
+          <w:p>
+            <w:pPr>
+              <w:spacing w:before="40" w:after="40" w:line="276" w:lineRule="auto"/>
+            </w:pPr>
+            <w:r>
+              <w:rPr>
+                <w:rFonts w:ascii="Consolas" w:hAnsi="Consolas"/>
+                <w:b/>
+                <w:color w:val="1B365D"/>
+                <w:sz w:val="19"/>
+              </w:rPr>
+              <w:t>ν̄_k = ν̄_{k-1} + (ν_k - ν̄_{k-1}) / n_k</w:t>
+            </w:r>
+            <w:r>
+              <w:rPr>
+                <w:rFonts w:ascii="Calibri" w:hAnsi="Calibri"/>
+                <w:i/>
+                <w:color w:val="718096"/>
+                <w:sz w:val="19"/>
+              </w:rPr>
+              <w:t xml:space="preserve">    (3)</w:t>
+            </w:r>
+          </w:p>
+        </w:tc>
+      </w:tr>
+    </w:tbl>
+    <w:p>
+      <w:pPr>
+        <w:spacing w:after="40"/>
+      </w:pPr>
+    </w:p>
+    <w:tbl>
+      <w:tblPr>
+        <w:tblW w:type="auto" w:w="0"/>
+        <w:jc w:val="center"/>
+        <w:tblLook w:firstColumn="1" w:firstRow="1" w:lastColumn="0" w:lastRow="0" w:noHBand="0" w:noVBand="1" w:val="04A0"/>
+      </w:tblPr>
+      <w:tblGrid>
+        <w:gridCol w:w="10080"/>
+      </w:tblGrid>
+      <w:tr>
+        <w:tc>
+          <w:tcPr>
+            <w:tcW w:type="dxa" w:w="9360"/>
+            <w:shd w:fill="F8FAFC"/>
+            <w:tcBorders>
+              <w:top w:val="none"/>
+              <w:left w:val="single" w:sz="18" w:space="0" w:color="2B6CB0"/>
+              <w:bottom w:val="none"/>
+              <w:right w:val="none"/>
+            </w:tcBorders>
+            <w:tcMar>
+              <w:top w:w="80" w:type="dxa"/>
+              <w:left w:w="140" w:type="dxa"/>
+              <w:bottom w:w="80" w:type="dxa"/>
+              <w:right w:w="100" w:type="dxa"/>
+            </w:tcMar>
+          </w:tcPr>
+          <w:p>
+            <w:pPr>
+              <w:spacing w:before="40" w:after="40" w:line="276" w:lineRule="auto"/>
+            </w:pPr>
+            <w:r>
+              <w:rPr>
+                <w:rFonts w:ascii="Consolas" w:hAnsi="Consolas"/>
+                <w:b/>
+                <w:color w:val="1B365D"/>
+                <w:sz w:val="19"/>
+              </w:rPr>
+              <w:t>𝒬_k = 𝒬_{k-1} + (ν_k - ν̄_{k-1})(ν_k - ν̄_k)</w:t>
+            </w:r>
+            <w:r>
+              <w:rPr>
+                <w:rFonts w:ascii="Calibri" w:hAnsi="Calibri"/>
+                <w:i/>
+                <w:color w:val="718096"/>
+                <w:sz w:val="19"/>
+              </w:rPr>
+              <w:t xml:space="preserve">    (4)</w:t>
+            </w:r>
+          </w:p>
+        </w:tc>
+      </w:tr>
+    </w:tbl>
+    <w:p>
+      <w:pPr>
+        <w:spacing w:after="40"/>
+      </w:pPr>
+    </w:p>
+    <w:tbl>
+      <w:tblPr>
+        <w:tblW w:type="auto" w:w="0"/>
+        <w:jc w:val="center"/>
+        <w:tblLook w:firstColumn="1" w:firstRow="1" w:lastColumn="0" w:lastRow="0" w:noHBand="0" w:noVBand="1" w:val="04A0"/>
+      </w:tblPr>
+      <w:tblGrid>
+        <w:gridCol w:w="10080"/>
+      </w:tblGrid>
+      <w:tr>
+        <w:tc>
+          <w:tcPr>
+            <w:tcW w:type="dxa" w:w="9360"/>
+            <w:shd w:fill="F8FAFC"/>
+            <w:tcBorders>
+              <w:top w:val="none"/>
+              <w:left w:val="single" w:sz="18" w:space="0" w:color="2B6CB0"/>
+              <w:bottom w:val="none"/>
+              <w:right w:val="none"/>
+            </w:tcBorders>
+            <w:tcMar>
+              <w:top w:w="80" w:type="dxa"/>
+              <w:left w:w="140" w:type="dxa"/>
+              <w:bottom w:w="80" w:type="dxa"/>
+              <w:right w:w="100" w:type="dxa"/>
+            </w:tcMar>
+          </w:tcPr>
+          <w:p>
+            <w:pPr>
+              <w:spacing w:before="40" w:after="40" w:line="276" w:lineRule="auto"/>
+            </w:pPr>
+            <w:r>
+              <w:rPr>
+                <w:rFonts w:ascii="Consolas" w:hAnsi="Consolas"/>
+                <w:b/>
+                <w:color w:val="1B365D"/>
+                <w:sz w:val="19"/>
+              </w:rPr>
+              <w:t>ζ_k = (ν_k - ν̄_k) / sqrt(𝒬_k / max(1, n_k - 1) + ε_reg)</w:t>
+            </w:r>
+            <w:r>
+              <w:rPr>
+                <w:rFonts w:ascii="Calibri" w:hAnsi="Calibri"/>
+                <w:i/>
+                <w:color w:val="718096"/>
+                <w:sz w:val="19"/>
+              </w:rPr>
+              <w:t xml:space="preserve">    (5)</w:t>
+            </w:r>
+          </w:p>
+        </w:tc>
+      </w:tr>
+    </w:tbl>
+    <w:p>
+      <w:pPr>
+        <w:spacing w:after="40"/>
+      </w:pPr>
+    </w:p>
+    <w:p>
+      <w:pPr>
+        <w:spacing w:after="80" w:line="276" w:lineRule="auto"/>
+        <w:jc w:val="both"/>
+      </w:pPr>
+      <w:r>
+        <w:rPr>
+          <w:rFonts w:ascii="Calibri" w:hAnsi="Calibri"/>
+          <w:i w:val="0"/>
+          <w:color w:val="2D3748"/>
+          <w:sz w:val="20"/>
+        </w:rPr>
+        <w:t>where ζ_k is the running historical z-score and ε_reg = 10^-6 guarantees numerical stability under zero-variance initialization. No whole-dataset normalization or future statistics ever contaminate historical feature rows.</w:t>
       </w:r>
     </w:p>
     <w:p>
@@ -646,7 +996,80 @@
           <w:color w:val="2D3748"/>
           <w:sz w:val="20"/>
         </w:rPr>
-        <w:t>Each transaction e_i is mapped to a combined feature vector x_i = [x_ord, x_topo, z_tgn] across three distinct taxonomic families:</w:t>
+        <w:t>Each transaction ξ_k is mapped to a composite feature representation:</w:t>
+      </w:r>
+    </w:p>
+    <w:tbl>
+      <w:tblPr>
+        <w:tblW w:type="auto" w:w="0"/>
+        <w:jc w:val="center"/>
+        <w:tblLook w:firstColumn="1" w:firstRow="1" w:lastColumn="0" w:lastRow="0" w:noHBand="0" w:noVBand="1" w:val="04A0"/>
+      </w:tblPr>
+      <w:tblGrid>
+        <w:gridCol w:w="10080"/>
+      </w:tblGrid>
+      <w:tr>
+        <w:tc>
+          <w:tcPr>
+            <w:tcW w:type="dxa" w:w="9360"/>
+            <w:shd w:fill="F8FAFC"/>
+            <w:tcBorders>
+              <w:top w:val="none"/>
+              <w:left w:val="single" w:sz="18" w:space="0" w:color="2B6CB0"/>
+              <w:bottom w:val="none"/>
+              <w:right w:val="none"/>
+            </w:tcBorders>
+            <w:tcMar>
+              <w:top w:w="80" w:type="dxa"/>
+              <w:left w:w="140" w:type="dxa"/>
+              <w:bottom w:w="80" w:type="dxa"/>
+              <w:right w:w="100" w:type="dxa"/>
+            </w:tcMar>
+          </w:tcPr>
+          <w:p>
+            <w:pPr>
+              <w:spacing w:before="40" w:after="40" w:line="276" w:lineRule="auto"/>
+            </w:pPr>
+            <w:r>
+              <w:rPr>
+                <w:rFonts w:ascii="Consolas" w:hAnsi="Consolas"/>
+                <w:b/>
+                <w:color w:val="1B365D"/>
+                <w:sz w:val="19"/>
+              </w:rPr>
+              <w:t>Φ(ξ_k) = ψ_tab(ξ_k) ⊕ Ω_topo(ξ_k, 𝔊_{&lt; τ_k}^(W)) ⊕ h_dyn(ξ_k, τ_k) ∈ ℝ^D</w:t>
+            </w:r>
+            <w:r>
+              <w:rPr>
+                <w:rFonts w:ascii="Calibri" w:hAnsi="Calibri"/>
+                <w:i/>
+                <w:color w:val="718096"/>
+                <w:sz w:val="19"/>
+              </w:rPr>
+              <w:t xml:space="preserve">    (6)</w:t>
+            </w:r>
+          </w:p>
+        </w:tc>
+      </w:tr>
+    </w:tbl>
+    <w:p>
+      <w:pPr>
+        <w:spacing w:after="40"/>
+      </w:pPr>
+    </w:p>
+    <w:p>
+      <w:pPr>
+        <w:spacing w:after="80" w:line="276" w:lineRule="auto"/>
+        <w:jc w:val="both"/>
+      </w:pPr>
+      <w:r>
+        <w:rPr>
+          <w:rFonts w:ascii="Calibri" w:hAnsi="Calibri"/>
+          <w:i w:val="0"/>
+          <w:color w:val="2D3748"/>
+          <w:sz w:val="20"/>
+        </w:rPr>
+        <w:t>across three distinct taxonomic families:</w:t>
       </w:r>
     </w:p>
     <w:p>
@@ -662,7 +1085,7 @@
           <w:color w:val="2D3748"/>
           <w:sz w:val="20"/>
         </w:rPr>
-        <w:t xml:space="preserve">1. Ordinary Tabular Features (x_ord): </w:t>
+        <w:t xml:space="preserve">1. Ordinary Tabular Features (ψ_tab): </w:t>
       </w:r>
       <w:r>
         <w:rPr>
@@ -670,7 +1093,7 @@
           <w:color w:val="2D3748"/>
           <w:sz w:val="20"/>
         </w:rPr>
-        <w:t>log_10(a_i + 1), running Welford amount z-scores, diurnal periodic encodings (sin(2π h_i / 24), cos(2π h_i / 24)), and inter-event arrival deltas Δt = t_i - t_prev(u_i).</w:t>
+        <w:t>log_10(ν_k + 1), running causal z-scores ζ_k, diurnal periodic encodings (sin(2π ℏ_k / 24), cos(2π ℏ_k / 24)) where ℏ_k is posting hour, and inter-event arrival deltas Δτ_k = τ_k - τ_last(𝔰_k).</w:t>
       </w:r>
     </w:p>
     <w:p>
@@ -686,7 +1109,7 @@
           <w:color w:val="2D3748"/>
           <w:sz w:val="20"/>
         </w:rPr>
-        <w:t xml:space="preserve">2. Handcrafted Streaming Topology (x_topo): </w:t>
+        <w:t xml:space="preserve">2. Handcrafted Streaming Topology (Ω_topo): </w:t>
       </w:r>
       <w:r>
         <w:rPr>
@@ -710,7 +1133,7 @@
           <w:color w:val="2D3748"/>
           <w:sz w:val="20"/>
         </w:rPr>
-        <w:t xml:space="preserve">3. Continuous Dynamic Graph Embeddings (z_tgn): </w:t>
+        <w:t xml:space="preserve">3. Continuous Dynamic Graph Embeddings (h_dyn): </w:t>
       </w:r>
       <w:r>
         <w:rPr>
@@ -718,7 +1141,7 @@
           <w:color w:val="2D3748"/>
           <w:sz w:val="20"/>
         </w:rPr>
-        <w:t>16-dimensional continuous-time latent representations produced by a Temporal Graph Network (TGN), encoding sequential memory states and interaction dynamics between counterparties.</w:t>
+        <w:t>16-dimensional continuous-time latent representations produced by a Temporal Graph Network (TGN) [4], encoding sequential memory states and interaction dynamics between counterparties.</w:t>
       </w:r>
     </w:p>
     <w:p>
@@ -733,8 +1156,431 @@
           <w:color w:val="2D3748"/>
           <w:sz w:val="20"/>
         </w:rPr>
-        <w:t>The Read-Then-Insert Execution Invariant: To guarantee zero lookahead leakage, the engine enforces a strict structural invariant: (1) Read: Query WindowGraph for transaction i's fan-in, fan-out, destination in-degree, source out-degree, and (if src_i ≠ dst_i) run bounded cycle search; query LapMemory for amount recurrence against historical records. (2) Insert: Only after all reads return does the engine call WindowGraph.add(t, u, v, amount) and LapMemory.record(...) for transaction i itself. Because add for edge j is called only during iteration j, the graph state visible to iteration i's reads is, by induction, exactly {j : j &lt; i} minus aged-out edges—never a superset, and never containing information from an iteration that has not yet run.</w:t>
+        <w:t>The Read-Then-Insert Execution Invariant: To guarantee zero lookahead leakage, the engine enforces a strict structural invariant over the trailing causal subgraph:</w:t>
       </w:r>
+    </w:p>
+    <w:tbl>
+      <w:tblPr>
+        <w:tblW w:type="auto" w:w="0"/>
+        <w:jc w:val="center"/>
+        <w:tblLook w:firstColumn="1" w:firstRow="1" w:lastColumn="0" w:lastRow="0" w:noHBand="0" w:noVBand="1" w:val="04A0"/>
+      </w:tblPr>
+      <w:tblGrid>
+        <w:gridCol w:w="10080"/>
+      </w:tblGrid>
+      <w:tr>
+        <w:tc>
+          <w:tcPr>
+            <w:tcW w:type="dxa" w:w="9360"/>
+            <w:shd w:fill="F8FAFC"/>
+            <w:tcBorders>
+              <w:top w:val="none"/>
+              <w:left w:val="single" w:sz="18" w:space="0" w:color="2B6CB0"/>
+              <w:bottom w:val="none"/>
+              <w:right w:val="none"/>
+            </w:tcBorders>
+            <w:tcMar>
+              <w:top w:w="80" w:type="dxa"/>
+              <w:left w:w="140" w:type="dxa"/>
+              <w:bottom w:w="80" w:type="dxa"/>
+              <w:right w:w="100" w:type="dxa"/>
+            </w:tcMar>
+          </w:tcPr>
+          <w:p>
+            <w:pPr>
+              <w:spacing w:before="40" w:after="40" w:line="276" w:lineRule="auto"/>
+            </w:pPr>
+            <w:r>
+              <w:rPr>
+                <w:rFonts w:ascii="Consolas" w:hAnsi="Consolas"/>
+                <w:b/>
+                <w:color w:val="1B365D"/>
+                <w:sz w:val="19"/>
+              </w:rPr>
+              <w:t>𝔊_{&lt; τ_k}^(W) = { ξ_j ∈ 𝒳 : τ_k - W ≤ τ_j &lt; τ_k }</w:t>
+            </w:r>
+            <w:r>
+              <w:rPr>
+                <w:rFonts w:ascii="Calibri" w:hAnsi="Calibri"/>
+                <w:i/>
+                <w:color w:val="718096"/>
+                <w:sz w:val="19"/>
+              </w:rPr>
+              <w:t xml:space="preserve">    (7)</w:t>
+            </w:r>
+          </w:p>
+        </w:tc>
+      </w:tr>
+    </w:tbl>
+    <w:p>
+      <w:pPr>
+        <w:spacing w:after="40"/>
+      </w:pPr>
+    </w:p>
+    <w:tbl>
+      <w:tblPr>
+        <w:tblW w:type="auto" w:w="0"/>
+        <w:jc w:val="center"/>
+        <w:tblLook w:firstColumn="1" w:firstRow="1" w:lastColumn="0" w:lastRow="0" w:noHBand="0" w:noVBand="1" w:val="04A0"/>
+      </w:tblPr>
+      <w:tblGrid>
+        <w:gridCol w:w="10080"/>
+      </w:tblGrid>
+      <w:tr>
+        <w:tc>
+          <w:tcPr>
+            <w:tcW w:type="dxa" w:w="9360"/>
+            <w:shd w:fill="F8FAFC"/>
+            <w:tcBorders>
+              <w:top w:val="none"/>
+              <w:left w:val="single" w:sz="18" w:space="0" w:color="2B6CB0"/>
+              <w:bottom w:val="none"/>
+              <w:right w:val="none"/>
+            </w:tcBorders>
+            <w:tcMar>
+              <w:top w:w="80" w:type="dxa"/>
+              <w:left w:w="140" w:type="dxa"/>
+              <w:bottom w:w="80" w:type="dxa"/>
+              <w:right w:w="100" w:type="dxa"/>
+            </w:tcMar>
+          </w:tcPr>
+          <w:p>
+            <w:pPr>
+              <w:spacing w:before="40" w:after="40" w:line="276" w:lineRule="auto"/>
+            </w:pPr>
+            <w:r>
+              <w:rPr>
+                <w:rFonts w:ascii="Consolas" w:hAnsi="Consolas"/>
+                <w:b/>
+                <w:color w:val="1B365D"/>
+                <w:sz w:val="19"/>
+              </w:rPr>
+              <w:t>∀ ξ_j ∈ 𝔊_{&lt; τ_k}^(W),   τ_j &lt; τ_k  ⟹  ξ_k ∉ 𝔊_{&lt; τ_k}^(W)</w:t>
+            </w:r>
+            <w:r>
+              <w:rPr>
+                <w:rFonts w:ascii="Calibri" w:hAnsi="Calibri"/>
+                <w:i/>
+                <w:color w:val="718096"/>
+                <w:sz w:val="19"/>
+              </w:rPr>
+              <w:t xml:space="preserve">    (8)</w:t>
+            </w:r>
+          </w:p>
+        </w:tc>
+      </w:tr>
+    </w:tbl>
+    <w:p>
+      <w:pPr>
+        <w:spacing w:after="40"/>
+      </w:pPr>
+    </w:p>
+    <w:p>
+      <w:pPr>
+        <w:spacing w:after="80" w:line="276" w:lineRule="auto"/>
+        <w:jc w:val="both"/>
+      </w:pPr>
+      <w:r>
+        <w:rPr>
+          <w:rFonts w:ascii="Calibri" w:hAnsi="Calibri"/>
+          <w:i w:val="0"/>
+          <w:color w:val="2D3748"/>
+          <w:sz w:val="20"/>
+        </w:rPr>
+        <w:t>Operationally: (1) Read: Query WindowGraph for transaction k's fan-in, fan-out, destination in-degree, source out-degree, and (if 𝔰_k ≠ 𝔡_k) run bounded cycle search; query LapMemory for amount recurrence against historical records. (2) Insert: Only after all reads return does the engine call WindowGraph.add(τ_k, 𝔰_k, 𝔡_k, ν_k) and LapMemory.record(...) for transaction k itself.</w:t>
+      </w:r>
+    </w:p>
+    <w:p>
+      <w:pPr>
+        <w:spacing w:after="80" w:line="276" w:lineRule="auto"/>
+        <w:jc w:val="both"/>
+      </w:pPr>
+      <w:r>
+        <w:rPr>
+          <w:rFonts w:ascii="Calibri" w:hAnsi="Calibri"/>
+          <w:i w:val="0"/>
+          <w:color w:val="2D3748"/>
+          <w:sz w:val="20"/>
+        </w:rPr>
+        <w:t>Dynamic Interaction State Formulation: Unlike Rossi et al. [4] who formulate node states using generic s_i(t) and m_i(t), ChronoSentry maintains an entity state η_α(τ) ∈ ℝ^{d_mem}. Upon the arrival of edge ξ_k, the interaction transition message ρ_{𝔰_k}(τ_k) is synthesized via:</w:t>
+      </w:r>
+    </w:p>
+    <w:tbl>
+      <w:tblPr>
+        <w:tblW w:type="auto" w:w="0"/>
+        <w:jc w:val="center"/>
+        <w:tblLook w:firstColumn="1" w:firstRow="1" w:lastColumn="0" w:lastRow="0" w:noHBand="0" w:noVBand="1" w:val="04A0"/>
+      </w:tblPr>
+      <w:tblGrid>
+        <w:gridCol w:w="10080"/>
+      </w:tblGrid>
+      <w:tr>
+        <w:tc>
+          <w:tcPr>
+            <w:tcW w:type="dxa" w:w="9360"/>
+            <w:shd w:fill="F8FAFC"/>
+            <w:tcBorders>
+              <w:top w:val="none"/>
+              <w:left w:val="single" w:sz="18" w:space="0" w:color="2B6CB0"/>
+              <w:bottom w:val="none"/>
+              <w:right w:val="none"/>
+            </w:tcBorders>
+            <w:tcMar>
+              <w:top w:w="80" w:type="dxa"/>
+              <w:left w:w="140" w:type="dxa"/>
+              <w:bottom w:w="80" w:type="dxa"/>
+              <w:right w:w="100" w:type="dxa"/>
+            </w:tcMar>
+          </w:tcPr>
+          <w:p>
+            <w:pPr>
+              <w:spacing w:before="40" w:after="40" w:line="276" w:lineRule="auto"/>
+            </w:pPr>
+            <w:r>
+              <w:rPr>
+                <w:rFonts w:ascii="Consolas" w:hAnsi="Consolas"/>
+                <w:b/>
+                <w:color w:val="1B365D"/>
+                <w:sz w:val="19"/>
+              </w:rPr>
+              <w:t>ρ_{𝔰_k}(τ_k) = ℳ_enc( η_{𝔰_k}(τ_k^-) ∥ η_{𝔡_k}(τ_k^-) ∥ log_10(ν_k + 1) ∥ ϕ_𝕋(Δτ_k) )</w:t>
+            </w:r>
+            <w:r>
+              <w:rPr>
+                <w:rFonts w:ascii="Calibri" w:hAnsi="Calibri"/>
+                <w:i/>
+                <w:color w:val="718096"/>
+                <w:sz w:val="19"/>
+              </w:rPr>
+              <w:t xml:space="preserve">    (9)</w:t>
+            </w:r>
+          </w:p>
+        </w:tc>
+      </w:tr>
+    </w:tbl>
+    <w:p>
+      <w:pPr>
+        <w:spacing w:after="40"/>
+      </w:pPr>
+    </w:p>
+    <w:p>
+      <w:pPr>
+        <w:spacing w:after="80" w:line="276" w:lineRule="auto"/>
+        <w:jc w:val="both"/>
+      </w:pPr>
+      <w:r>
+        <w:rPr>
+          <w:rFonts w:ascii="Calibri" w:hAnsi="Calibri"/>
+          <w:i w:val="0"/>
+          <w:color w:val="2D3748"/>
+          <w:sz w:val="20"/>
+        </w:rPr>
+        <w:t>where ∥ denotes tensor concatenation, τ_k^- denotes the instant immediately preceding τ_k, and ϕ_𝕋(·) is a Bochner cosine-frequency time encoding:</w:t>
+      </w:r>
+    </w:p>
+    <w:tbl>
+      <w:tblPr>
+        <w:tblW w:type="auto" w:w="0"/>
+        <w:jc w:val="center"/>
+        <w:tblLook w:firstColumn="1" w:firstRow="1" w:lastColumn="0" w:lastRow="0" w:noHBand="0" w:noVBand="1" w:val="04A0"/>
+      </w:tblPr>
+      <w:tblGrid>
+        <w:gridCol w:w="10080"/>
+      </w:tblGrid>
+      <w:tr>
+        <w:tc>
+          <w:tcPr>
+            <w:tcW w:type="dxa" w:w="9360"/>
+            <w:shd w:fill="F8FAFC"/>
+            <w:tcBorders>
+              <w:top w:val="none"/>
+              <w:left w:val="single" w:sz="18" w:space="0" w:color="2B6CB0"/>
+              <w:bottom w:val="none"/>
+              <w:right w:val="none"/>
+            </w:tcBorders>
+            <w:tcMar>
+              <w:top w:w="80" w:type="dxa"/>
+              <w:left w:w="140" w:type="dxa"/>
+              <w:bottom w:w="80" w:type="dxa"/>
+              <w:right w:w="100" w:type="dxa"/>
+            </w:tcMar>
+          </w:tcPr>
+          <w:p>
+            <w:pPr>
+              <w:spacing w:before="40" w:after="40" w:line="276" w:lineRule="auto"/>
+            </w:pPr>
+            <w:r>
+              <w:rPr>
+                <w:rFonts w:ascii="Consolas" w:hAnsi="Consolas"/>
+                <w:b/>
+                <w:color w:val="1B365D"/>
+                <w:sz w:val="19"/>
+              </w:rPr>
+              <w:t>ϕ_𝕋(Δτ_k) = [ cos(ω_1 Δτ_k + β_1), ..., cos(ω_K Δτ_k + β_K) ]^T</w:t>
+            </w:r>
+            <w:r>
+              <w:rPr>
+                <w:rFonts w:ascii="Calibri" w:hAnsi="Calibri"/>
+                <w:i/>
+                <w:color w:val="718096"/>
+                <w:sz w:val="19"/>
+              </w:rPr>
+              <w:t xml:space="preserve">    (10)</w:t>
+            </w:r>
+          </w:p>
+        </w:tc>
+      </w:tr>
+    </w:tbl>
+    <w:p>
+      <w:pPr>
+        <w:spacing w:after="40"/>
+      </w:pPr>
+    </w:p>
+    <w:p>
+      <w:pPr>
+        <w:spacing w:after="80" w:line="276" w:lineRule="auto"/>
+        <w:jc w:val="both"/>
+      </w:pPr>
+      <w:r>
+        <w:rPr>
+          <w:rFonts w:ascii="Calibri" w:hAnsi="Calibri"/>
+          <w:i w:val="0"/>
+          <w:color w:val="2D3748"/>
+          <w:sz w:val="20"/>
+        </w:rPr>
+        <w:t>The entity memory is updated via a Gated Recurrent Unit transition:</w:t>
+      </w:r>
+    </w:p>
+    <w:tbl>
+      <w:tblPr>
+        <w:tblW w:type="auto" w:w="0"/>
+        <w:jc w:val="center"/>
+        <w:tblLook w:firstColumn="1" w:firstRow="1" w:lastColumn="0" w:lastRow="0" w:noHBand="0" w:noVBand="1" w:val="04A0"/>
+      </w:tblPr>
+      <w:tblGrid>
+        <w:gridCol w:w="10080"/>
+      </w:tblGrid>
+      <w:tr>
+        <w:tc>
+          <w:tcPr>
+            <w:tcW w:type="dxa" w:w="9360"/>
+            <w:shd w:fill="F8FAFC"/>
+            <w:tcBorders>
+              <w:top w:val="none"/>
+              <w:left w:val="single" w:sz="18" w:space="0" w:color="2B6CB0"/>
+              <w:bottom w:val="none"/>
+              <w:right w:val="none"/>
+            </w:tcBorders>
+            <w:tcMar>
+              <w:top w:w="80" w:type="dxa"/>
+              <w:left w:w="140" w:type="dxa"/>
+              <w:bottom w:w="80" w:type="dxa"/>
+              <w:right w:w="100" w:type="dxa"/>
+            </w:tcMar>
+          </w:tcPr>
+          <w:p>
+            <w:pPr>
+              <w:spacing w:before="40" w:after="40" w:line="276" w:lineRule="auto"/>
+            </w:pPr>
+            <w:r>
+              <w:rPr>
+                <w:rFonts w:ascii="Consolas" w:hAnsi="Consolas"/>
+                <w:b/>
+                <w:color w:val="1B365D"/>
+                <w:sz w:val="19"/>
+              </w:rPr>
+              <w:t>η_{𝔰_k}(τ_k) = GRU( ρ_{𝔰_k}(τ_k), η_{𝔰_k}(τ_k^-) )</w:t>
+            </w:r>
+            <w:r>
+              <w:rPr>
+                <w:rFonts w:ascii="Calibri" w:hAnsi="Calibri"/>
+                <w:i/>
+                <w:color w:val="718096"/>
+                <w:sz w:val="19"/>
+              </w:rPr>
+              <w:t xml:space="preserve">    (11)</w:t>
+            </w:r>
+          </w:p>
+        </w:tc>
+      </w:tr>
+    </w:tbl>
+    <w:p>
+      <w:pPr>
+        <w:spacing w:after="40"/>
+      </w:pPr>
+    </w:p>
+    <w:p>
+      <w:pPr>
+        <w:spacing w:after="80" w:line="276" w:lineRule="auto"/>
+        <w:jc w:val="both"/>
+      </w:pPr>
+      <w:r>
+        <w:rPr>
+          <w:rFonts w:ascii="Calibri" w:hAnsi="Calibri"/>
+          <w:i w:val="0"/>
+          <w:color w:val="2D3748"/>
+          <w:sz w:val="20"/>
+        </w:rPr>
+        <w:t>The pairwise dynamic embedding vector is projected through a parameterized LeakyReLU layer (α = 0.1):</w:t>
+      </w:r>
+    </w:p>
+    <w:tbl>
+      <w:tblPr>
+        <w:tblW w:type="auto" w:w="0"/>
+        <w:jc w:val="center"/>
+        <w:tblLook w:firstColumn="1" w:firstRow="1" w:lastColumn="0" w:lastRow="0" w:noHBand="0" w:noVBand="1" w:val="04A0"/>
+      </w:tblPr>
+      <w:tblGrid>
+        <w:gridCol w:w="10080"/>
+      </w:tblGrid>
+      <w:tr>
+        <w:tc>
+          <w:tcPr>
+            <w:tcW w:type="dxa" w:w="9360"/>
+            <w:shd w:fill="F8FAFC"/>
+            <w:tcBorders>
+              <w:top w:val="none"/>
+              <w:left w:val="single" w:sz="18" w:space="0" w:color="2B6CB0"/>
+              <w:bottom w:val="none"/>
+              <w:right w:val="none"/>
+            </w:tcBorders>
+            <w:tcMar>
+              <w:top w:w="80" w:type="dxa"/>
+              <w:left w:w="140" w:type="dxa"/>
+              <w:bottom w:w="80" w:type="dxa"/>
+              <w:right w:w="100" w:type="dxa"/>
+            </w:tcMar>
+          </w:tcPr>
+          <w:p>
+            <w:pPr>
+              <w:spacing w:before="40" w:after="40" w:line="276" w:lineRule="auto"/>
+            </w:pPr>
+            <w:r>
+              <w:rPr>
+                <w:rFonts w:ascii="Consolas" w:hAnsi="Consolas"/>
+                <w:b/>
+                <w:color w:val="1B365D"/>
+                <w:sz w:val="19"/>
+              </w:rPr>
+              <w:t>h_dyn(ξ_k, τ_k) = max(0.1 · Γ_k, Γ_k),   Γ_k = W_proj [ η_{𝔰_k}(τ_k) ∥ η_{𝔡_k}(τ_k) ] + b_proj</w:t>
+            </w:r>
+            <w:r>
+              <w:rPr>
+                <w:rFonts w:ascii="Calibri" w:hAnsi="Calibri"/>
+                <w:i/>
+                <w:color w:val="718096"/>
+                <w:sz w:val="19"/>
+              </w:rPr>
+              <w:t xml:space="preserve">    (12)</w:t>
+            </w:r>
+          </w:p>
+        </w:tc>
+      </w:tr>
+    </w:tbl>
+    <w:p>
+      <w:pPr>
+        <w:spacing w:after="40"/>
+      </w:pPr>
     </w:p>
     <w:p>
       <w:pPr>
@@ -819,7 +1665,153 @@
           <w:color w:val="2D3748"/>
           <w:sz w:val="20"/>
         </w:rPr>
-        <w:t>The finalized production champion model is formulated as: f*(e_i) = XGBoost([x_ord, x_topo, z_tgn]; L_obj, Θ*), where L_obj is an unweighted, symmetric α-free focal loss: L_focal(p_t) = -(1 - p_t)^γ log(p_t), with focusing parameter γ = 1.0 for BankSim, γ = 2.0 for SAP Würzburg, and train-derived scale-position weighting scale_pos_weight = N_neg / N_pos for IBM AML.</w:t>
+        <w:t>The finalized ChronoSentry champion model is formulated as:</w:t>
+      </w:r>
+    </w:p>
+    <w:tbl>
+      <w:tblPr>
+        <w:tblW w:type="auto" w:w="0"/>
+        <w:jc w:val="center"/>
+        <w:tblLook w:firstColumn="1" w:firstRow="1" w:lastColumn="0" w:lastRow="0" w:noHBand="0" w:noVBand="1" w:val="04A0"/>
+      </w:tblPr>
+      <w:tblGrid>
+        <w:gridCol w:w="10080"/>
+      </w:tblGrid>
+      <w:tr>
+        <w:tc>
+          <w:tcPr>
+            <w:tcW w:type="dxa" w:w="9360"/>
+            <w:shd w:fill="F8FAFC"/>
+            <w:tcBorders>
+              <w:top w:val="none"/>
+              <w:left w:val="single" w:sz="18" w:space="0" w:color="2B6CB0"/>
+              <w:bottom w:val="none"/>
+              <w:right w:val="none"/>
+            </w:tcBorders>
+            <w:tcMar>
+              <w:top w:w="80" w:type="dxa"/>
+              <w:left w:w="140" w:type="dxa"/>
+              <w:bottom w:w="80" w:type="dxa"/>
+              <w:right w:w="100" w:type="dxa"/>
+            </w:tcMar>
+          </w:tcPr>
+          <w:p>
+            <w:pPr>
+              <w:spacing w:before="40" w:after="40" w:line="276" w:lineRule="auto"/>
+            </w:pPr>
+            <w:r>
+              <w:rPr>
+                <w:rFonts w:ascii="Consolas" w:hAnsi="Consolas"/>
+                <w:b/>
+                <w:color w:val="1B365D"/>
+                <w:sz w:val="19"/>
+              </w:rPr>
+              <w:t>f_ChronoSentry(ξ_k) = 𝒯_GBDT( Φ(ξ_k); 𝒥_focal, Θ* )</w:t>
+            </w:r>
+            <w:r>
+              <w:rPr>
+                <w:rFonts w:ascii="Calibri" w:hAnsi="Calibri"/>
+                <w:i/>
+                <w:color w:val="718096"/>
+                <w:sz w:val="19"/>
+              </w:rPr>
+              <w:t xml:space="preserve">    (13)</w:t>
+            </w:r>
+          </w:p>
+        </w:tc>
+      </w:tr>
+    </w:tbl>
+    <w:p>
+      <w:pPr>
+        <w:spacing w:after="40"/>
+      </w:pPr>
+    </w:p>
+    <w:p>
+      <w:pPr>
+        <w:spacing w:after="80" w:line="276" w:lineRule="auto"/>
+        <w:jc w:val="both"/>
+      </w:pPr>
+      <w:r>
+        <w:rPr>
+          <w:rFonts w:ascii="Calibri" w:hAnsi="Calibri"/>
+          <w:i w:val="0"/>
+          <w:color w:val="2D3748"/>
+          <w:sz w:val="20"/>
+        </w:rPr>
+        <w:t>where 𝒯_GBDT denotes an ensemble of gradient-boosted decision trees [19] optimized under an unweighted, symmetric α-free focal loss [17]:</w:t>
+      </w:r>
+    </w:p>
+    <w:tbl>
+      <w:tblPr>
+        <w:tblW w:type="auto" w:w="0"/>
+        <w:jc w:val="center"/>
+        <w:tblLook w:firstColumn="1" w:firstRow="1" w:lastColumn="0" w:lastRow="0" w:noHBand="0" w:noVBand="1" w:val="04A0"/>
+      </w:tblPr>
+      <w:tblGrid>
+        <w:gridCol w:w="10080"/>
+      </w:tblGrid>
+      <w:tr>
+        <w:tc>
+          <w:tcPr>
+            <w:tcW w:type="dxa" w:w="9360"/>
+            <w:shd w:fill="F8FAFC"/>
+            <w:tcBorders>
+              <w:top w:val="none"/>
+              <w:left w:val="single" w:sz="18" w:space="0" w:color="2B6CB0"/>
+              <w:bottom w:val="none"/>
+              <w:right w:val="none"/>
+            </w:tcBorders>
+            <w:tcMar>
+              <w:top w:w="80" w:type="dxa"/>
+              <w:left w:w="140" w:type="dxa"/>
+              <w:bottom w:w="80" w:type="dxa"/>
+              <w:right w:w="100" w:type="dxa"/>
+            </w:tcMar>
+          </w:tcPr>
+          <w:p>
+            <w:pPr>
+              <w:spacing w:before="40" w:after="40" w:line="276" w:lineRule="auto"/>
+            </w:pPr>
+            <w:r>
+              <w:rPr>
+                <w:rFonts w:ascii="Consolas" w:hAnsi="Consolas"/>
+                <w:b/>
+                <w:color w:val="1B365D"/>
+                <w:sz w:val="19"/>
+              </w:rPr>
+              <w:t>𝒥_focal(π̂_k, y_k) = - y_k (1 - π̂_k)^γ ln(π̂_k) - (1 - y_k) π̂_k^γ ln(1 - π̂_k)</w:t>
+            </w:r>
+            <w:r>
+              <w:rPr>
+                <w:rFonts w:ascii="Calibri" w:hAnsi="Calibri"/>
+                <w:i/>
+                <w:color w:val="718096"/>
+                <w:sz w:val="19"/>
+              </w:rPr>
+              <w:t xml:space="preserve">    (14)</w:t>
+            </w:r>
+          </w:p>
+        </w:tc>
+      </w:tr>
+    </w:tbl>
+    <w:p>
+      <w:pPr>
+        <w:spacing w:after="40"/>
+      </w:pPr>
+    </w:p>
+    <w:p>
+      <w:pPr>
+        <w:spacing w:after="80" w:line="276" w:lineRule="auto"/>
+        <w:jc w:val="both"/>
+      </w:pPr>
+      <w:r>
+        <w:rPr>
+          <w:rFonts w:ascii="Calibri" w:hAnsi="Calibri"/>
+          <w:i w:val="0"/>
+          <w:color w:val="2D3748"/>
+          <w:sz w:val="20"/>
+        </w:rPr>
+        <w:t>where π̂_k = σ(θ_k) = (1 + e^-θ_k)^-1 is the sigmoid posterior of predicted log-odds margin θ_k ∈ ℝ, y_k ∈ {0, 1} is the ground-truth forensic label, and γ ∈ ℝ^+ is the focusing factor (γ = 1.0 for BankSim, γ = 2.0 for SAP Würzburg).</w:t>
       </w:r>
     </w:p>
     <w:p>
@@ -834,7 +1826,226 @@
           <w:color w:val="2D3748"/>
           <w:sz w:val="20"/>
         </w:rPr>
-        <w:t>The closed-form gradient with respect to predicted log-odds margin m (where p = σ(m)) is: ∂L/∂m = γ p (1 - p)^γ log(p) - (1 - p)^{γ+1} if y=1, and -[γ (1 - p) p^γ log(1 - p) - p^{γ+1}] if y=0. The hessian is evaluated via a central finite difference with step ε_h = 10^-4. The decision threshold τ_bar is tuned strictly on the validation split: τ_bar = argmax_τ F_1(D_val, τ), and frozen for test evaluation. Test metrics are never evaluated at an uncalibrated default 0.5 threshold.</w:t>
+        <w:t>The closed-form directional first-order gradient g_k = ∂𝒥_focal / ∂θ_k is:</w:t>
+      </w:r>
+    </w:p>
+    <w:tbl>
+      <w:tblPr>
+        <w:tblW w:type="auto" w:w="0"/>
+        <w:jc w:val="center"/>
+        <w:tblLook w:firstColumn="1" w:firstRow="1" w:lastColumn="0" w:lastRow="0" w:noHBand="0" w:noVBand="1" w:val="04A0"/>
+      </w:tblPr>
+      <w:tblGrid>
+        <w:gridCol w:w="10080"/>
+      </w:tblGrid>
+      <w:tr>
+        <w:tc>
+          <w:tcPr>
+            <w:tcW w:type="dxa" w:w="9360"/>
+            <w:shd w:fill="F8FAFC"/>
+            <w:tcBorders>
+              <w:top w:val="none"/>
+              <w:left w:val="single" w:sz="18" w:space="0" w:color="2B6CB0"/>
+              <w:bottom w:val="none"/>
+              <w:right w:val="none"/>
+            </w:tcBorders>
+            <w:tcMar>
+              <w:top w:w="80" w:type="dxa"/>
+              <w:left w:w="140" w:type="dxa"/>
+              <w:bottom w:w="80" w:type="dxa"/>
+              <w:right w:w="100" w:type="dxa"/>
+            </w:tcMar>
+          </w:tcPr>
+          <w:p>
+            <w:pPr>
+              <w:spacing w:before="40" w:after="40" w:line="276" w:lineRule="auto"/>
+            </w:pPr>
+            <w:r>
+              <w:rPr>
+                <w:rFonts w:ascii="Consolas" w:hAnsi="Consolas"/>
+                <w:b/>
+                <w:color w:val="1B365D"/>
+                <w:sz w:val="19"/>
+              </w:rPr>
+              <w:t>g_k = γ π̂_k (1 - π̂_k)^γ ln(π̂_k) - (1 - π̂_k)^{γ+1}   [if y_k=1],   π̂_k^{γ+1} - γ (1 - π̂_k) π̂_k^γ ln(1 - π̂_k)   [if y_k=0]</w:t>
+            </w:r>
+            <w:r>
+              <w:rPr>
+                <w:rFonts w:ascii="Calibri" w:hAnsi="Calibri"/>
+                <w:i/>
+                <w:color w:val="718096"/>
+                <w:sz w:val="19"/>
+              </w:rPr>
+              <w:t xml:space="preserve">    (15)</w:t>
+            </w:r>
+          </w:p>
+        </w:tc>
+      </w:tr>
+    </w:tbl>
+    <w:p>
+      <w:pPr>
+        <w:spacing w:after="40"/>
+      </w:pPr>
+    </w:p>
+    <w:p>
+      <w:pPr>
+        <w:spacing w:after="80" w:line="276" w:lineRule="auto"/>
+        <w:jc w:val="both"/>
+      </w:pPr>
+      <w:r>
+        <w:rPr>
+          <w:rFonts w:ascii="Calibri" w:hAnsi="Calibri"/>
+          <w:i w:val="0"/>
+          <w:color w:val="2D3748"/>
+          <w:sz w:val="20"/>
+        </w:rPr>
+        <w:t>The second-order curvature hessian H_k = ∂²𝒥_focal / ∂θ_k² is evaluated via central difference perturbation with step δε = 10^-4:</w:t>
+      </w:r>
+    </w:p>
+    <w:tbl>
+      <w:tblPr>
+        <w:tblW w:type="auto" w:w="0"/>
+        <w:jc w:val="center"/>
+        <w:tblLook w:firstColumn="1" w:firstRow="1" w:lastColumn="0" w:lastRow="0" w:noHBand="0" w:noVBand="1" w:val="04A0"/>
+      </w:tblPr>
+      <w:tblGrid>
+        <w:gridCol w:w="10080"/>
+      </w:tblGrid>
+      <w:tr>
+        <w:tc>
+          <w:tcPr>
+            <w:tcW w:type="dxa" w:w="9360"/>
+            <w:shd w:fill="F8FAFC"/>
+            <w:tcBorders>
+              <w:top w:val="none"/>
+              <w:left w:val="single" w:sz="18" w:space="0" w:color="2B6CB0"/>
+              <w:bottom w:val="none"/>
+              <w:right w:val="none"/>
+            </w:tcBorders>
+            <w:tcMar>
+              <w:top w:w="80" w:type="dxa"/>
+              <w:left w:w="140" w:type="dxa"/>
+              <w:bottom w:w="80" w:type="dxa"/>
+              <w:right w:w="100" w:type="dxa"/>
+            </w:tcMar>
+          </w:tcPr>
+          <w:p>
+            <w:pPr>
+              <w:spacing w:before="40" w:after="40" w:line="276" w:lineRule="auto"/>
+            </w:pPr>
+            <w:r>
+              <w:rPr>
+                <w:rFonts w:ascii="Consolas" w:hAnsi="Consolas"/>
+                <w:b/>
+                <w:color w:val="1B365D"/>
+                <w:sz w:val="19"/>
+              </w:rPr>
+              <w:t>H_k ≈ [ g_k(θ_k + δε) - g_k(θ_k - δε) ] / (2 δε)</w:t>
+            </w:r>
+            <w:r>
+              <w:rPr>
+                <w:rFonts w:ascii="Calibri" w:hAnsi="Calibri"/>
+                <w:i/>
+                <w:color w:val="718096"/>
+                <w:sz w:val="19"/>
+              </w:rPr>
+              <w:t xml:space="preserve">    (16)</w:t>
+            </w:r>
+          </w:p>
+        </w:tc>
+      </w:tr>
+    </w:tbl>
+    <w:p>
+      <w:pPr>
+        <w:spacing w:after="40"/>
+      </w:pPr>
+    </w:p>
+    <w:p>
+      <w:pPr>
+        <w:spacing w:after="80" w:line="276" w:lineRule="auto"/>
+        <w:jc w:val="both"/>
+      </w:pPr>
+      <w:r>
+        <w:rPr>
+          <w:rFonts w:ascii="Calibri" w:hAnsi="Calibri"/>
+          <w:i w:val="0"/>
+          <w:color w:val="2D3748"/>
+          <w:sz w:val="20"/>
+        </w:rPr>
+        <w:t>The operational decision threshold is tuned strictly on validation set 𝒟_val and frozen:</w:t>
+      </w:r>
+    </w:p>
+    <w:tbl>
+      <w:tblPr>
+        <w:tblW w:type="auto" w:w="0"/>
+        <w:jc w:val="center"/>
+        <w:tblLook w:firstColumn="1" w:firstRow="1" w:lastColumn="0" w:lastRow="0" w:noHBand="0" w:noVBand="1" w:val="04A0"/>
+      </w:tblPr>
+      <w:tblGrid>
+        <w:gridCol w:w="10080"/>
+      </w:tblGrid>
+      <w:tr>
+        <w:tc>
+          <w:tcPr>
+            <w:tcW w:type="dxa" w:w="9360"/>
+            <w:shd w:fill="F8FAFC"/>
+            <w:tcBorders>
+              <w:top w:val="none"/>
+              <w:left w:val="single" w:sz="18" w:space="0" w:color="2B6CB0"/>
+              <w:bottom w:val="none"/>
+              <w:right w:val="none"/>
+            </w:tcBorders>
+            <w:tcMar>
+              <w:top w:w="80" w:type="dxa"/>
+              <w:left w:w="140" w:type="dxa"/>
+              <w:bottom w:w="80" w:type="dxa"/>
+              <w:right w:w="100" w:type="dxa"/>
+            </w:tcMar>
+          </w:tcPr>
+          <w:p>
+            <w:pPr>
+              <w:spacing w:before="40" w:after="40" w:line="276" w:lineRule="auto"/>
+            </w:pPr>
+            <w:r>
+              <w:rPr>
+                <w:rFonts w:ascii="Consolas" w:hAnsi="Consolas"/>
+                <w:b/>
+                <w:color w:val="1B365D"/>
+                <w:sz w:val="19"/>
+              </w:rPr>
+              <w:t>θ_audit* = argmax_θ ℱ_1( 𝒟_val, θ ),   ŷ_k = 𝕀( π̂_k ≥ θ_audit* )</w:t>
+            </w:r>
+            <w:r>
+              <w:rPr>
+                <w:rFonts w:ascii="Calibri" w:hAnsi="Calibri"/>
+                <w:i/>
+                <w:color w:val="718096"/>
+                <w:sz w:val="19"/>
+              </w:rPr>
+              <w:t xml:space="preserve">    (17)</w:t>
+            </w:r>
+          </w:p>
+        </w:tc>
+      </w:tr>
+    </w:tbl>
+    <w:p>
+      <w:pPr>
+        <w:spacing w:after="40"/>
+      </w:pPr>
+    </w:p>
+    <w:p>
+      <w:pPr>
+        <w:spacing w:after="80" w:line="276" w:lineRule="auto"/>
+        <w:jc w:val="both"/>
+      </w:pPr>
+      <w:r>
+        <w:rPr>
+          <w:rFonts w:ascii="Calibri" w:hAnsi="Calibri"/>
+          <w:i w:val="0"/>
+          <w:color w:val="2D3748"/>
+          <w:sz w:val="20"/>
+        </w:rPr>
+        <w:t>and frozen for test evaluation. Test metrics are never evaluated at an uncalibrated default 0.5 threshold.</w:t>
       </w:r>
     </w:p>
     <w:p>
@@ -864,23 +2075,66 @@
           <w:color w:val="2D3748"/>
           <w:sz w:val="20"/>
         </w:rPr>
-        <w:t>To overcome cross-institutional banking secrecy barriers (GDPR, GLBA), we deploy a Score-Level Ensemble Consensus architecture across K=4 heterogeneous institutional clients partitioned via k-means clustering on transaction volume. Rather than naive uniform averaging (FedAvg), which allows fraud-starved institutions to dilute the consensus, our server implements empirical validation reliability weighting (FedProx):</w:t>
+        <w:t>To overcome cross-institutional banking secrecy barriers (GDPR, GLBA), we deploy a Score-Level Ensemble Consensus architecture across C=4 heterogeneous institutional clients partitioned via k-means clustering on transaction volume. Rather than naive uniform averaging (FedAvg) [14], which allows fraud-starved institutions to dilute the consensus, our server implements empirical validation reliability weighting (FedProx) [15]. Across C decentralized clients c ∈ {1, ..., C} with private validation precision-recall area 𝒫_val^(c) = PR-AUC(𝒟_val^(c)), the central aggregator computes institutional reliability coefficients:</w:t>
       </w:r>
     </w:p>
+    <w:tbl>
+      <w:tblPr>
+        <w:tblW w:type="auto" w:w="0"/>
+        <w:jc w:val="center"/>
+        <w:tblLook w:firstColumn="1" w:firstRow="1" w:lastColumn="0" w:lastRow="0" w:noHBand="0" w:noVBand="1" w:val="04A0"/>
+      </w:tblPr>
+      <w:tblGrid>
+        <w:gridCol w:w="10080"/>
+      </w:tblGrid>
+      <w:tr>
+        <w:tc>
+          <w:tcPr>
+            <w:tcW w:type="dxa" w:w="9360"/>
+            <w:shd w:fill="F8FAFC"/>
+            <w:tcBorders>
+              <w:top w:val="none"/>
+              <w:left w:val="single" w:sz="18" w:space="0" w:color="2B6CB0"/>
+              <w:bottom w:val="none"/>
+              <w:right w:val="none"/>
+            </w:tcBorders>
+            <w:tcMar>
+              <w:top w:w="80" w:type="dxa"/>
+              <w:left w:w="140" w:type="dxa"/>
+              <w:bottom w:w="80" w:type="dxa"/>
+              <w:right w:w="100" w:type="dxa"/>
+            </w:tcMar>
+          </w:tcPr>
+          <w:p>
+            <w:pPr>
+              <w:spacing w:before="40" w:after="40" w:line="276" w:lineRule="auto"/>
+            </w:pPr>
+            <w:r>
+              <w:rPr>
+                <w:rFonts w:ascii="Consolas" w:hAnsi="Consolas"/>
+                <w:b/>
+                <w:color w:val="1B365D"/>
+                <w:sz w:val="19"/>
+              </w:rPr>
+              <w:t>ϖ_c = (𝒫_val^(c))^κ / ∑_{m=1}^C (𝒫_val^(m))^κ</w:t>
+            </w:r>
+            <w:r>
+              <w:rPr>
+                <w:rFonts w:ascii="Calibri" w:hAnsi="Calibri"/>
+                <w:i/>
+                <w:color w:val="718096"/>
+                <w:sz w:val="19"/>
+              </w:rPr>
+              <w:t xml:space="preserve">    (18)</w:t>
+            </w:r>
+          </w:p>
+        </w:tc>
+      </w:tr>
+    </w:tbl>
     <w:p>
       <w:pPr>
-        <w:spacing w:after="80" w:line="276" w:lineRule="auto"/>
-        <w:jc w:val="both"/>
+        <w:spacing w:after="40"/>
       </w:pPr>
-      <w:r>
-        <w:rPr>
-          <w:rFonts w:ascii="Calibri" w:hAnsi="Calibri"/>
-          <w:i/>
-          <w:color w:val="2D3748"/>
-          <w:sz w:val="20"/>
-        </w:rPr>
-        <w:t>w_k = (PR-AUC_{val, k})^β / ∑_{j=1}^K (PR-AUC_{val, j})^β,       p_hat_{consensus}(e_i) = ∑_{k=1}^K w_k · f_k(e_i)</w:t>
-      </w:r>
     </w:p>
     <w:p>
       <w:pPr>
@@ -894,7 +2148,80 @@
           <w:color w:val="2D3748"/>
           <w:sz w:val="20"/>
         </w:rPr>
-        <w:t>where β ≥ 1.0 is the reliability concentration power. Each client trains autonomously on its private transaction partition, early-stops on local validation data, and communicates only prediction scores and validation confidence metrics to the central aggregator.</w:t>
+        <w:t>where κ ≥ 1.0 is the empirical confidence sharpening exponent. The global federated consensus prediction is:</w:t>
+      </w:r>
+    </w:p>
+    <w:tbl>
+      <w:tblPr>
+        <w:tblW w:type="auto" w:w="0"/>
+        <w:jc w:val="center"/>
+        <w:tblLook w:firstColumn="1" w:firstRow="1" w:lastColumn="0" w:lastRow="0" w:noHBand="0" w:noVBand="1" w:val="04A0"/>
+      </w:tblPr>
+      <w:tblGrid>
+        <w:gridCol w:w="10080"/>
+      </w:tblGrid>
+      <w:tr>
+        <w:tc>
+          <w:tcPr>
+            <w:tcW w:type="dxa" w:w="9360"/>
+            <w:shd w:fill="F8FAFC"/>
+            <w:tcBorders>
+              <w:top w:val="none"/>
+              <w:left w:val="single" w:sz="18" w:space="0" w:color="2B6CB0"/>
+              <w:bottom w:val="none"/>
+              <w:right w:val="none"/>
+            </w:tcBorders>
+            <w:tcMar>
+              <w:top w:w="80" w:type="dxa"/>
+              <w:left w:w="140" w:type="dxa"/>
+              <w:bottom w:w="80" w:type="dxa"/>
+              <w:right w:w="100" w:type="dxa"/>
+            </w:tcMar>
+          </w:tcPr>
+          <w:p>
+            <w:pPr>
+              <w:spacing w:before="40" w:after="40" w:line="276" w:lineRule="auto"/>
+            </w:pPr>
+            <w:r>
+              <w:rPr>
+                <w:rFonts w:ascii="Consolas" w:hAnsi="Consolas"/>
+                <w:b/>
+                <w:color w:val="1B365D"/>
+                <w:sz w:val="19"/>
+              </w:rPr>
+              <w:t>Π̂_consensus(ξ_k) = ∑_{c=1}^C ϖ_c · ℳ^(c)( Φ(ξ_k) )</w:t>
+            </w:r>
+            <w:r>
+              <w:rPr>
+                <w:rFonts w:ascii="Calibri" w:hAnsi="Calibri"/>
+                <w:i/>
+                <w:color w:val="718096"/>
+                <w:sz w:val="19"/>
+              </w:rPr>
+              <w:t xml:space="preserve">    (19)</w:t>
+            </w:r>
+          </w:p>
+        </w:tc>
+      </w:tr>
+    </w:tbl>
+    <w:p>
+      <w:pPr>
+        <w:spacing w:after="40"/>
+      </w:pPr>
+    </w:p>
+    <w:p>
+      <w:pPr>
+        <w:spacing w:after="80" w:line="276" w:lineRule="auto"/>
+        <w:jc w:val="both"/>
+      </w:pPr>
+      <w:r>
+        <w:rPr>
+          <w:rFonts w:ascii="Calibri" w:hAnsi="Calibri"/>
+          <w:i w:val="0"/>
+          <w:color w:val="2D3748"/>
+          <w:sz w:val="20"/>
+        </w:rPr>
+        <w:t>Each client trains autonomously on its private transaction partition, early-stops on local validation data, and communicates only prediction scores and validation confidence metrics to the central aggregator.</w:t>
       </w:r>
     </w:p>
     <w:p>
@@ -924,7 +2251,80 @@
           <w:color w:val="2D3748"/>
           <w:sz w:val="20"/>
         </w:rPr>
-        <w:t>Regulatory compliance (Sarbanes-Oxley Act, Basel III) requires verifiable evidence trails. Every reported feature attribution is computed via XGBoost's native pred_contribs interface: ∑_{j=1}^M φ_j(x_i) + φ_0 = f_margin(x_i) ≡ log(p_i / (1 - p_i)). This executes the exact TreeSHAP recursion as a pure traversal of the fitted tree ensemble, returning signed attributions additive in log-odds space. It is exact (not sampled) and valid under focal gradients.</w:t>
+        <w:t xml:space="preserve">Regulatory compliance (Sarbanes-Oxley Act, Basel III) requires verifiable evidence trails [9, 10]. Every reported feature attribution is computed via TreeSHAP [18] in unconstrained log-odds margin space θ_k = ln(π̂_k / (1 - π̂_k)): </w:t>
+      </w:r>
+    </w:p>
+    <w:tbl>
+      <w:tblPr>
+        <w:tblW w:type="auto" w:w="0"/>
+        <w:jc w:val="center"/>
+        <w:tblLook w:firstColumn="1" w:firstRow="1" w:lastColumn="0" w:lastRow="0" w:noHBand="0" w:noVBand="1" w:val="04A0"/>
+      </w:tblPr>
+      <w:tblGrid>
+        <w:gridCol w:w="10080"/>
+      </w:tblGrid>
+      <w:tr>
+        <w:tc>
+          <w:tcPr>
+            <w:tcW w:type="dxa" w:w="9360"/>
+            <w:shd w:fill="F8FAFC"/>
+            <w:tcBorders>
+              <w:top w:val="none"/>
+              <w:left w:val="single" w:sz="18" w:space="0" w:color="2B6CB0"/>
+              <w:bottom w:val="none"/>
+              <w:right w:val="none"/>
+            </w:tcBorders>
+            <w:tcMar>
+              <w:top w:w="80" w:type="dxa"/>
+              <w:left w:w="140" w:type="dxa"/>
+              <w:bottom w:w="80" w:type="dxa"/>
+              <w:right w:w="100" w:type="dxa"/>
+            </w:tcMar>
+          </w:tcPr>
+          <w:p>
+            <w:pPr>
+              <w:spacing w:before="40" w:after="40" w:line="276" w:lineRule="auto"/>
+            </w:pPr>
+            <w:r>
+              <w:rPr>
+                <w:rFonts w:ascii="Consolas" w:hAnsi="Consolas"/>
+                <w:b/>
+                <w:color w:val="1B365D"/>
+                <w:sz w:val="19"/>
+              </w:rPr>
+              <w:t>θ_k = Λ_0 + ∑_{d=1}^D Λ_d( Φ(ξ_k) )</w:t>
+            </w:r>
+            <w:r>
+              <w:rPr>
+                <w:rFonts w:ascii="Calibri" w:hAnsi="Calibri"/>
+                <w:i/>
+                <w:color w:val="718096"/>
+                <w:sz w:val="19"/>
+              </w:rPr>
+              <w:t xml:space="preserve">    (20)</w:t>
+            </w:r>
+          </w:p>
+        </w:tc>
+      </w:tr>
+    </w:tbl>
+    <w:p>
+      <w:pPr>
+        <w:spacing w:after="40"/>
+      </w:pPr>
+    </w:p>
+    <w:p>
+      <w:pPr>
+        <w:spacing w:after="80" w:line="276" w:lineRule="auto"/>
+        <w:jc w:val="both"/>
+      </w:pPr>
+      <w:r>
+        <w:rPr>
+          <w:rFonts w:ascii="Calibri" w:hAnsi="Calibri"/>
+          <w:i w:val="0"/>
+          <w:color w:val="2D3748"/>
+          <w:sz w:val="20"/>
+        </w:rPr>
+        <w:t>where Λ_0 = 𝔼_Φ[θ] represents the base ledger log-odds prior, and Λ_d ∈ ℝ represents the exact, sign-consistent marginal attribution of the d-th feature. This executes the exact TreeSHAP recursion as a pure traversal of the fitted tree ensemble, returning signed attributions additive in log-odds space. It is exact (not sampled) and valid under focal gradients.</w:t>
       </w:r>
     </w:p>
     <w:p>
@@ -939,7 +2339,7 @@
           <w:color w:val="2D3748"/>
           <w:sz w:val="20"/>
         </w:rPr>
-        <w:t>When an anomaly score exceeds τ_bar, the continuous auditing console synthesizes a two-layer forensic alert packet: (1) Layer 1 (Model Attribution): Top 3 signed driving features in log-odds space (e.g., +0.43 log_amount, +0.29 dest_in_degree); and (2) Layer 2 (Reconstructed Graph Evidence): A deterministic Cypher query executing against Neo4j that extracts the historical subgraph surrounding the flagged transaction, confirming counterparty identities and payment paths for forensic review.</w:t>
+        <w:t>When an anomaly score exceeds θ_audit*, the continuous auditing console synthesizes a two-layer forensic alert packet: (1) Layer 1 (Model Attribution): Top 3 signed driving features in log-odds space (e.g., +0.43 log_amount, +0.29 dest_in_degree); and (2) Layer 2 (Reconstructed Graph Evidence): A deterministic Cypher query executing against Neo4j that extracts the historical subgraph surrounding the flagged transaction, confirming counterparty identities and payment paths for forensic review.</w:t>
       </w:r>
     </w:p>
     <w:p>
@@ -984,7 +2384,7 @@
           <w:color w:val="2D3748"/>
           <w:sz w:val="20"/>
         </w:rPr>
-        <w:t>We evaluate our framework across three diverse, benchmark financial transaction datasets: Dataset 1 (BankSim) represents a synthetic bipartite consumer-to-merchant payment simulation containing 594,643 transactions across 4,166 unique accounts (4,116 customers, 50 merchants) with a 1.21% fraud rate. Dataset 2 (IBM AML) models a directed multi-hop transaction network generated from financial anti-money laundering typologies containing 5,076,142 transactions across 412,416 accounts, featuring complex smurfing and layering chains (0.12% fraud rate in the test split). Dataset 3 (SAP Würzburg) represents a real-world enterprise general ledger export containing 200,687 double-entry accounting records across 1,422 balance sheet and P&amp;L accounts, reflecting legitimate clearing hub structures (0.012% fraud rate).</w:t>
+        <w:t>We evaluate ChronoSentry across three diverse, benchmark financial transaction datasets: Dataset 1 (BankSim) represents a synthetic bipartite consumer-to-merchant payment simulation containing 594,643 transactions across 4,166 unique accounts (4,116 customers, 50 merchants) [11] with a 1.21% fraud rate. Dataset 2 (IBM AML) models a directed multi-hop transaction network generated from financial anti-money laundering typologies containing 5,076,142 transactions across 412,416 accounts, featuring complex smurfing and layering chains [12] (0.12% fraud rate in the test split). Dataset 3 (SAP Würzburg) represents a real-world enterprise general ledger export containing 200,687 double-entry accounting records across 1,422 balance sheet and P&amp;L accounts, reflecting legitimate clearing hub structures [13] (0.012% fraud rate).</w:t>
       </w:r>
     </w:p>
     <w:p>
@@ -1317,7 +2717,7 @@
                 <w:color w:val="2D3748"/>
                 <w:sz w:val="17"/>
               </w:rPr>
-              <w:t>Unique Entities |V|</w:t>
+              <w:t>Unique Entities |𝒜|</w:t>
             </w:r>
           </w:p>
         </w:tc>
@@ -2115,7 +3515,7 @@
                 <w:color w:val="2D3748"/>
                 <w:sz w:val="17"/>
               </w:rPr>
-              <w:t>Train Transactions (t &lt; T1)</w:t>
+              <w:t>Train Transactions (τ &lt; T1)</w:t>
             </w:r>
           </w:p>
         </w:tc>
@@ -2248,7 +3648,7 @@
                 <w:color w:val="2D3748"/>
                 <w:sz w:val="17"/>
               </w:rPr>
-              <w:t>Val Transactions (T1 ≤ t &lt; T2)</w:t>
+              <w:t>Val Transactions (T1 ≤ τ &lt; T2)</w:t>
             </w:r>
           </w:p>
         </w:tc>
@@ -2381,7 +3781,7 @@
                 <w:color w:val="2D3748"/>
                 <w:sz w:val="17"/>
               </w:rPr>
-              <w:t>Test Transactions (t ≥ T2)</w:t>
+              <w:t>Test Transactions (τ ≥ T2)</w:t>
             </w:r>
           </w:p>
         </w:tc>
@@ -2515,7 +3915,7 @@
           <w:color w:val="2D3748"/>
           <w:sz w:val="20"/>
         </w:rPr>
-        <w:t>We benchmark our proposed champion against standard traditional machine learning classifiers across all three datasets separately: Logistic Regression (LR), Decision Trees (DT), Random Forests (RF), Support Vector Machines (SVM), and Standard Tabular XGBoost without graph features.</w:t>
+        <w:t>We benchmark ChronoSentry against standard traditional machine learning classifiers across all three datasets separately: Logistic Regression (LR), Decision Trees (DT), Random Forests (RF), Support Vector Machines (SVM), and Standard Tabular XGBoost without graph features.</w:t>
       </w:r>
     </w:p>
     <w:p>
@@ -3963,7 +5363,7 @@
                 <w:color w:val="1B365D"/>
                 <w:sz w:val="17"/>
               </w:rPr>
-              <w:t>Proposed Champion</w:t>
+              <w:t>ChronoSentry (Proposed)</w:t>
             </w:r>
           </w:p>
         </w:tc>
@@ -5617,7 +7017,7 @@
                 <w:color w:val="1B365D"/>
                 <w:sz w:val="17"/>
               </w:rPr>
-              <w:t>Proposed Champion</w:t>
+              <w:t>ChronoSentry (Proposed)</w:t>
             </w:r>
           </w:p>
         </w:tc>
@@ -7271,7 +8671,7 @@
                 <w:color w:val="1B365D"/>
                 <w:sz w:val="17"/>
               </w:rPr>
-              <w:t>Proposed Champion</w:t>
+              <w:t>ChronoSentry (Proposed)</w:t>
             </w:r>
           </w:p>
         </w:tc>
@@ -7492,7 +8892,7 @@
           <w:color w:val="2D3748"/>
           <w:sz w:val="20"/>
         </w:rPr>
-        <w:t>Discussion: Across all three datasets, our Proposed Champion consistently outperforms classical linear and tree models. On Dataset 1 (BankSim), the proposed model improves PR-AUC from 0.7870 (tabular XGBoost) and 0.7420 (Random Forest) to 0.9364, a +18.9% absolute gain. On Dataset 2 (IBM AML), amount-derived recurrence enables perfect 1.0000 PR-AUC and 100% precision. On Dataset 3 (SAP Würzburg), extreme class imbalance (0.012% fraud) causes linear and tree baselines to collapse. While all models boast &gt;0.99 ROC-AUC, only the proposed model achieves operational utility with Precision@100 = 0.1033 (vs. 0.0733 for baseline XGBoost and 0.0000 for Random Forest), demonstrating the critical ROC-AUC fallacy in rare-event financial forensics.</w:t>
+        <w:t>Discussion: Across all three datasets, ChronoSentry consistently outperforms classical linear and tree models. On Dataset 1 (BankSim), ChronoSentry improves PR-AUC from 0.7870 (tabular XGBoost) and 0.7420 (Random Forest) to 0.9364, a +18.9% absolute gain. On Dataset 2 (IBM AML), amount-derived recurrence enables perfect 1.0000 PR-AUC and 100% precision. On Dataset 3 (SAP Würzburg), extreme class imbalance (0.012% fraud) causes linear and tree baselines to collapse. While all models boast &gt;0.99 ROC-AUC, only ChronoSentry achieves operational utility with Precision@100 = 0.1033 (vs. 0.0733 for baseline XGBoost and 0.0000 for Random Forest), demonstrating the critical ROC-AUC fallacy in rare-event financial forensics.</w:t>
       </w:r>
     </w:p>
     <w:p>
@@ -7548,7 +8948,7 @@
           <w:color w:val="2D3748"/>
           <w:sz w:val="17"/>
         </w:rPr>
-        <w:t>Fig. 3: Precision-Recall curves evaluated on BankSim across model progression arms: Baseline tabular, + Handcrafted Topology, + TGN Dynamic Embeddings, and the Proposed Champion. The shaded band highlights the operational Precision@100 auditing envelope (100% precision at top 100 alerts).</w:t>
+        <w:t>Fig. 3: Precision-Recall curves evaluated on BankSim across model progression arms: Baseline tabular, + Handcrafted Topology, + TGN Dynamic Embeddings, and the ChronoSentry Champion. The shaded band highlights the operational Precision@100 auditing envelope (100% precision at top 100 alerts).</w:t>
       </w:r>
     </w:p>
     <w:p>
@@ -7793,7 +9193,7 @@
                 <w:color w:val="2D3748"/>
                 <w:sz w:val="17"/>
               </w:rPr>
-              <w:t>1. Baseline Tabular (x_ord)</w:t>
+              <w:t>1. Baseline Tabular (ψ_tab)</w:t>
             </w:r>
           </w:p>
         </w:tc>
@@ -8059,7 +9459,7 @@
                 <w:color w:val="2D3748"/>
                 <w:sz w:val="17"/>
               </w:rPr>
-              <w:t>3. Handcrafted Topology Only (x_topo)</w:t>
+              <w:t>3. Handcrafted Topology Only (Ω_topo)</w:t>
             </w:r>
           </w:p>
         </w:tc>
@@ -8192,7 +9592,7 @@
                 <w:color w:val="2D3748"/>
                 <w:sz w:val="17"/>
               </w:rPr>
-              <w:t>4. TGN Dynamic Embeddings Only (z_tgn)</w:t>
+              <w:t>4. TGN Dynamic Embeddings Only (h_dyn)</w:t>
             </w:r>
           </w:p>
         </w:tc>
@@ -8592,7 +9992,7 @@
                 <w:color w:val="1B365D"/>
                 <w:sz w:val="17"/>
               </w:rPr>
-              <w:t>7. Full Feature Fusion (Proposed Champion)</w:t>
+              <w:t>7. ChronoSentry Full Fusion (Proposed)</w:t>
             </w:r>
           </w:p>
         </w:tc>
@@ -8919,7 +10319,7 @@
           <w:color w:val="2D3748"/>
           <w:sz w:val="20"/>
         </w:rPr>
-        <w:t>Handcrafted streaming topology consistently outperforms learned continuous TGN embeddings on real financial data (0.9319 vs. 0.9196 on BankSim). However, fusing both within our champion ensemble captures complementary temporal dynamics, achieving peak overall PR-AUC (0.9364).</w:t>
+        <w:t>Handcrafted streaming topology consistently outperforms learned continuous TGN embeddings on real financial data (0.9319 vs. 0.9196 on BankSim). However, fusing both within ChronoSentry captures complementary temporal dynamics, achieving peak overall PR-AUC (0.9364).</w:t>
       </w:r>
     </w:p>
     <w:p>
@@ -10316,7 +11716,7 @@
           <w:color w:val="2D3748"/>
           <w:sz w:val="20"/>
         </w:rPr>
-        <w:t>Fig. 5(a) and (b) depict local training dynamics across the K=4 institutional banking clients. Client 0 (Retail Core, 87.5% volume, 0.38% fraud) converges rapidly with minimal training loss, but exhibits severe blind spots against complex smurfing. Client 1 (High-Risk Gateway, 18.7% fraud) experiences higher loss volatility but learns sharp discriminatory boundaries for smurfing and layering. In isolated silos, Client 1 achieves 0.8338 PR-AUC locally but plummets to 0.7479 PR-AUC (an 8.6% blind-spot penalty) when evaluated against the global transaction stream.</w:t>
+        <w:t>Fig. 5(a) and (b) depict local training dynamics across the C=4 institutional banking clients. Client 0 (Retail Core, 87.5% volume, 0.38% fraud) converges rapidly with minimal training loss, but exhibits severe blind spots against complex smurfing. Client 1 (High-Risk Gateway, 18.7% fraud) experiences higher loss volatility but learns sharp discriminatory boundaries for smurfing and layering. In isolated silos, Client 1 achieves 0.8338 PR-AUC locally but plummets to 0.7479 PR-AUC (an 8.6% blind-spot penalty) when evaluated against the global transaction stream.</w:t>
       </w:r>
     </w:p>
     <w:p>
@@ -10376,7 +11776,7 @@
           <w:color w:val="2D3748"/>
           <w:sz w:val="20"/>
         </w:rPr>
-        <w:t>We benchmark our proposed FedProx validation reliability weighting against standard federated optimization algorithms across all three datasets (Table 7 and Fig. 6).</w:t>
+        <w:t>We benchmark ChronoSentry's FedProx validation reliability weighting against standard federated optimization algorithms across all three datasets (Table 7 and Fig. 6).</w:t>
       </w:r>
     </w:p>
     <w:p>
@@ -11136,7 +12536,7 @@
                 <w:color w:val="2D3748"/>
                 <w:sz w:val="17"/>
               </w:rPr>
-              <w:t>FedAvg (Uniform Consensus)</w:t>
+              <w:t>FedAvg (Uniform Consensus) [14]</w:t>
             </w:r>
           </w:p>
         </w:tc>
@@ -11365,7 +12765,7 @@
                 <w:color w:val="2D3748"/>
                 <w:sz w:val="17"/>
               </w:rPr>
-              <w:t>Size-Weighted FedAvg</w:t>
+              <w:t>Size-Weighted FedAvg [14]</w:t>
             </w:r>
           </w:p>
         </w:tc>
@@ -11594,7 +12994,7 @@
                 <w:color w:val="2D3748"/>
                 <w:sz w:val="17"/>
               </w:rPr>
-              <w:t>SCAFFOLD (Variance Reduction)</w:t>
+              <w:t>SCAFFOLD (Variance Reduction) [16]</w:t>
             </w:r>
           </w:p>
         </w:tc>
@@ -11824,7 +13224,7 @@
                 <w:color w:val="1B365D"/>
                 <w:sz w:val="17"/>
               </w:rPr>
-              <w:t>FedProx (Proposed Reliability)</w:t>
+              <w:t>ChronoSentry FedProx (Proposed)</w:t>
             </w:r>
           </w:p>
         </w:tc>
@@ -12315,7 +13715,7 @@
           <w:color w:val="2D3748"/>
           <w:sz w:val="17"/>
         </w:rPr>
-        <w:t>Fig. 6: Federated fraud detection performance under non-IID skew on BankSim (K=4). (a) Per-client breakdown comparing isolated local slice, isolated on global stream (blind spot drop), and FedProx consensus; (b) Federation client sensitivity across network sizes K ∈ {2, 3, 4, 5}.</w:t>
+        <w:t>Fig. 6: Federated fraud detection performance under non-IID skew on BankSim (C=4). (a) Per-client breakdown comparing isolated local slice, isolated on global stream (blind spot drop), and ChronoSentry consensus; (b) Federation client sensitivity across network sizes C ∈ {2, 3, 4, 5}.</w:t>
       </w:r>
     </w:p>
     <w:p>
@@ -12330,7 +13730,7 @@
           <w:color w:val="2D3748"/>
           <w:sz w:val="20"/>
         </w:rPr>
-        <w:t>Discussion: Under severe non-IID client skew, standard FedAvg allows large, low-fraud institutions (Client 0) to overpower specialized institutions. Size-weighted FedAvg degrades performance further because Client 0 holds 87.5% of total volume. Our proposed FedProx validation reliability weighting dynamically downweights uninformative consensus contributions, recovering 98.91% of centralized performance on BankSim and 99.95% on IBM AML without transferring raw customer records.</w:t>
+        <w:t>Discussion: Under severe non-IID client skew, standard FedAvg allows large, low-fraud institutions (Client 0) to overpower specialized institutions. Size-weighted FedAvg degrades performance further because Client 0 holds 87.5% of total volume. ChronoSentry's validation reliability weighting dynamically downweights uninformative consensus contributions, recovering 98.91% of centralized performance on BankSim and 99.95% on IBM AML without transferring raw customer records.</w:t>
       </w:r>
     </w:p>
     <w:p>
@@ -12375,7 +13775,7 @@
           <w:color w:val="2D3748"/>
           <w:sz w:val="20"/>
         </w:rPr>
-        <w:t>Fig. 7 illustrates the normalized and absolute contingency matrices evaluated on held-out test splits under frozen operational thresholds.</w:t>
+        <w:t>Fig. 7 illustrates the normalized and absolute contingency matrices evaluated on held-out test splits under frozen operational thresholds θ_audit*.</w:t>
       </w:r>
     </w:p>
     <w:p>
@@ -15928,7 +17328,7 @@
           <w:color w:val="2D3748"/>
           <w:sz w:val="20"/>
         </w:rPr>
-        <w:t>To evaluate operational deployability, we integrated the model into a production Procure-to-Pay (P2P) ERP simulation with an interactive forensic audit console (Fig. 9).</w:t>
+        <w:t>To evaluate operational deployability, we integrated ChronoSentry into a continuous Procure-to-Pay (P2P) ERP simulation with an interactive forensic audit console (Fig. 9).</w:t>
       </w:r>
     </w:p>
     <w:p>
@@ -15999,7 +17399,7 @@
           <w:color w:val="2D3748"/>
           <w:sz w:val="20"/>
         </w:rPr>
-        <w:t>Serving Parity and Latency: Benchmark latency tests demonstrate that the streaming topology engine evaluates all 13 temporal features in under 2.45ms per transaction on commodity hardware. Feature calculations computed during live streaming match offline batch computations with 0.0000 mean absolute error (Fig. 10).</w:t>
+        <w:t>Serving Parity and Latency: Benchmark latency tests demonstrate that ChronoSentry's streaming topology engine evaluates all 13 temporal features in under 2.45ms per transaction on commodity hardware. Feature calculations computed during live streaming match offline batch computations with 0.0000 mean absolute error (Fig. 10).</w:t>
       </w:r>
     </w:p>
     <w:p>
@@ -16100,7 +17500,7 @@
           <w:color w:val="2D3748"/>
           <w:sz w:val="20"/>
         </w:rPr>
-        <w:t>This paper presented the Self-Auditing Ledger: a leakage-free temporal graph topology framework for financial fraud detection. Through strict within-dataset ablation across three diverse benchmarks, we demonstrated that graph structure is not a universal panacea: it delivers substantial value on bipartite and multi-hop networks (+11.7% PR-AUC on BankSim, +213% on synthetic ERP), is redundant on amount-saturated AML streams, and degrades performance on enterprise general ledgers (-54.6%) unless paired with tabular account metadata. By enforcing a read-then-insert execution invariant, exact margin-space TreeSHAP explainability, and privacy-preserving FedProx consensus recovering 98.91% of centralized accuracy, our framework bridges the gap between academic graph learning and continuous forensic auditing.</w:t>
+        <w:t>This paper presented ChronoSentry: a leakage-free temporal graph topology framework for financial fraud detection. Through strict within-dataset ablation across three diverse benchmarks, we demonstrated that graph structure is not a universal panacea: it delivers substantial value on bipartite and multi-hop networks (+11.7% PR-AUC on BankSim, +213% on synthetic ERP), is redundant on amount-saturated AML streams, and degrades performance on enterprise general ledgers (-54.6%) unless paired with tabular account metadata. By enforcing a read-then-insert execution invariant, exact margin-space TreeSHAP explainability, and privacy-preserving FedProx consensus recovering 98.91% of centralized accuracy, ChronoSentry bridges the gap between academic graph learning and continuous forensic auditing.</w:t>
       </w:r>
     </w:p>
     <w:p>
@@ -16343,6 +17743,81 @@
         <w:t>[15] T. Li, A. K. Sahu, M. Zahir, M. Sanjabi, A. Talwalkar, and V. Smith, "Federated optimization in heterogeneous networks," in Proc. MLSys, 2020, pp. 429–450.</w:t>
       </w:r>
     </w:p>
+    <w:p>
+      <w:pPr>
+        <w:spacing w:after="40" w:line="276" w:lineRule="auto"/>
+        <w:ind w:left="360"/>
+        <w:jc w:val="both"/>
+      </w:pPr>
+      <w:r>
+        <w:rPr>
+          <w:rFonts w:ascii="Calibri" w:hAnsi="Calibri"/>
+          <w:color w:val="2D3748"/>
+          <w:sz w:val="19"/>
+        </w:rPr>
+        <w:t>[16] S. P. Karimireddy, S. Kale, M. Mohri, S. Reddi, S. Stich, and A. T. Suresh, "SCAFFOLD: Stochastic controlled averaging for federated learning," in Proc. Int. Conf. Mach. Learn. (ICML), 2020, pp. 5132–5143.</w:t>
+      </w:r>
+    </w:p>
+    <w:p>
+      <w:pPr>
+        <w:spacing w:after="40" w:line="276" w:lineRule="auto"/>
+        <w:ind w:left="360"/>
+        <w:jc w:val="both"/>
+      </w:pPr>
+      <w:r>
+        <w:rPr>
+          <w:rFonts w:ascii="Calibri" w:hAnsi="Calibri"/>
+          <w:color w:val="2D3748"/>
+          <w:sz w:val="19"/>
+        </w:rPr>
+        <w:t>[17] T.-Y. Lin, P. Goyal, R. Girshick, K. He, and P. Dollár, "Focal loss for dense object detection," in Proc. IEEE Int. Conf. Comput. Vis. (ICCV), 2017, pp. 2980–2988.</w:t>
+      </w:r>
+    </w:p>
+    <w:p>
+      <w:pPr>
+        <w:spacing w:after="40" w:line="276" w:lineRule="auto"/>
+        <w:ind w:left="360"/>
+        <w:jc w:val="both"/>
+      </w:pPr>
+      <w:r>
+        <w:rPr>
+          <w:rFonts w:ascii="Calibri" w:hAnsi="Calibri"/>
+          <w:color w:val="2D3748"/>
+          <w:sz w:val="19"/>
+        </w:rPr>
+        <w:t>[18] S. M. Lundberg, G. Erion, H. Chen, A. DeGrave, J. M. Prutkin, B. Nair, R. Katz, P. C. Himmelfarb, N. Bansal, and S.-I. Lee, "From local explanations to global understanding with explainable AI for trees," Nature Machine Intelligence, vol. 2, no. 1, pp. 56–67, 2020.</w:t>
+      </w:r>
+    </w:p>
+    <w:p>
+      <w:pPr>
+        <w:spacing w:after="40" w:line="276" w:lineRule="auto"/>
+        <w:ind w:left="360"/>
+        <w:jc w:val="both"/>
+      </w:pPr>
+      <w:r>
+        <w:rPr>
+          <w:rFonts w:ascii="Calibri" w:hAnsi="Calibri"/>
+          <w:color w:val="2D3748"/>
+          <w:sz w:val="19"/>
+        </w:rPr>
+        <w:t>[19] T. Chen and C. Guestrin, "XGBoost: A scalable tree boosting system," in Proc. ACM SIGKDD Int. Conf. Knowl. Discov. Data Min., 2016, pp. 785–794.</w:t>
+      </w:r>
+    </w:p>
+    <w:p>
+      <w:pPr>
+        <w:spacing w:after="40" w:line="276" w:lineRule="auto"/>
+        <w:ind w:left="360"/>
+        <w:jc w:val="both"/>
+      </w:pPr>
+      <w:r>
+        <w:rPr>
+          <w:rFonts w:ascii="Calibri" w:hAnsi="Calibri"/>
+          <w:color w:val="2D3748"/>
+          <w:sz w:val="19"/>
+        </w:rPr>
+        <w:t>[20] B. P. Welford, "Note on a method for calculating corrected sums of squares and products," Technometrics, vol. 4, no. 3, pp. 419–420, 1962.</w:t>
+      </w:r>
+    </w:p>
     <w:sectPr>
       <w:headerReference w:type="default" r:id="rId9"/>
       <w:footerReference w:type="default" r:id="rId10"/>
@@ -16387,7 +17862,7 @@
         <w:color w:val="718096"/>
         <w:sz w:val="17"/>
       </w:rPr>
-      <w:t>The Self-Auditing Ledger: Leakage-Free Temporal Graph Topology for ERP Fraud Detection</w:t>
+      <w:t>ChronoSentry: Leakage-Free Temporal Graph Topology for Streaming ERP Fraud Detection</w:t>
     </w:r>
   </w:p>
 </w:hdr>

</xml_diff>

<commit_message>
docs(paper): update proposed model name to functional TGN-XGBoost and add explicit confusion matrix tables for all 3 datasets
</commit_message>
<xml_diff>
--- a/paper/The_Self_Auditing_Ledger_Paper.docx
+++ b/paper/The_Self_Auditing_Ledger_Paper.docx
@@ -12,9 +12,9 @@
           <w:rFonts w:ascii="Calibri" w:hAnsi="Calibri"/>
           <w:b/>
           <w:color w:val="1B365D"/>
-          <w:sz w:val="34"/>
+          <w:sz w:val="33"/>
         </w:rPr>
-        <w:t>ChronoSentry: Leakage-Free Temporal Graph Topology for Streaming ERP Fraud Detection, with a Production Continuous Audit Console</w:t>
+        <w:t>Leakage-Free Temporal Graph Topology for Streaming ERP Fraud Detection: A Hybrid TGN-XGBoost Model with a Production Continuous Audit Console</w:t>
       </w:r>
     </w:p>
     <w:p>
@@ -69,7 +69,7 @@
           <w:color w:val="2D3748"/>
           <w:sz w:val="19"/>
         </w:rPr>
-        <w:t>Graph-based fraud detection methods are frequently proposed without an explicit audit of temporal leakage, and rarely evaluated with a controlled, same-architecture ablation that isolates the marginal value of graph structure from the tabular signal it is layered on top of. This paper presents ChronoSentry (Chronologically-Hardened Sentry for Streaming Ledger Forensics): an end-to-end framework featuring a leakage-free streaming temporal-topology feature engine that enforces a formal read-then-insert invariant so that a transaction's features can never depend on information from its own future. We subject ChronoSentry to a rigorous within-dataset ablation across three heterogeneous financial datasets (Dataset 1: BankSim bipartite payment simulator, Dataset 2: IBM AML multi-hop transfer network, and Dataset 3: SAP Würzburg real general-ledger export). The central finding is conditional, not universal: graph topology adds substantial, leakage-free predictive value on BankSim (+11.7% relative PR-AUC) and synthetic ERP (+213%), is uninformative on IBM AML whose tabular baseline is already saturated (PR-AUC ≈ 0.992), and actively degrades SAP Würzburg (-54.6%). We report this honestly, including the finding that hand-crafted cycle-detection features carry near-zero gain importance on all three datasets, that a learned temporal graph network (TGN) does not beat hand-crafted topology on real data, and that naive synthetic-data augmentation measurably harms real-dataset performance. Furthermore, to address cross-institutional banking privacy barriers (GDPR/GLBA), ChronoSentry introduces a Privacy-Preserving Federated Learning architecture with empirical validation reliability weighting (FedProx), recovering 98.91% of the centralized upper bound's performance without sharing raw customer transactions. Finally, we describe and empirically verify a production Procure-to-Pay ERP with a forensic audit console that serves this leakage-free feature computation live against real transactions with sub-2.5ms latency, backed by database-enforced financial-integrity invariants.</w:t>
+        <w:t>Graph-based fraud detection methods are frequently proposed without an explicit audit of temporal leakage, and rarely evaluated with a controlled, same-architecture ablation that isolates the marginal value of graph structure from the tabular signal it is layered on top of. This paper presents a functional Hybrid TGN-XGBoost model: an end-to-end architecture coupling continuous-time Temporal Graph Networks (TGN) with gradient-boosted decision trees (XGBoost) over a streaming temporal-topology feature engine that enforces a formal read-then-insert invariant so that a transaction's features can never depend on information from its own future. We subject the proposed TGN-XGBoost model to a rigorous within-dataset ablation across three heterogeneous financial datasets (Dataset 1: BankSim bipartite payment simulator, Dataset 2: IBM AML multi-hop transfer network, and Dataset 3: SAP Würzburg real general-ledger export). The central finding is conditional, not universal: graph topology adds substantial, leakage-free predictive value on BankSim (+11.7% relative PR-AUC) and synthetic ERP (+213%), is uninformative on IBM AML whose tabular baseline is already saturated (PR-AUC ≈ 0.992), and actively degrades SAP Würzburg (-54.6%). We report this honestly, including the finding that hand-crafted cycle-detection features carry near-zero gain importance on all three datasets, that a learned TGN does not beat hand-crafted topology on real data, and that naive synthetic-data augmentation measurably harms real-dataset performance. Furthermore, to address cross-institutional banking privacy barriers (GDPR/GLBA), we introduce a Privacy-Preserving Federated Learning architecture with empirical validation reliability weighting (FedProx), recovering 98.91% of the centralized upper bound's performance without sharing raw customer transactions. Finally, we describe and empirically verify a production Procure-to-Pay ERP with a forensic audit console that serves this leakage-free feature computation live against real transactions with sub-2.5ms latency, backed by database-enforced financial-integrity invariants.</w:t>
       </w:r>
     </w:p>
     <w:p>
@@ -92,7 +92,7 @@
           <w:color w:val="2D3748"/>
           <w:sz w:val="19"/>
         </w:rPr>
-        <w:t>fraud detection, temporal graphs, data leakage, anti-money laundering, explainable AI, continuous auditing, ERP systems, XGBoost, federated learning, synthetic data, ChronoSentry.</w:t>
+        <w:t>fraud detection, temporal graphs, data leakage, anti-money laundering, explainable AI, continuous auditing, ERP systems, XGBoost, Temporal Graph Networks, TGN-XGBoost, federated learning.</w:t>
       </w:r>
     </w:p>
     <w:p>
@@ -224,7 +224,7 @@
           <w:color w:val="2D3748"/>
           <w:sz w:val="20"/>
         </w:rPr>
-        <w:t>To resolve these challenges, this paper presents ChronoSentry (Chronologically-Hardened Sentry for Streaming Ledger Forensics): a comprehensive framework combining a streaming, leakage-free temporal topology engine, exact tree-native explainability, privacy-preserving federated score consensus, and an enterprise-grade continuous auditing console.</w:t>
+        <w:t>To resolve these challenges, this paper presents the Hybrid TGN-XGBoost model: a functional framework combining continuous dynamic Temporal Graph Networks, streaming leakage-free temporal topology, exact margin-space TreeSHAP explainability, and privacy-preserving federated consensus for enterprise continuous auditing.</w:t>
       </w:r>
     </w:p>
     <w:p>
@@ -269,7 +269,7 @@
           <w:color w:val="1B365D"/>
           <w:sz w:val="25"/>
         </w:rPr>
-        <w:t>3. Proposed Model (ChronoSentry)</w:t>
+        <w:t>3. Proposed Model (Hybrid TGN-XGBoost)</w:t>
       </w:r>
     </w:p>
     <w:p>
@@ -325,7 +325,7 @@
           <w:color w:val="2D3748"/>
           <w:sz w:val="17"/>
         </w:rPr>
-        <w:t>Fig. 1: End-to-end architectural pipeline of the ChronoSentry framework: from raw ERP/banking transaction ingestion and bipartite graph projection, through the streaming leakage-free temporal topology engine and continuous TGN embedding extraction, to imbalance-aware gradient-boosted tree scoring, TreeSHAP forensic alert packet synthesis, and privacy-preserving federated consensus.</w:t>
+        <w:t>Fig. 1: End-to-end architectural pipeline of the proposed Hybrid TGN-XGBoost model: from raw ERP/banking transaction ingestion and bipartite graph projection, through the streaming leakage-free temporal topology engine and continuous TGN embedding extraction, to imbalance-aware gradient-boosted tree scoring, TreeSHAP forensic alert packet synthesis, and privacy-preserving federated consensus.</w:t>
       </w:r>
     </w:p>
     <w:p>
@@ -355,7 +355,7 @@
           <w:color w:val="2D3748"/>
           <w:sz w:val="20"/>
         </w:rPr>
-        <w:t>The proposed ChronoSentry architecture bridges dynamic transactional multigraphs, continuous temporal graph representations, gradient-boosted decision trees, and regulatory forensic auditing (Fig. 1). We model the incoming transactional ledger as a directed temporal streaming multigraph:</w:t>
+        <w:t>The proposed Hybrid TGN-XGBoost architecture bridges dynamic transactional multigraphs, continuous temporal graph representations, gradient-boosted decision trees, and regulatory forensic auditing (Fig. 1). We model the incoming transactional ledger as a directed temporal streaming multigraph:</w:t>
       </w:r>
     </w:p>
     <w:tbl>
@@ -531,7 +531,7 @@
           <w:color w:val="2D3748"/>
           <w:sz w:val="20"/>
         </w:rPr>
-        <w:t>ChronoSentry comprises six tightly coupled operational modules:</w:t>
+        <w:t>The proposed TGN-XGBoost model comprises six tightly coupled operational modules:</w:t>
       </w:r>
     </w:p>
     <w:p>
@@ -595,7 +595,7 @@
           <w:color w:val="2D3748"/>
           <w:sz w:val="20"/>
         </w:rPr>
-        <w:t xml:space="preserve">3. Continuous Dynamic Graph Representation: </w:t>
+        <w:t xml:space="preserve">3. Continuous Dynamic Graph Representation (TGN): </w:t>
       </w:r>
       <w:r>
         <w:rPr>
@@ -603,7 +603,7 @@
           <w:color w:val="2D3748"/>
           <w:sz w:val="20"/>
         </w:rPr>
-        <w:t>Maintains continuous-time node memory states via a Temporal Graph Network (TGN).</w:t>
+        <w:t>Maintains continuous-time node memory states via a Temporal Graph Network.</w:t>
       </w:r>
     </w:p>
     <w:p>
@@ -619,7 +619,7 @@
           <w:color w:val="2D3748"/>
           <w:sz w:val="20"/>
         </w:rPr>
-        <w:t xml:space="preserve">4. Imbalance-Calibrated Ensemble Classifier: </w:t>
+        <w:t xml:space="preserve">4. Imbalance-Calibrated Ensemble Classifier (XGBoost): </w:t>
       </w:r>
       <w:r>
         <w:rPr>
@@ -1302,7 +1302,7 @@
           <w:color w:val="2D3748"/>
           <w:sz w:val="20"/>
         </w:rPr>
-        <w:t>Dynamic Interaction State Formulation: Unlike Rossi et al. [4] who formulate node states using generic s_i(t) and m_i(t), ChronoSentry maintains an entity state η_α(τ) ∈ ℝ^{d_mem}. Upon the arrival of edge ξ_k, the interaction transition message ρ_{𝔰_k}(τ_k) is synthesized via:</w:t>
+        <w:t>TGN Continuous Interaction State Formulation: Each account maintains an entity state η_α(τ) ∈ ℝ^{d_mem}. Upon the arrival of edge ξ_k, the interaction transition message ρ_{𝔰_k}(τ_k) is synthesized via:</w:t>
       </w:r>
     </w:p>
     <w:tbl>
@@ -1665,7 +1665,7 @@
           <w:color w:val="2D3748"/>
           <w:sz w:val="20"/>
         </w:rPr>
-        <w:t>The finalized ChronoSentry champion model is formulated as:</w:t>
+        <w:t>The finalized TGN-XGBoost champion model couples continuous TGN embeddings with gradient-boosted trees:</w:t>
       </w:r>
     </w:p>
     <w:tbl>
@@ -1706,7 +1706,7 @@
                 <w:color w:val="1B365D"/>
                 <w:sz w:val="19"/>
               </w:rPr>
-              <w:t>f_ChronoSentry(ξ_k) = 𝒯_GBDT( Φ(ξ_k); 𝒥_focal, Θ* )</w:t>
+              <w:t>f_TGN-XGBoost(ξ_k) = 𝒯_GBDT( Φ(ξ_k); 𝒥_focal, Θ* )</w:t>
             </w:r>
             <w:r>
               <w:rPr>
@@ -2384,7 +2384,7 @@
           <w:color w:val="2D3748"/>
           <w:sz w:val="20"/>
         </w:rPr>
-        <w:t>We evaluate ChronoSentry across three diverse, benchmark financial transaction datasets: Dataset 1 (BankSim) represents a synthetic bipartite consumer-to-merchant payment simulation containing 594,643 transactions across 4,166 unique accounts (4,116 customers, 50 merchants) [11] with a 1.21% fraud rate. Dataset 2 (IBM AML) models a directed multi-hop transaction network generated from financial anti-money laundering typologies containing 5,076,142 transactions across 412,416 accounts, featuring complex smurfing and layering chains [12] (0.12% fraud rate in the test split). Dataset 3 (SAP Würzburg) represents a real-world enterprise general ledger export containing 200,687 double-entry accounting records across 1,422 balance sheet and P&amp;L accounts, reflecting legitimate clearing hub structures [13] (0.012% fraud rate).</w:t>
+        <w:t>We evaluate our framework across three diverse, benchmark financial transaction datasets: Dataset 1 (BankSim) represents a synthetic bipartite consumer-to-merchant payment simulation containing 594,643 transactions across 4,166 unique accounts (4,116 customers, 50 merchants) [11] with a 1.21% fraud rate. Dataset 2 (IBM AML) models a directed multi-hop transaction network generated from financial anti-money laundering typologies containing 5,076,142 transactions across 412,416 accounts, featuring complex smurfing and layering chains [12] (0.12% fraud rate in the test split). Dataset 3 (SAP Würzburg) represents a real-world enterprise general ledger export containing 200,687 double-entry accounting records across 1,422 balance sheet and P\&amp;L accounts, reflecting legitimate clearing hub structures [13] (0.012% fraud rate).</w:t>
       </w:r>
     </w:p>
     <w:p>
@@ -3915,7 +3915,7 @@
           <w:color w:val="2D3748"/>
           <w:sz w:val="20"/>
         </w:rPr>
-        <w:t>We benchmark ChronoSentry against standard traditional machine learning classifiers across all three datasets separately: Logistic Regression (LR), Decision Trees (DT), Random Forests (RF), Support Vector Machines (SVM), and Standard Tabular XGBoost without graph features.</w:t>
+        <w:t>We benchmark the proposed TGN-XGBoost champion against standard traditional machine learning classifiers across all three datasets separately: Logistic Regression (LR), Decision Trees (DT), Random Forests (RF), Support Vector Machines (SVM), and Standard Tabular XGBoost without graph features.</w:t>
       </w:r>
     </w:p>
     <w:p>
@@ -5363,7 +5363,7 @@
                 <w:color w:val="1B365D"/>
                 <w:sz w:val="17"/>
               </w:rPr>
-              <w:t>ChronoSentry (Proposed)</w:t>
+              <w:t>TGN-XGBoost (Proposed)</w:t>
             </w:r>
           </w:p>
         </w:tc>
@@ -7017,7 +7017,7 @@
                 <w:color w:val="1B365D"/>
                 <w:sz w:val="17"/>
               </w:rPr>
-              <w:t>ChronoSentry (Proposed)</w:t>
+              <w:t>TGN-XGBoost (Proposed)</w:t>
             </w:r>
           </w:p>
         </w:tc>
@@ -8671,7 +8671,7 @@
                 <w:color w:val="1B365D"/>
                 <w:sz w:val="17"/>
               </w:rPr>
-              <w:t>ChronoSentry (Proposed)</w:t>
+              <w:t>TGN-XGBoost (Proposed)</w:t>
             </w:r>
           </w:p>
         </w:tc>
@@ -8892,7 +8892,7 @@
           <w:color w:val="2D3748"/>
           <w:sz w:val="20"/>
         </w:rPr>
-        <w:t>Discussion: Across all three datasets, ChronoSentry consistently outperforms classical linear and tree models. On Dataset 1 (BankSim), ChronoSentry improves PR-AUC from 0.7870 (tabular XGBoost) and 0.7420 (Random Forest) to 0.9364, a +18.9% absolute gain. On Dataset 2 (IBM AML), amount-derived recurrence enables perfect 1.0000 PR-AUC and 100% precision. On Dataset 3 (SAP Würzburg), extreme class imbalance (0.012% fraud) causes linear and tree baselines to collapse. While all models boast &gt;0.99 ROC-AUC, only ChronoSentry achieves operational utility with Precision@100 = 0.1033 (vs. 0.0733 for baseline XGBoost and 0.0000 for Random Forest), demonstrating the critical ROC-AUC fallacy in rare-event financial forensics.</w:t>
+        <w:t>Discussion: Across all three datasets, the proposed TGN-XGBoost champion consistently outperforms classical linear and tree models. On Dataset 1 (BankSim), TGN-XGBoost improves PR-AUC from 0.7870 (tabular XGBoost) and 0.7420 (Random Forest) to 0.9364, a +18.9% absolute gain. On Dataset 2 (IBM AML), amount-derived recurrence enables perfect 1.0000 PR-AUC and 100% precision. On Dataset 3 (SAP Würzburg), extreme class imbalance (0.012% fraud) causes linear and tree baselines to collapse. While all models boast &gt;0.99 ROC-AUC, only TGN-XGBoost achieves operational utility with Precision@100 = 0.1033 (vs. 0.0733 for baseline XGBoost and 0.0000 for Random Forest), demonstrating the critical ROC-AUC fallacy in rare-event financial forensics.</w:t>
       </w:r>
     </w:p>
     <w:p>
@@ -8948,7 +8948,7 @@
           <w:color w:val="2D3748"/>
           <w:sz w:val="17"/>
         </w:rPr>
-        <w:t>Fig. 3: Precision-Recall curves evaluated on BankSim across model progression arms: Baseline tabular, + Handcrafted Topology, + TGN Dynamic Embeddings, and the ChronoSentry Champion. The shaded band highlights the operational Precision@100 auditing envelope (100% precision at top 100 alerts).</w:t>
+        <w:t>Fig. 3: Precision-Recall curves evaluated on BankSim across model progression arms: Baseline tabular, + Handcrafted Topology, + TGN Dynamic Embeddings, and the TGN-XGBoost Champion. The shaded band highlights the operational Precision@100 auditing envelope (100% precision at top 100 alerts).</w:t>
       </w:r>
     </w:p>
     <w:p>
@@ -9992,7 +9992,7 @@
                 <w:color w:val="1B365D"/>
                 <w:sz w:val="17"/>
               </w:rPr>
-              <w:t>7. ChronoSentry Full Fusion (Proposed)</w:t>
+              <w:t>7. TGN-XGBoost Full Fusion (Proposed)</w:t>
             </w:r>
           </w:p>
         </w:tc>
@@ -10319,7 +10319,7 @@
           <w:color w:val="2D3748"/>
           <w:sz w:val="20"/>
         </w:rPr>
-        <w:t>Handcrafted streaming topology consistently outperforms learned continuous TGN embeddings on real financial data (0.9319 vs. 0.9196 on BankSim). However, fusing both within ChronoSentry captures complementary temporal dynamics, achieving peak overall PR-AUC (0.9364).</w:t>
+        <w:t>Handcrafted streaming topology consistently outperforms learned continuous TGN embeddings on real financial data (0.9319 vs. 0.9196 on BankSim). However, fusing both within TGN-XGBoost captures complementary temporal dynamics, achieving peak overall PR-AUC (0.9364).</w:t>
       </w:r>
     </w:p>
     <w:p>
@@ -11776,7 +11776,7 @@
           <w:color w:val="2D3748"/>
           <w:sz w:val="20"/>
         </w:rPr>
-        <w:t>We benchmark ChronoSentry's FedProx validation reliability weighting against standard federated optimization algorithms across all three datasets (Table 7 and Fig. 6).</w:t>
+        <w:t>We benchmark our FedProx validation reliability weighting against standard federated optimization algorithms across all three datasets (Table 7 and Fig. 6).</w:t>
       </w:r>
     </w:p>
     <w:p>
@@ -13224,7 +13224,7 @@
                 <w:color w:val="1B365D"/>
                 <w:sz w:val="17"/>
               </w:rPr>
-              <w:t>ChronoSentry FedProx (Proposed)</w:t>
+              <w:t>TGN-XGBoost FedProx (Proposed)</w:t>
             </w:r>
           </w:p>
         </w:tc>
@@ -13715,7 +13715,7 @@
           <w:color w:val="2D3748"/>
           <w:sz w:val="17"/>
         </w:rPr>
-        <w:t>Fig. 6: Federated fraud detection performance under non-IID skew on BankSim (C=4). (a) Per-client breakdown comparing isolated local slice, isolated on global stream (blind spot drop), and ChronoSentry consensus; (b) Federation client sensitivity across network sizes C ∈ {2, 3, 4, 5}.</w:t>
+        <w:t>Fig. 6: Federated fraud detection performance under non-IID skew on BankSim (C=4). (a) Per-client breakdown comparing isolated local slice, isolated on global stream (blind spot drop), and TGN-XGBoost consensus; (b) Federation client sensitivity across network sizes C ∈ {2, 3, 4, 5}.</w:t>
       </w:r>
     </w:p>
     <w:p>
@@ -13730,7 +13730,7 @@
           <w:color w:val="2D3748"/>
           <w:sz w:val="20"/>
         </w:rPr>
-        <w:t>Discussion: Under severe non-IID client skew, standard FedAvg allows large, low-fraud institutions (Client 0) to overpower specialized institutions. Size-weighted FedAvg degrades performance further because Client 0 holds 87.5% of total volume. ChronoSentry's validation reliability weighting dynamically downweights uninformative consensus contributions, recovering 98.91% of centralized performance on BankSim and 99.95% on IBM AML without transferring raw customer records.</w:t>
+        <w:t>Discussion: Under severe non-IID client skew, standard FedAvg allows large, low-fraud institutions (Client 0) to overpower specialized institutions. Size-weighted FedAvg degrades performance further because Client 0 holds 87.5% of total volume. Our validation reliability weighting dynamically downweights uninformative consensus contributions, recovering 98.91% of centralized performance on BankSim and 99.95% on IBM AML without transferring raw customer records.</w:t>
       </w:r>
     </w:p>
     <w:p>
@@ -13775,8 +13775,1718 @@
           <w:color w:val="2D3748"/>
           <w:sz w:val="20"/>
         </w:rPr>
-        <w:t>Fig. 7 illustrates the normalized and absolute contingency matrices evaluated on held-out test splits under frozen operational thresholds θ_audit*.</w:t>
+        <w:t>Tables 8, 9, and 10 present the explicit 2x2 confusion contingency matrices evaluated on held-out test splits under frozen operational thresholds θ_audit*, and Fig. 7 provides the corresponding visual contingency heatmaps across all three benchmark datasets.</w:t>
       </w:r>
+    </w:p>
+    <w:p>
+      <w:pPr>
+        <w:keepNext/>
+        <w:spacing w:before="160" w:after="40"/>
+      </w:pPr>
+      <w:r>
+        <w:rPr>
+          <w:rFonts w:ascii="Calibri" w:hAnsi="Calibri"/>
+          <w:b/>
+          <w:color w:val="1B365D"/>
+          <w:sz w:val="19"/>
+        </w:rPr>
+        <w:t>Table 8: Confusion Matrix for Dataset 1 (BankSim) under Frozen Operational Threshold θ_audit* = 0.534.</w:t>
+      </w:r>
+    </w:p>
+    <w:tbl>
+      <w:tblPr>
+        <w:tblW w:type="auto" w:w="0"/>
+        <w:jc w:val="center"/>
+        <w:tblLook w:firstColumn="1" w:firstRow="1" w:lastColumn="0" w:lastRow="0" w:noHBand="0" w:noVBand="1" w:val="04A0"/>
+      </w:tblPr>
+      <w:tblGrid>
+        <w:gridCol w:w="2520"/>
+        <w:gridCol w:w="2520"/>
+        <w:gridCol w:w="2520"/>
+        <w:gridCol w:w="2520"/>
+      </w:tblGrid>
+      <w:tr>
+        <w:trPr>
+          <w:tblHeader/>
+          <w:cantSplit/>
+        </w:trPr>
+        <w:tc>
+          <w:tcPr>
+            <w:tcW w:type="dxa" w:w="2589"/>
+            <w:vAlign w:val="center"/>
+            <w:shd w:fill="1B365D"/>
+            <w:tcBorders>
+              <w:top w:val="single" w:sz="4" w:space="0" w:color="CBD5E0"/>
+              <w:left w:val="none"/>
+              <w:bottom w:val="double" w:sz="12" w:space="0" w:color="1B365D"/>
+              <w:right w:val="none"/>
+            </w:tcBorders>
+            <w:tcMar>
+              <w:top w:w="70" w:type="dxa"/>
+              <w:left w:w="60" w:type="dxa"/>
+              <w:bottom w:w="70" w:type="dxa"/>
+              <w:right w:w="60" w:type="dxa"/>
+            </w:tcMar>
+          </w:tcPr>
+          <w:p>
+            <w:pPr>
+              <w:jc w:val="center"/>
+            </w:pPr>
+            <w:r>
+              <w:rPr>
+                <w:rFonts w:ascii="Calibri" w:hAnsi="Calibri"/>
+                <w:b/>
+                <w:color w:val="FFFFFF"/>
+                <w:sz w:val="17"/>
+              </w:rPr>
+              <w:t>Actual \ Predicted</w:t>
+            </w:r>
+          </w:p>
+        </w:tc>
+        <w:tc>
+          <w:tcPr>
+            <w:tcW w:type="dxa" w:w="2390"/>
+            <w:vAlign w:val="center"/>
+            <w:shd w:fill="1B365D"/>
+            <w:tcBorders>
+              <w:top w:val="single" w:sz="4" w:space="0" w:color="CBD5E0"/>
+              <w:left w:val="none"/>
+              <w:bottom w:val="double" w:sz="12" w:space="0" w:color="1B365D"/>
+              <w:right w:val="none"/>
+            </w:tcBorders>
+            <w:tcMar>
+              <w:top w:w="70" w:type="dxa"/>
+              <w:left w:w="60" w:type="dxa"/>
+              <w:bottom w:w="70" w:type="dxa"/>
+              <w:right w:w="60" w:type="dxa"/>
+            </w:tcMar>
+          </w:tcPr>
+          <w:p>
+            <w:pPr>
+              <w:jc w:val="center"/>
+            </w:pPr>
+            <w:r>
+              <w:rPr>
+                <w:rFonts w:ascii="Calibri" w:hAnsi="Calibri"/>
+                <w:b/>
+                <w:color w:val="FFFFFF"/>
+                <w:sz w:val="17"/>
+              </w:rPr>
+              <w:t>Pred. Non-Fraud</w:t>
+            </w:r>
+          </w:p>
+        </w:tc>
+        <w:tc>
+          <w:tcPr>
+            <w:tcW w:type="dxa" w:w="2390"/>
+            <w:vAlign w:val="center"/>
+            <w:shd w:fill="1B365D"/>
+            <w:tcBorders>
+              <w:top w:val="single" w:sz="4" w:space="0" w:color="CBD5E0"/>
+              <w:left w:val="none"/>
+              <w:bottom w:val="double" w:sz="12" w:space="0" w:color="1B365D"/>
+              <w:right w:val="none"/>
+            </w:tcBorders>
+            <w:tcMar>
+              <w:top w:w="70" w:type="dxa"/>
+              <w:left w:w="60" w:type="dxa"/>
+              <w:bottom w:w="70" w:type="dxa"/>
+              <w:right w:w="60" w:type="dxa"/>
+            </w:tcMar>
+          </w:tcPr>
+          <w:p>
+            <w:pPr>
+              <w:jc w:val="center"/>
+            </w:pPr>
+            <w:r>
+              <w:rPr>
+                <w:rFonts w:ascii="Calibri" w:hAnsi="Calibri"/>
+                <w:b/>
+                <w:color w:val="FFFFFF"/>
+                <w:sz w:val="17"/>
+              </w:rPr>
+              <w:t>Pred. Fraud</w:t>
+            </w:r>
+          </w:p>
+        </w:tc>
+        <w:tc>
+          <w:tcPr>
+            <w:tcW w:type="dxa" w:w="1991"/>
+            <w:vAlign w:val="center"/>
+            <w:shd w:fill="1B365D"/>
+            <w:tcBorders>
+              <w:top w:val="single" w:sz="4" w:space="0" w:color="CBD5E0"/>
+              <w:left w:val="none"/>
+              <w:bottom w:val="double" w:sz="12" w:space="0" w:color="1B365D"/>
+              <w:right w:val="none"/>
+            </w:tcBorders>
+            <w:tcMar>
+              <w:top w:w="70" w:type="dxa"/>
+              <w:left w:w="60" w:type="dxa"/>
+              <w:bottom w:w="70" w:type="dxa"/>
+              <w:right w:w="60" w:type="dxa"/>
+            </w:tcMar>
+          </w:tcPr>
+          <w:p>
+            <w:pPr>
+              <w:jc w:val="center"/>
+            </w:pPr>
+            <w:r>
+              <w:rPr>
+                <w:rFonts w:ascii="Calibri" w:hAnsi="Calibri"/>
+                <w:b/>
+                <w:color w:val="FFFFFF"/>
+                <w:sz w:val="17"/>
+              </w:rPr>
+              <w:t>Total Actual</w:t>
+            </w:r>
+          </w:p>
+        </w:tc>
+      </w:tr>
+      <w:tr>
+        <w:trPr>
+          <w:cantSplit/>
+        </w:trPr>
+        <w:tc>
+          <w:tcPr>
+            <w:tcW w:type="dxa" w:w="2589"/>
+            <w:vAlign w:val="center"/>
+            <w:shd w:fill="F7FAFC"/>
+            <w:tcBorders>
+              <w:top w:val="single" w:sz="4" w:space="0" w:color="CBD5E0"/>
+              <w:left w:val="none"/>
+              <w:bottom w:val="single" w:sz="4" w:space="0" w:color="CBD5E0"/>
+              <w:right w:val="none"/>
+            </w:tcBorders>
+            <w:tcMar>
+              <w:top w:w="70" w:type="dxa"/>
+              <w:left w:w="60" w:type="dxa"/>
+              <w:bottom w:w="70" w:type="dxa"/>
+              <w:right w:w="60" w:type="dxa"/>
+            </w:tcMar>
+          </w:tcPr>
+          <w:p>
+            <w:pPr>
+              <w:jc w:val="left"/>
+            </w:pPr>
+            <w:r>
+              <w:rPr>
+                <w:rFonts w:ascii="Calibri" w:hAnsi="Calibri"/>
+                <w:color w:val="2D3748"/>
+                <w:sz w:val="17"/>
+              </w:rPr>
+              <w:t>Actual Non-Fraud</w:t>
+            </w:r>
+          </w:p>
+        </w:tc>
+        <w:tc>
+          <w:tcPr>
+            <w:tcW w:type="dxa" w:w="2390"/>
+            <w:vAlign w:val="center"/>
+            <w:shd w:fill="F7FAFC"/>
+            <w:tcBorders>
+              <w:top w:val="single" w:sz="4" w:space="0" w:color="CBD5E0"/>
+              <w:left w:val="none"/>
+              <w:bottom w:val="single" w:sz="4" w:space="0" w:color="CBD5E0"/>
+              <w:right w:val="none"/>
+            </w:tcBorders>
+            <w:tcMar>
+              <w:top w:w="70" w:type="dxa"/>
+              <w:left w:w="60" w:type="dxa"/>
+              <w:bottom w:w="70" w:type="dxa"/>
+              <w:right w:w="60" w:type="dxa"/>
+            </w:tcMar>
+          </w:tcPr>
+          <w:p>
+            <w:pPr>
+              <w:jc w:val="center"/>
+            </w:pPr>
+            <w:r>
+              <w:rPr>
+                <w:rFonts w:ascii="Calibri" w:hAnsi="Calibri"/>
+                <w:color w:val="2D3748"/>
+                <w:sz w:val="17"/>
+              </w:rPr>
+              <w:t>120,809 (TN: 98.80%)</w:t>
+            </w:r>
+          </w:p>
+        </w:tc>
+        <w:tc>
+          <w:tcPr>
+            <w:tcW w:type="dxa" w:w="2390"/>
+            <w:vAlign w:val="center"/>
+            <w:shd w:fill="F7FAFC"/>
+            <w:tcBorders>
+              <w:top w:val="single" w:sz="4" w:space="0" w:color="CBD5E0"/>
+              <w:left w:val="none"/>
+              <w:bottom w:val="single" w:sz="4" w:space="0" w:color="CBD5E0"/>
+              <w:right w:val="none"/>
+            </w:tcBorders>
+            <w:tcMar>
+              <w:top w:w="70" w:type="dxa"/>
+              <w:left w:w="60" w:type="dxa"/>
+              <w:bottom w:w="70" w:type="dxa"/>
+              <w:right w:w="60" w:type="dxa"/>
+            </w:tcMar>
+          </w:tcPr>
+          <w:p>
+            <w:pPr>
+              <w:jc w:val="center"/>
+            </w:pPr>
+            <w:r>
+              <w:rPr>
+                <w:rFonts w:ascii="Calibri" w:hAnsi="Calibri"/>
+                <w:color w:val="2D3748"/>
+                <w:sz w:val="17"/>
+              </w:rPr>
+              <w:t>149 (FP: 0.12%)</w:t>
+            </w:r>
+          </w:p>
+        </w:tc>
+        <w:tc>
+          <w:tcPr>
+            <w:tcW w:type="dxa" w:w="1991"/>
+            <w:vAlign w:val="center"/>
+            <w:shd w:fill="F7FAFC"/>
+            <w:tcBorders>
+              <w:top w:val="single" w:sz="4" w:space="0" w:color="CBD5E0"/>
+              <w:left w:val="none"/>
+              <w:bottom w:val="single" w:sz="4" w:space="0" w:color="CBD5E0"/>
+              <w:right w:val="none"/>
+            </w:tcBorders>
+            <w:tcMar>
+              <w:top w:w="70" w:type="dxa"/>
+              <w:left w:w="60" w:type="dxa"/>
+              <w:bottom w:w="70" w:type="dxa"/>
+              <w:right w:w="60" w:type="dxa"/>
+            </w:tcMar>
+          </w:tcPr>
+          <w:p>
+            <w:pPr>
+              <w:jc w:val="center"/>
+            </w:pPr>
+            <w:r>
+              <w:rPr>
+                <w:rFonts w:ascii="Calibri" w:hAnsi="Calibri"/>
+                <w:color w:val="2D3748"/>
+                <w:sz w:val="17"/>
+              </w:rPr>
+              <w:t>120,958</w:t>
+            </w:r>
+          </w:p>
+        </w:tc>
+      </w:tr>
+      <w:tr>
+        <w:trPr>
+          <w:cantSplit/>
+        </w:trPr>
+        <w:tc>
+          <w:tcPr>
+            <w:tcW w:type="dxa" w:w="2589"/>
+            <w:vAlign w:val="center"/>
+            <w:shd w:fill="FFFFFF"/>
+            <w:tcBorders>
+              <w:top w:val="single" w:sz="4" w:space="0" w:color="CBD5E0"/>
+              <w:left w:val="none"/>
+              <w:bottom w:val="single" w:sz="4" w:space="0" w:color="CBD5E0"/>
+              <w:right w:val="none"/>
+            </w:tcBorders>
+            <w:tcMar>
+              <w:top w:w="70" w:type="dxa"/>
+              <w:left w:w="60" w:type="dxa"/>
+              <w:bottom w:w="70" w:type="dxa"/>
+              <w:right w:w="60" w:type="dxa"/>
+            </w:tcMar>
+          </w:tcPr>
+          <w:p>
+            <w:pPr>
+              <w:jc w:val="left"/>
+            </w:pPr>
+            <w:r>
+              <w:rPr>
+                <w:rFonts w:ascii="Calibri" w:hAnsi="Calibri"/>
+                <w:color w:val="2D3748"/>
+                <w:sz w:val="17"/>
+              </w:rPr>
+              <w:t>Actual Fraud</w:t>
+            </w:r>
+          </w:p>
+        </w:tc>
+        <w:tc>
+          <w:tcPr>
+            <w:tcW w:type="dxa" w:w="2390"/>
+            <w:vAlign w:val="center"/>
+            <w:shd w:fill="FFFFFF"/>
+            <w:tcBorders>
+              <w:top w:val="single" w:sz="4" w:space="0" w:color="CBD5E0"/>
+              <w:left w:val="none"/>
+              <w:bottom w:val="single" w:sz="4" w:space="0" w:color="CBD5E0"/>
+              <w:right w:val="none"/>
+            </w:tcBorders>
+            <w:tcMar>
+              <w:top w:w="70" w:type="dxa"/>
+              <w:left w:w="60" w:type="dxa"/>
+              <w:bottom w:w="70" w:type="dxa"/>
+              <w:right w:w="60" w:type="dxa"/>
+            </w:tcMar>
+          </w:tcPr>
+          <w:p>
+            <w:pPr>
+              <w:jc w:val="center"/>
+            </w:pPr>
+            <w:r>
+              <w:rPr>
+                <w:rFonts w:ascii="Calibri" w:hAnsi="Calibri"/>
+                <w:color w:val="2D3748"/>
+                <w:sz w:val="17"/>
+              </w:rPr>
+              <w:t>236 (FN: 0.19%)</w:t>
+            </w:r>
+          </w:p>
+        </w:tc>
+        <w:tc>
+          <w:tcPr>
+            <w:tcW w:type="dxa" w:w="2390"/>
+            <w:vAlign w:val="center"/>
+            <w:shd w:fill="FFFFFF"/>
+            <w:tcBorders>
+              <w:top w:val="single" w:sz="4" w:space="0" w:color="CBD5E0"/>
+              <w:left w:val="none"/>
+              <w:bottom w:val="single" w:sz="4" w:space="0" w:color="CBD5E0"/>
+              <w:right w:val="none"/>
+            </w:tcBorders>
+            <w:tcMar>
+              <w:top w:w="70" w:type="dxa"/>
+              <w:left w:w="60" w:type="dxa"/>
+              <w:bottom w:w="70" w:type="dxa"/>
+              <w:right w:w="60" w:type="dxa"/>
+            </w:tcMar>
+          </w:tcPr>
+          <w:p>
+            <w:pPr>
+              <w:jc w:val="center"/>
+            </w:pPr>
+            <w:r>
+              <w:rPr>
+                <w:rFonts w:ascii="Calibri" w:hAnsi="Calibri"/>
+                <w:color w:val="2D3748"/>
+                <w:sz w:val="17"/>
+              </w:rPr>
+              <w:t>1,084 (TP: 0.89%)</w:t>
+            </w:r>
+          </w:p>
+        </w:tc>
+        <w:tc>
+          <w:tcPr>
+            <w:tcW w:type="dxa" w:w="1991"/>
+            <w:vAlign w:val="center"/>
+            <w:shd w:fill="FFFFFF"/>
+            <w:tcBorders>
+              <w:top w:val="single" w:sz="4" w:space="0" w:color="CBD5E0"/>
+              <w:left w:val="none"/>
+              <w:bottom w:val="single" w:sz="4" w:space="0" w:color="CBD5E0"/>
+              <w:right w:val="none"/>
+            </w:tcBorders>
+            <w:tcMar>
+              <w:top w:w="70" w:type="dxa"/>
+              <w:left w:w="60" w:type="dxa"/>
+              <w:bottom w:w="70" w:type="dxa"/>
+              <w:right w:w="60" w:type="dxa"/>
+            </w:tcMar>
+          </w:tcPr>
+          <w:p>
+            <w:pPr>
+              <w:jc w:val="center"/>
+            </w:pPr>
+            <w:r>
+              <w:rPr>
+                <w:rFonts w:ascii="Calibri" w:hAnsi="Calibri"/>
+                <w:color w:val="2D3748"/>
+                <w:sz w:val="17"/>
+              </w:rPr>
+              <w:t>1,320</w:t>
+            </w:r>
+          </w:p>
+        </w:tc>
+      </w:tr>
+      <w:tr>
+        <w:trPr>
+          <w:cantSplit/>
+        </w:trPr>
+        <w:tc>
+          <w:tcPr>
+            <w:tcW w:type="dxa" w:w="2589"/>
+            <w:vAlign w:val="center"/>
+            <w:shd w:fill="F7FAFC"/>
+            <w:tcBorders>
+              <w:top w:val="single" w:sz="4" w:space="0" w:color="CBD5E0"/>
+              <w:left w:val="none"/>
+              <w:bottom w:val="single" w:sz="4" w:space="0" w:color="CBD5E0"/>
+              <w:right w:val="none"/>
+            </w:tcBorders>
+            <w:tcMar>
+              <w:top w:w="70" w:type="dxa"/>
+              <w:left w:w="60" w:type="dxa"/>
+              <w:bottom w:w="70" w:type="dxa"/>
+              <w:right w:w="60" w:type="dxa"/>
+            </w:tcMar>
+          </w:tcPr>
+          <w:p>
+            <w:pPr>
+              <w:jc w:val="left"/>
+            </w:pPr>
+            <w:r>
+              <w:rPr>
+                <w:rFonts w:ascii="Calibri" w:hAnsi="Calibri"/>
+                <w:color w:val="2D3748"/>
+                <w:sz w:val="17"/>
+              </w:rPr>
+              <w:t>Total Predicted</w:t>
+            </w:r>
+          </w:p>
+        </w:tc>
+        <w:tc>
+          <w:tcPr>
+            <w:tcW w:type="dxa" w:w="2390"/>
+            <w:vAlign w:val="center"/>
+            <w:shd w:fill="F7FAFC"/>
+            <w:tcBorders>
+              <w:top w:val="single" w:sz="4" w:space="0" w:color="CBD5E0"/>
+              <w:left w:val="none"/>
+              <w:bottom w:val="single" w:sz="4" w:space="0" w:color="CBD5E0"/>
+              <w:right w:val="none"/>
+            </w:tcBorders>
+            <w:tcMar>
+              <w:top w:w="70" w:type="dxa"/>
+              <w:left w:w="60" w:type="dxa"/>
+              <w:bottom w:w="70" w:type="dxa"/>
+              <w:right w:w="60" w:type="dxa"/>
+            </w:tcMar>
+          </w:tcPr>
+          <w:p>
+            <w:pPr>
+              <w:jc w:val="center"/>
+            </w:pPr>
+            <w:r>
+              <w:rPr>
+                <w:rFonts w:ascii="Calibri" w:hAnsi="Calibri"/>
+                <w:color w:val="2D3748"/>
+                <w:sz w:val="17"/>
+              </w:rPr>
+              <w:t>121,045 (98.99%)</w:t>
+            </w:r>
+          </w:p>
+        </w:tc>
+        <w:tc>
+          <w:tcPr>
+            <w:tcW w:type="dxa" w:w="2390"/>
+            <w:vAlign w:val="center"/>
+            <w:shd w:fill="F7FAFC"/>
+            <w:tcBorders>
+              <w:top w:val="single" w:sz="4" w:space="0" w:color="CBD5E0"/>
+              <w:left w:val="none"/>
+              <w:bottom w:val="single" w:sz="4" w:space="0" w:color="CBD5E0"/>
+              <w:right w:val="none"/>
+            </w:tcBorders>
+            <w:tcMar>
+              <w:top w:w="70" w:type="dxa"/>
+              <w:left w:w="60" w:type="dxa"/>
+              <w:bottom w:w="70" w:type="dxa"/>
+              <w:right w:w="60" w:type="dxa"/>
+            </w:tcMar>
+          </w:tcPr>
+          <w:p>
+            <w:pPr>
+              <w:jc w:val="center"/>
+            </w:pPr>
+            <w:r>
+              <w:rPr>
+                <w:rFonts w:ascii="Calibri" w:hAnsi="Calibri"/>
+                <w:color w:val="2D3748"/>
+                <w:sz w:val="17"/>
+              </w:rPr>
+              <w:t>1,233 (1.01%)</w:t>
+            </w:r>
+          </w:p>
+        </w:tc>
+        <w:tc>
+          <w:tcPr>
+            <w:tcW w:type="dxa" w:w="1991"/>
+            <w:vAlign w:val="center"/>
+            <w:shd w:fill="F7FAFC"/>
+            <w:tcBorders>
+              <w:top w:val="single" w:sz="4" w:space="0" w:color="CBD5E0"/>
+              <w:left w:val="none"/>
+              <w:bottom w:val="single" w:sz="4" w:space="0" w:color="CBD5E0"/>
+              <w:right w:val="none"/>
+            </w:tcBorders>
+            <w:tcMar>
+              <w:top w:w="70" w:type="dxa"/>
+              <w:left w:w="60" w:type="dxa"/>
+              <w:bottom w:w="70" w:type="dxa"/>
+              <w:right w:w="60" w:type="dxa"/>
+            </w:tcMar>
+          </w:tcPr>
+          <w:p>
+            <w:pPr>
+              <w:jc w:val="center"/>
+            </w:pPr>
+            <w:r>
+              <w:rPr>
+                <w:rFonts w:ascii="Calibri" w:hAnsi="Calibri"/>
+                <w:color w:val="2D3748"/>
+                <w:sz w:val="17"/>
+              </w:rPr>
+              <w:t>122,278</w:t>
+            </w:r>
+          </w:p>
+        </w:tc>
+      </w:tr>
+    </w:tbl>
+    <w:p>
+      <w:pPr>
+        <w:spacing w:after="80"/>
+      </w:pPr>
+    </w:p>
+    <w:p>
+      <w:pPr>
+        <w:keepNext/>
+        <w:spacing w:before="160" w:after="40"/>
+      </w:pPr>
+      <w:r>
+        <w:rPr>
+          <w:rFonts w:ascii="Calibri" w:hAnsi="Calibri"/>
+          <w:b/>
+          <w:color w:val="1B365D"/>
+          <w:sz w:val="19"/>
+        </w:rPr>
+        <w:t>Table 9: Confusion Matrix for Dataset 2 (IBM AML) under Frozen Operational Threshold θ_audit* = 0.490.</w:t>
+      </w:r>
+    </w:p>
+    <w:tbl>
+      <w:tblPr>
+        <w:tblW w:type="auto" w:w="0"/>
+        <w:jc w:val="center"/>
+        <w:tblLook w:firstColumn="1" w:firstRow="1" w:lastColumn="0" w:lastRow="0" w:noHBand="0" w:noVBand="1" w:val="04A0"/>
+      </w:tblPr>
+      <w:tblGrid>
+        <w:gridCol w:w="2520"/>
+        <w:gridCol w:w="2520"/>
+        <w:gridCol w:w="2520"/>
+        <w:gridCol w:w="2520"/>
+      </w:tblGrid>
+      <w:tr>
+        <w:trPr>
+          <w:tblHeader/>
+          <w:cantSplit/>
+        </w:trPr>
+        <w:tc>
+          <w:tcPr>
+            <w:tcW w:type="dxa" w:w="2589"/>
+            <w:vAlign w:val="center"/>
+            <w:shd w:fill="1B365D"/>
+            <w:tcBorders>
+              <w:top w:val="single" w:sz="4" w:space="0" w:color="CBD5E0"/>
+              <w:left w:val="none"/>
+              <w:bottom w:val="double" w:sz="12" w:space="0" w:color="1B365D"/>
+              <w:right w:val="none"/>
+            </w:tcBorders>
+            <w:tcMar>
+              <w:top w:w="70" w:type="dxa"/>
+              <w:left w:w="60" w:type="dxa"/>
+              <w:bottom w:w="70" w:type="dxa"/>
+              <w:right w:w="60" w:type="dxa"/>
+            </w:tcMar>
+          </w:tcPr>
+          <w:p>
+            <w:pPr>
+              <w:jc w:val="center"/>
+            </w:pPr>
+            <w:r>
+              <w:rPr>
+                <w:rFonts w:ascii="Calibri" w:hAnsi="Calibri"/>
+                <w:b/>
+                <w:color w:val="FFFFFF"/>
+                <w:sz w:val="17"/>
+              </w:rPr>
+              <w:t>Actual \ Predicted</w:t>
+            </w:r>
+          </w:p>
+        </w:tc>
+        <w:tc>
+          <w:tcPr>
+            <w:tcW w:type="dxa" w:w="2390"/>
+            <w:vAlign w:val="center"/>
+            <w:shd w:fill="1B365D"/>
+            <w:tcBorders>
+              <w:top w:val="single" w:sz="4" w:space="0" w:color="CBD5E0"/>
+              <w:left w:val="none"/>
+              <w:bottom w:val="double" w:sz="12" w:space="0" w:color="1B365D"/>
+              <w:right w:val="none"/>
+            </w:tcBorders>
+            <w:tcMar>
+              <w:top w:w="70" w:type="dxa"/>
+              <w:left w:w="60" w:type="dxa"/>
+              <w:bottom w:w="70" w:type="dxa"/>
+              <w:right w:w="60" w:type="dxa"/>
+            </w:tcMar>
+          </w:tcPr>
+          <w:p>
+            <w:pPr>
+              <w:jc w:val="center"/>
+            </w:pPr>
+            <w:r>
+              <w:rPr>
+                <w:rFonts w:ascii="Calibri" w:hAnsi="Calibri"/>
+                <w:b/>
+                <w:color w:val="FFFFFF"/>
+                <w:sz w:val="17"/>
+              </w:rPr>
+              <w:t>Pred. Non-Fraud</w:t>
+            </w:r>
+          </w:p>
+        </w:tc>
+        <w:tc>
+          <w:tcPr>
+            <w:tcW w:type="dxa" w:w="2390"/>
+            <w:vAlign w:val="center"/>
+            <w:shd w:fill="1B365D"/>
+            <w:tcBorders>
+              <w:top w:val="single" w:sz="4" w:space="0" w:color="CBD5E0"/>
+              <w:left w:val="none"/>
+              <w:bottom w:val="double" w:sz="12" w:space="0" w:color="1B365D"/>
+              <w:right w:val="none"/>
+            </w:tcBorders>
+            <w:tcMar>
+              <w:top w:w="70" w:type="dxa"/>
+              <w:left w:w="60" w:type="dxa"/>
+              <w:bottom w:w="70" w:type="dxa"/>
+              <w:right w:w="60" w:type="dxa"/>
+            </w:tcMar>
+          </w:tcPr>
+          <w:p>
+            <w:pPr>
+              <w:jc w:val="center"/>
+            </w:pPr>
+            <w:r>
+              <w:rPr>
+                <w:rFonts w:ascii="Calibri" w:hAnsi="Calibri"/>
+                <w:b/>
+                <w:color w:val="FFFFFF"/>
+                <w:sz w:val="17"/>
+              </w:rPr>
+              <w:t>Pred. Fraud</w:t>
+            </w:r>
+          </w:p>
+        </w:tc>
+        <w:tc>
+          <w:tcPr>
+            <w:tcW w:type="dxa" w:w="1991"/>
+            <w:vAlign w:val="center"/>
+            <w:shd w:fill="1B365D"/>
+            <w:tcBorders>
+              <w:top w:val="single" w:sz="4" w:space="0" w:color="CBD5E0"/>
+              <w:left w:val="none"/>
+              <w:bottom w:val="double" w:sz="12" w:space="0" w:color="1B365D"/>
+              <w:right w:val="none"/>
+            </w:tcBorders>
+            <w:tcMar>
+              <w:top w:w="70" w:type="dxa"/>
+              <w:left w:w="60" w:type="dxa"/>
+              <w:bottom w:w="70" w:type="dxa"/>
+              <w:right w:w="60" w:type="dxa"/>
+            </w:tcMar>
+          </w:tcPr>
+          <w:p>
+            <w:pPr>
+              <w:jc w:val="center"/>
+            </w:pPr>
+            <w:r>
+              <w:rPr>
+                <w:rFonts w:ascii="Calibri" w:hAnsi="Calibri"/>
+                <w:b/>
+                <w:color w:val="FFFFFF"/>
+                <w:sz w:val="17"/>
+              </w:rPr>
+              <w:t>Total Actual</w:t>
+            </w:r>
+          </w:p>
+        </w:tc>
+      </w:tr>
+      <w:tr>
+        <w:trPr>
+          <w:cantSplit/>
+        </w:trPr>
+        <w:tc>
+          <w:tcPr>
+            <w:tcW w:type="dxa" w:w="2589"/>
+            <w:vAlign w:val="center"/>
+            <w:shd w:fill="F7FAFC"/>
+            <w:tcBorders>
+              <w:top w:val="single" w:sz="4" w:space="0" w:color="CBD5E0"/>
+              <w:left w:val="none"/>
+              <w:bottom w:val="single" w:sz="4" w:space="0" w:color="CBD5E0"/>
+              <w:right w:val="none"/>
+            </w:tcBorders>
+            <w:tcMar>
+              <w:top w:w="70" w:type="dxa"/>
+              <w:left w:w="60" w:type="dxa"/>
+              <w:bottom w:w="70" w:type="dxa"/>
+              <w:right w:w="60" w:type="dxa"/>
+            </w:tcMar>
+          </w:tcPr>
+          <w:p>
+            <w:pPr>
+              <w:jc w:val="left"/>
+            </w:pPr>
+            <w:r>
+              <w:rPr>
+                <w:rFonts w:ascii="Calibri" w:hAnsi="Calibri"/>
+                <w:color w:val="2D3748"/>
+                <w:sz w:val="17"/>
+              </w:rPr>
+              <w:t>Actual Non-Fraud</w:t>
+            </w:r>
+          </w:p>
+        </w:tc>
+        <w:tc>
+          <w:tcPr>
+            <w:tcW w:type="dxa" w:w="2390"/>
+            <w:vAlign w:val="center"/>
+            <w:shd w:fill="F7FAFC"/>
+            <w:tcBorders>
+              <w:top w:val="single" w:sz="4" w:space="0" w:color="CBD5E0"/>
+              <w:left w:val="none"/>
+              <w:bottom w:val="single" w:sz="4" w:space="0" w:color="CBD5E0"/>
+              <w:right w:val="none"/>
+            </w:tcBorders>
+            <w:tcMar>
+              <w:top w:w="70" w:type="dxa"/>
+              <w:left w:w="60" w:type="dxa"/>
+              <w:bottom w:w="70" w:type="dxa"/>
+              <w:right w:w="60" w:type="dxa"/>
+            </w:tcMar>
+          </w:tcPr>
+          <w:p>
+            <w:pPr>
+              <w:jc w:val="center"/>
+            </w:pPr>
+            <w:r>
+              <w:rPr>
+                <w:rFonts w:ascii="Calibri" w:hAnsi="Calibri"/>
+                <w:color w:val="2D3748"/>
+                <w:sz w:val="17"/>
+              </w:rPr>
+              <w:t>265,822 (TN: 99.86%)</w:t>
+            </w:r>
+          </w:p>
+        </w:tc>
+        <w:tc>
+          <w:tcPr>
+            <w:tcW w:type="dxa" w:w="2390"/>
+            <w:vAlign w:val="center"/>
+            <w:shd w:fill="F7FAFC"/>
+            <w:tcBorders>
+              <w:top w:val="single" w:sz="4" w:space="0" w:color="CBD5E0"/>
+              <w:left w:val="none"/>
+              <w:bottom w:val="single" w:sz="4" w:space="0" w:color="CBD5E0"/>
+              <w:right w:val="none"/>
+            </w:tcBorders>
+            <w:tcMar>
+              <w:top w:w="70" w:type="dxa"/>
+              <w:left w:w="60" w:type="dxa"/>
+              <w:bottom w:w="70" w:type="dxa"/>
+              <w:right w:w="60" w:type="dxa"/>
+            </w:tcMar>
+          </w:tcPr>
+          <w:p>
+            <w:pPr>
+              <w:jc w:val="center"/>
+            </w:pPr>
+            <w:r>
+              <w:rPr>
+                <w:rFonts w:ascii="Calibri" w:hAnsi="Calibri"/>
+                <w:color w:val="2D3748"/>
+                <w:sz w:val="17"/>
+              </w:rPr>
+              <w:t>0 (FP: 0.00%)</w:t>
+            </w:r>
+          </w:p>
+        </w:tc>
+        <w:tc>
+          <w:tcPr>
+            <w:tcW w:type="dxa" w:w="1991"/>
+            <w:vAlign w:val="center"/>
+            <w:shd w:fill="F7FAFC"/>
+            <w:tcBorders>
+              <w:top w:val="single" w:sz="4" w:space="0" w:color="CBD5E0"/>
+              <w:left w:val="none"/>
+              <w:bottom w:val="single" w:sz="4" w:space="0" w:color="CBD5E0"/>
+              <w:right w:val="none"/>
+            </w:tcBorders>
+            <w:tcMar>
+              <w:top w:w="70" w:type="dxa"/>
+              <w:left w:w="60" w:type="dxa"/>
+              <w:bottom w:w="70" w:type="dxa"/>
+              <w:right w:w="60" w:type="dxa"/>
+            </w:tcMar>
+          </w:tcPr>
+          <w:p>
+            <w:pPr>
+              <w:jc w:val="center"/>
+            </w:pPr>
+            <w:r>
+              <w:rPr>
+                <w:rFonts w:ascii="Calibri" w:hAnsi="Calibri"/>
+                <w:color w:val="2D3748"/>
+                <w:sz w:val="17"/>
+              </w:rPr>
+              <w:t>265,822</w:t>
+            </w:r>
+          </w:p>
+        </w:tc>
+      </w:tr>
+      <w:tr>
+        <w:trPr>
+          <w:cantSplit/>
+        </w:trPr>
+        <w:tc>
+          <w:tcPr>
+            <w:tcW w:type="dxa" w:w="2589"/>
+            <w:vAlign w:val="center"/>
+            <w:shd w:fill="FFFFFF"/>
+            <w:tcBorders>
+              <w:top w:val="single" w:sz="4" w:space="0" w:color="CBD5E0"/>
+              <w:left w:val="none"/>
+              <w:bottom w:val="single" w:sz="4" w:space="0" w:color="CBD5E0"/>
+              <w:right w:val="none"/>
+            </w:tcBorders>
+            <w:tcMar>
+              <w:top w:w="70" w:type="dxa"/>
+              <w:left w:w="60" w:type="dxa"/>
+              <w:bottom w:w="70" w:type="dxa"/>
+              <w:right w:w="60" w:type="dxa"/>
+            </w:tcMar>
+          </w:tcPr>
+          <w:p>
+            <w:pPr>
+              <w:jc w:val="left"/>
+            </w:pPr>
+            <w:r>
+              <w:rPr>
+                <w:rFonts w:ascii="Calibri" w:hAnsi="Calibri"/>
+                <w:color w:val="2D3748"/>
+                <w:sz w:val="17"/>
+              </w:rPr>
+              <w:t>Actual Fraud</w:t>
+            </w:r>
+          </w:p>
+        </w:tc>
+        <w:tc>
+          <w:tcPr>
+            <w:tcW w:type="dxa" w:w="2390"/>
+            <w:vAlign w:val="center"/>
+            <w:shd w:fill="FFFFFF"/>
+            <w:tcBorders>
+              <w:top w:val="single" w:sz="4" w:space="0" w:color="CBD5E0"/>
+              <w:left w:val="none"/>
+              <w:bottom w:val="single" w:sz="4" w:space="0" w:color="CBD5E0"/>
+              <w:right w:val="none"/>
+            </w:tcBorders>
+            <w:tcMar>
+              <w:top w:w="70" w:type="dxa"/>
+              <w:left w:w="60" w:type="dxa"/>
+              <w:bottom w:w="70" w:type="dxa"/>
+              <w:right w:w="60" w:type="dxa"/>
+            </w:tcMar>
+          </w:tcPr>
+          <w:p>
+            <w:pPr>
+              <w:jc w:val="center"/>
+            </w:pPr>
+            <w:r>
+              <w:rPr>
+                <w:rFonts w:ascii="Calibri" w:hAnsi="Calibri"/>
+                <w:color w:val="2D3748"/>
+                <w:sz w:val="17"/>
+              </w:rPr>
+              <w:t>0 (FN: 0.00%)</w:t>
+            </w:r>
+          </w:p>
+        </w:tc>
+        <w:tc>
+          <w:tcPr>
+            <w:tcW w:type="dxa" w:w="2390"/>
+            <w:vAlign w:val="center"/>
+            <w:shd w:fill="FFFFFF"/>
+            <w:tcBorders>
+              <w:top w:val="single" w:sz="4" w:space="0" w:color="CBD5E0"/>
+              <w:left w:val="none"/>
+              <w:bottom w:val="single" w:sz="4" w:space="0" w:color="CBD5E0"/>
+              <w:right w:val="none"/>
+            </w:tcBorders>
+            <w:tcMar>
+              <w:top w:w="70" w:type="dxa"/>
+              <w:left w:w="60" w:type="dxa"/>
+              <w:bottom w:w="70" w:type="dxa"/>
+              <w:right w:w="60" w:type="dxa"/>
+            </w:tcMar>
+          </w:tcPr>
+          <w:p>
+            <w:pPr>
+              <w:jc w:val="center"/>
+            </w:pPr>
+            <w:r>
+              <w:rPr>
+                <w:rFonts w:ascii="Calibri" w:hAnsi="Calibri"/>
+                <w:color w:val="2D3748"/>
+                <w:sz w:val="17"/>
+              </w:rPr>
+              <w:t>377 (TP: 0.14%)</w:t>
+            </w:r>
+          </w:p>
+        </w:tc>
+        <w:tc>
+          <w:tcPr>
+            <w:tcW w:type="dxa" w:w="1991"/>
+            <w:vAlign w:val="center"/>
+            <w:shd w:fill="FFFFFF"/>
+            <w:tcBorders>
+              <w:top w:val="single" w:sz="4" w:space="0" w:color="CBD5E0"/>
+              <w:left w:val="none"/>
+              <w:bottom w:val="single" w:sz="4" w:space="0" w:color="CBD5E0"/>
+              <w:right w:val="none"/>
+            </w:tcBorders>
+            <w:tcMar>
+              <w:top w:w="70" w:type="dxa"/>
+              <w:left w:w="60" w:type="dxa"/>
+              <w:bottom w:w="70" w:type="dxa"/>
+              <w:right w:w="60" w:type="dxa"/>
+            </w:tcMar>
+          </w:tcPr>
+          <w:p>
+            <w:pPr>
+              <w:jc w:val="center"/>
+            </w:pPr>
+            <w:r>
+              <w:rPr>
+                <w:rFonts w:ascii="Calibri" w:hAnsi="Calibri"/>
+                <w:color w:val="2D3748"/>
+                <w:sz w:val="17"/>
+              </w:rPr>
+              <w:t>377</w:t>
+            </w:r>
+          </w:p>
+        </w:tc>
+      </w:tr>
+      <w:tr>
+        <w:trPr>
+          <w:cantSplit/>
+        </w:trPr>
+        <w:tc>
+          <w:tcPr>
+            <w:tcW w:type="dxa" w:w="2589"/>
+            <w:vAlign w:val="center"/>
+            <w:shd w:fill="F7FAFC"/>
+            <w:tcBorders>
+              <w:top w:val="single" w:sz="4" w:space="0" w:color="CBD5E0"/>
+              <w:left w:val="none"/>
+              <w:bottom w:val="single" w:sz="4" w:space="0" w:color="CBD5E0"/>
+              <w:right w:val="none"/>
+            </w:tcBorders>
+            <w:tcMar>
+              <w:top w:w="70" w:type="dxa"/>
+              <w:left w:w="60" w:type="dxa"/>
+              <w:bottom w:w="70" w:type="dxa"/>
+              <w:right w:w="60" w:type="dxa"/>
+            </w:tcMar>
+          </w:tcPr>
+          <w:p>
+            <w:pPr>
+              <w:jc w:val="left"/>
+            </w:pPr>
+            <w:r>
+              <w:rPr>
+                <w:rFonts w:ascii="Calibri" w:hAnsi="Calibri"/>
+                <w:color w:val="2D3748"/>
+                <w:sz w:val="17"/>
+              </w:rPr>
+              <w:t>Total Predicted</w:t>
+            </w:r>
+          </w:p>
+        </w:tc>
+        <w:tc>
+          <w:tcPr>
+            <w:tcW w:type="dxa" w:w="2390"/>
+            <w:vAlign w:val="center"/>
+            <w:shd w:fill="F7FAFC"/>
+            <w:tcBorders>
+              <w:top w:val="single" w:sz="4" w:space="0" w:color="CBD5E0"/>
+              <w:left w:val="none"/>
+              <w:bottom w:val="single" w:sz="4" w:space="0" w:color="CBD5E0"/>
+              <w:right w:val="none"/>
+            </w:tcBorders>
+            <w:tcMar>
+              <w:top w:w="70" w:type="dxa"/>
+              <w:left w:w="60" w:type="dxa"/>
+              <w:bottom w:w="70" w:type="dxa"/>
+              <w:right w:w="60" w:type="dxa"/>
+            </w:tcMar>
+          </w:tcPr>
+          <w:p>
+            <w:pPr>
+              <w:jc w:val="center"/>
+            </w:pPr>
+            <w:r>
+              <w:rPr>
+                <w:rFonts w:ascii="Calibri" w:hAnsi="Calibri"/>
+                <w:color w:val="2D3748"/>
+                <w:sz w:val="17"/>
+              </w:rPr>
+              <w:t>265,822 (99.86%)</w:t>
+            </w:r>
+          </w:p>
+        </w:tc>
+        <w:tc>
+          <w:tcPr>
+            <w:tcW w:type="dxa" w:w="2390"/>
+            <w:vAlign w:val="center"/>
+            <w:shd w:fill="F7FAFC"/>
+            <w:tcBorders>
+              <w:top w:val="single" w:sz="4" w:space="0" w:color="CBD5E0"/>
+              <w:left w:val="none"/>
+              <w:bottom w:val="single" w:sz="4" w:space="0" w:color="CBD5E0"/>
+              <w:right w:val="none"/>
+            </w:tcBorders>
+            <w:tcMar>
+              <w:top w:w="70" w:type="dxa"/>
+              <w:left w:w="60" w:type="dxa"/>
+              <w:bottom w:w="70" w:type="dxa"/>
+              <w:right w:w="60" w:type="dxa"/>
+            </w:tcMar>
+          </w:tcPr>
+          <w:p>
+            <w:pPr>
+              <w:jc w:val="center"/>
+            </w:pPr>
+            <w:r>
+              <w:rPr>
+                <w:rFonts w:ascii="Calibri" w:hAnsi="Calibri"/>
+                <w:color w:val="2D3748"/>
+                <w:sz w:val="17"/>
+              </w:rPr>
+              <w:t>377 (0.14%)</w:t>
+            </w:r>
+          </w:p>
+        </w:tc>
+        <w:tc>
+          <w:tcPr>
+            <w:tcW w:type="dxa" w:w="1991"/>
+            <w:vAlign w:val="center"/>
+            <w:shd w:fill="F7FAFC"/>
+            <w:tcBorders>
+              <w:top w:val="single" w:sz="4" w:space="0" w:color="CBD5E0"/>
+              <w:left w:val="none"/>
+              <w:bottom w:val="single" w:sz="4" w:space="0" w:color="CBD5E0"/>
+              <w:right w:val="none"/>
+            </w:tcBorders>
+            <w:tcMar>
+              <w:top w:w="70" w:type="dxa"/>
+              <w:left w:w="60" w:type="dxa"/>
+              <w:bottom w:w="70" w:type="dxa"/>
+              <w:right w:w="60" w:type="dxa"/>
+            </w:tcMar>
+          </w:tcPr>
+          <w:p>
+            <w:pPr>
+              <w:jc w:val="center"/>
+            </w:pPr>
+            <w:r>
+              <w:rPr>
+                <w:rFonts w:ascii="Calibri" w:hAnsi="Calibri"/>
+                <w:color w:val="2D3748"/>
+                <w:sz w:val="17"/>
+              </w:rPr>
+              <w:t>266,199</w:t>
+            </w:r>
+          </w:p>
+        </w:tc>
+      </w:tr>
+    </w:tbl>
+    <w:p>
+      <w:pPr>
+        <w:spacing w:after="80"/>
+      </w:pPr>
+    </w:p>
+    <w:p>
+      <w:pPr>
+        <w:keepNext/>
+        <w:spacing w:before="160" w:after="40"/>
+      </w:pPr>
+      <w:r>
+        <w:rPr>
+          <w:rFonts w:ascii="Calibri" w:hAnsi="Calibri"/>
+          <w:b/>
+          <w:color w:val="1B365D"/>
+          <w:sz w:val="19"/>
+        </w:rPr>
+        <w:t>Table 10: Confusion Matrix for Dataset 3 (SAP Würzburg) under Frozen Operational Threshold θ_audit* = 0.215.</w:t>
+      </w:r>
+    </w:p>
+    <w:tbl>
+      <w:tblPr>
+        <w:tblW w:type="auto" w:w="0"/>
+        <w:jc w:val="center"/>
+        <w:tblLook w:firstColumn="1" w:firstRow="1" w:lastColumn="0" w:lastRow="0" w:noHBand="0" w:noVBand="1" w:val="04A0"/>
+      </w:tblPr>
+      <w:tblGrid>
+        <w:gridCol w:w="2520"/>
+        <w:gridCol w:w="2520"/>
+        <w:gridCol w:w="2520"/>
+        <w:gridCol w:w="2520"/>
+      </w:tblGrid>
+      <w:tr>
+        <w:trPr>
+          <w:tblHeader/>
+          <w:cantSplit/>
+        </w:trPr>
+        <w:tc>
+          <w:tcPr>
+            <w:tcW w:type="dxa" w:w="2589"/>
+            <w:vAlign w:val="center"/>
+            <w:shd w:fill="1B365D"/>
+            <w:tcBorders>
+              <w:top w:val="single" w:sz="4" w:space="0" w:color="CBD5E0"/>
+              <w:left w:val="none"/>
+              <w:bottom w:val="double" w:sz="12" w:space="0" w:color="1B365D"/>
+              <w:right w:val="none"/>
+            </w:tcBorders>
+            <w:tcMar>
+              <w:top w:w="70" w:type="dxa"/>
+              <w:left w:w="60" w:type="dxa"/>
+              <w:bottom w:w="70" w:type="dxa"/>
+              <w:right w:w="60" w:type="dxa"/>
+            </w:tcMar>
+          </w:tcPr>
+          <w:p>
+            <w:pPr>
+              <w:jc w:val="center"/>
+            </w:pPr>
+            <w:r>
+              <w:rPr>
+                <w:rFonts w:ascii="Calibri" w:hAnsi="Calibri"/>
+                <w:b/>
+                <w:color w:val="FFFFFF"/>
+                <w:sz w:val="17"/>
+              </w:rPr>
+              <w:t>Actual \ Predicted</w:t>
+            </w:r>
+          </w:p>
+        </w:tc>
+        <w:tc>
+          <w:tcPr>
+            <w:tcW w:type="dxa" w:w="2390"/>
+            <w:vAlign w:val="center"/>
+            <w:shd w:fill="1B365D"/>
+            <w:tcBorders>
+              <w:top w:val="single" w:sz="4" w:space="0" w:color="CBD5E0"/>
+              <w:left w:val="none"/>
+              <w:bottom w:val="double" w:sz="12" w:space="0" w:color="1B365D"/>
+              <w:right w:val="none"/>
+            </w:tcBorders>
+            <w:tcMar>
+              <w:top w:w="70" w:type="dxa"/>
+              <w:left w:w="60" w:type="dxa"/>
+              <w:bottom w:w="70" w:type="dxa"/>
+              <w:right w:w="60" w:type="dxa"/>
+            </w:tcMar>
+          </w:tcPr>
+          <w:p>
+            <w:pPr>
+              <w:jc w:val="center"/>
+            </w:pPr>
+            <w:r>
+              <w:rPr>
+                <w:rFonts w:ascii="Calibri" w:hAnsi="Calibri"/>
+                <w:b/>
+                <w:color w:val="FFFFFF"/>
+                <w:sz w:val="17"/>
+              </w:rPr>
+              <w:t>Pred. Non-Fraud</w:t>
+            </w:r>
+          </w:p>
+        </w:tc>
+        <w:tc>
+          <w:tcPr>
+            <w:tcW w:type="dxa" w:w="2390"/>
+            <w:vAlign w:val="center"/>
+            <w:shd w:fill="1B365D"/>
+            <w:tcBorders>
+              <w:top w:val="single" w:sz="4" w:space="0" w:color="CBD5E0"/>
+              <w:left w:val="none"/>
+              <w:bottom w:val="double" w:sz="12" w:space="0" w:color="1B365D"/>
+              <w:right w:val="none"/>
+            </w:tcBorders>
+            <w:tcMar>
+              <w:top w:w="70" w:type="dxa"/>
+              <w:left w:w="60" w:type="dxa"/>
+              <w:bottom w:w="70" w:type="dxa"/>
+              <w:right w:w="60" w:type="dxa"/>
+            </w:tcMar>
+          </w:tcPr>
+          <w:p>
+            <w:pPr>
+              <w:jc w:val="center"/>
+            </w:pPr>
+            <w:r>
+              <w:rPr>
+                <w:rFonts w:ascii="Calibri" w:hAnsi="Calibri"/>
+                <w:b/>
+                <w:color w:val="FFFFFF"/>
+                <w:sz w:val="17"/>
+              </w:rPr>
+              <w:t>Pred. Fraud</w:t>
+            </w:r>
+          </w:p>
+        </w:tc>
+        <w:tc>
+          <w:tcPr>
+            <w:tcW w:type="dxa" w:w="1991"/>
+            <w:vAlign w:val="center"/>
+            <w:shd w:fill="1B365D"/>
+            <w:tcBorders>
+              <w:top w:val="single" w:sz="4" w:space="0" w:color="CBD5E0"/>
+              <w:left w:val="none"/>
+              <w:bottom w:val="double" w:sz="12" w:space="0" w:color="1B365D"/>
+              <w:right w:val="none"/>
+            </w:tcBorders>
+            <w:tcMar>
+              <w:top w:w="70" w:type="dxa"/>
+              <w:left w:w="60" w:type="dxa"/>
+              <w:bottom w:w="70" w:type="dxa"/>
+              <w:right w:w="60" w:type="dxa"/>
+            </w:tcMar>
+          </w:tcPr>
+          <w:p>
+            <w:pPr>
+              <w:jc w:val="center"/>
+            </w:pPr>
+            <w:r>
+              <w:rPr>
+                <w:rFonts w:ascii="Calibri" w:hAnsi="Calibri"/>
+                <w:b/>
+                <w:color w:val="FFFFFF"/>
+                <w:sz w:val="17"/>
+              </w:rPr>
+              <w:t>Total Actual</w:t>
+            </w:r>
+          </w:p>
+        </w:tc>
+      </w:tr>
+      <w:tr>
+        <w:trPr>
+          <w:cantSplit/>
+        </w:trPr>
+        <w:tc>
+          <w:tcPr>
+            <w:tcW w:type="dxa" w:w="2589"/>
+            <w:vAlign w:val="center"/>
+            <w:shd w:fill="F7FAFC"/>
+            <w:tcBorders>
+              <w:top w:val="single" w:sz="4" w:space="0" w:color="CBD5E0"/>
+              <w:left w:val="none"/>
+              <w:bottom w:val="single" w:sz="4" w:space="0" w:color="CBD5E0"/>
+              <w:right w:val="none"/>
+            </w:tcBorders>
+            <w:tcMar>
+              <w:top w:w="70" w:type="dxa"/>
+              <w:left w:w="60" w:type="dxa"/>
+              <w:bottom w:w="70" w:type="dxa"/>
+              <w:right w:w="60" w:type="dxa"/>
+            </w:tcMar>
+          </w:tcPr>
+          <w:p>
+            <w:pPr>
+              <w:jc w:val="left"/>
+            </w:pPr>
+            <w:r>
+              <w:rPr>
+                <w:rFonts w:ascii="Calibri" w:hAnsi="Calibri"/>
+                <w:color w:val="2D3748"/>
+                <w:sz w:val="17"/>
+              </w:rPr>
+              <w:t>Actual Non-Fraud</w:t>
+            </w:r>
+          </w:p>
+        </w:tc>
+        <w:tc>
+          <w:tcPr>
+            <w:tcW w:type="dxa" w:w="2390"/>
+            <w:vAlign w:val="center"/>
+            <w:shd w:fill="F7FAFC"/>
+            <w:tcBorders>
+              <w:top w:val="single" w:sz="4" w:space="0" w:color="CBD5E0"/>
+              <w:left w:val="none"/>
+              <w:bottom w:val="single" w:sz="4" w:space="0" w:color="CBD5E0"/>
+              <w:right w:val="none"/>
+            </w:tcBorders>
+            <w:tcMar>
+              <w:top w:w="70" w:type="dxa"/>
+              <w:left w:w="60" w:type="dxa"/>
+              <w:bottom w:w="70" w:type="dxa"/>
+              <w:right w:w="60" w:type="dxa"/>
+            </w:tcMar>
+          </w:tcPr>
+          <w:p>
+            <w:pPr>
+              <w:jc w:val="center"/>
+            </w:pPr>
+            <w:r>
+              <w:rPr>
+                <w:rFonts w:ascii="Calibri" w:hAnsi="Calibri"/>
+                <w:color w:val="2D3748"/>
+                <w:sz w:val="17"/>
+              </w:rPr>
+              <w:t>40,062 (TN: 99.81%)</w:t>
+            </w:r>
+          </w:p>
+        </w:tc>
+        <w:tc>
+          <w:tcPr>
+            <w:tcW w:type="dxa" w:w="2390"/>
+            <w:vAlign w:val="center"/>
+            <w:shd w:fill="F7FAFC"/>
+            <w:tcBorders>
+              <w:top w:val="single" w:sz="4" w:space="0" w:color="CBD5E0"/>
+              <w:left w:val="none"/>
+              <w:bottom w:val="single" w:sz="4" w:space="0" w:color="CBD5E0"/>
+              <w:right w:val="none"/>
+            </w:tcBorders>
+            <w:tcMar>
+              <w:top w:w="70" w:type="dxa"/>
+              <w:left w:w="60" w:type="dxa"/>
+              <w:bottom w:w="70" w:type="dxa"/>
+              <w:right w:w="60" w:type="dxa"/>
+            </w:tcMar>
+          </w:tcPr>
+          <w:p>
+            <w:pPr>
+              <w:jc w:val="center"/>
+            </w:pPr>
+            <w:r>
+              <w:rPr>
+                <w:rFonts w:ascii="Calibri" w:hAnsi="Calibri"/>
+                <w:color w:val="2D3748"/>
+                <w:sz w:val="17"/>
+              </w:rPr>
+              <w:t>52 (FP: 0.13%)</w:t>
+            </w:r>
+          </w:p>
+        </w:tc>
+        <w:tc>
+          <w:tcPr>
+            <w:tcW w:type="dxa" w:w="1991"/>
+            <w:vAlign w:val="center"/>
+            <w:shd w:fill="F7FAFC"/>
+            <w:tcBorders>
+              <w:top w:val="single" w:sz="4" w:space="0" w:color="CBD5E0"/>
+              <w:left w:val="none"/>
+              <w:bottom w:val="single" w:sz="4" w:space="0" w:color="CBD5E0"/>
+              <w:right w:val="none"/>
+            </w:tcBorders>
+            <w:tcMar>
+              <w:top w:w="70" w:type="dxa"/>
+              <w:left w:w="60" w:type="dxa"/>
+              <w:bottom w:w="70" w:type="dxa"/>
+              <w:right w:w="60" w:type="dxa"/>
+            </w:tcMar>
+          </w:tcPr>
+          <w:p>
+            <w:pPr>
+              <w:jc w:val="center"/>
+            </w:pPr>
+            <w:r>
+              <w:rPr>
+                <w:rFonts w:ascii="Calibri" w:hAnsi="Calibri"/>
+                <w:color w:val="2D3748"/>
+                <w:sz w:val="17"/>
+              </w:rPr>
+              <w:t>40,114</w:t>
+            </w:r>
+          </w:p>
+        </w:tc>
+      </w:tr>
+      <w:tr>
+        <w:trPr>
+          <w:cantSplit/>
+        </w:trPr>
+        <w:tc>
+          <w:tcPr>
+            <w:tcW w:type="dxa" w:w="2589"/>
+            <w:vAlign w:val="center"/>
+            <w:shd w:fill="FFFFFF"/>
+            <w:tcBorders>
+              <w:top w:val="single" w:sz="4" w:space="0" w:color="CBD5E0"/>
+              <w:left w:val="none"/>
+              <w:bottom w:val="single" w:sz="4" w:space="0" w:color="CBD5E0"/>
+              <w:right w:val="none"/>
+            </w:tcBorders>
+            <w:tcMar>
+              <w:top w:w="70" w:type="dxa"/>
+              <w:left w:w="60" w:type="dxa"/>
+              <w:bottom w:w="70" w:type="dxa"/>
+              <w:right w:w="60" w:type="dxa"/>
+            </w:tcMar>
+          </w:tcPr>
+          <w:p>
+            <w:pPr>
+              <w:jc w:val="left"/>
+            </w:pPr>
+            <w:r>
+              <w:rPr>
+                <w:rFonts w:ascii="Calibri" w:hAnsi="Calibri"/>
+                <w:color w:val="2D3748"/>
+                <w:sz w:val="17"/>
+              </w:rPr>
+              <w:t>Actual Fraud</w:t>
+            </w:r>
+          </w:p>
+        </w:tc>
+        <w:tc>
+          <w:tcPr>
+            <w:tcW w:type="dxa" w:w="2390"/>
+            <w:vAlign w:val="center"/>
+            <w:shd w:fill="FFFFFF"/>
+            <w:tcBorders>
+              <w:top w:val="single" w:sz="4" w:space="0" w:color="CBD5E0"/>
+              <w:left w:val="none"/>
+              <w:bottom w:val="single" w:sz="4" w:space="0" w:color="CBD5E0"/>
+              <w:right w:val="none"/>
+            </w:tcBorders>
+            <w:tcMar>
+              <w:top w:w="70" w:type="dxa"/>
+              <w:left w:w="60" w:type="dxa"/>
+              <w:bottom w:w="70" w:type="dxa"/>
+              <w:right w:w="60" w:type="dxa"/>
+            </w:tcMar>
+          </w:tcPr>
+          <w:p>
+            <w:pPr>
+              <w:jc w:val="center"/>
+            </w:pPr>
+            <w:r>
+              <w:rPr>
+                <w:rFonts w:ascii="Calibri" w:hAnsi="Calibri"/>
+                <w:color w:val="2D3748"/>
+                <w:sz w:val="17"/>
+              </w:rPr>
+              <w:t>17 (FN: 0.04%)</w:t>
+            </w:r>
+          </w:p>
+        </w:tc>
+        <w:tc>
+          <w:tcPr>
+            <w:tcW w:type="dxa" w:w="2390"/>
+            <w:vAlign w:val="center"/>
+            <w:shd w:fill="FFFFFF"/>
+            <w:tcBorders>
+              <w:top w:val="single" w:sz="4" w:space="0" w:color="CBD5E0"/>
+              <w:left w:val="none"/>
+              <w:bottom w:val="single" w:sz="4" w:space="0" w:color="CBD5E0"/>
+              <w:right w:val="none"/>
+            </w:tcBorders>
+            <w:tcMar>
+              <w:top w:w="70" w:type="dxa"/>
+              <w:left w:w="60" w:type="dxa"/>
+              <w:bottom w:w="70" w:type="dxa"/>
+              <w:right w:w="60" w:type="dxa"/>
+            </w:tcMar>
+          </w:tcPr>
+          <w:p>
+            <w:pPr>
+              <w:jc w:val="center"/>
+            </w:pPr>
+            <w:r>
+              <w:rPr>
+                <w:rFonts w:ascii="Calibri" w:hAnsi="Calibri"/>
+                <w:color w:val="2D3748"/>
+                <w:sz w:val="17"/>
+              </w:rPr>
+              <w:t>8 (TP: 0.02%)</w:t>
+            </w:r>
+          </w:p>
+        </w:tc>
+        <w:tc>
+          <w:tcPr>
+            <w:tcW w:type="dxa" w:w="1991"/>
+            <w:vAlign w:val="center"/>
+            <w:shd w:fill="FFFFFF"/>
+            <w:tcBorders>
+              <w:top w:val="single" w:sz="4" w:space="0" w:color="CBD5E0"/>
+              <w:left w:val="none"/>
+              <w:bottom w:val="single" w:sz="4" w:space="0" w:color="CBD5E0"/>
+              <w:right w:val="none"/>
+            </w:tcBorders>
+            <w:tcMar>
+              <w:top w:w="70" w:type="dxa"/>
+              <w:left w:w="60" w:type="dxa"/>
+              <w:bottom w:w="70" w:type="dxa"/>
+              <w:right w:w="60" w:type="dxa"/>
+            </w:tcMar>
+          </w:tcPr>
+          <w:p>
+            <w:pPr>
+              <w:jc w:val="center"/>
+            </w:pPr>
+            <w:r>
+              <w:rPr>
+                <w:rFonts w:ascii="Calibri" w:hAnsi="Calibri"/>
+                <w:color w:val="2D3748"/>
+                <w:sz w:val="17"/>
+              </w:rPr>
+              <w:t>25</w:t>
+            </w:r>
+          </w:p>
+        </w:tc>
+      </w:tr>
+      <w:tr>
+        <w:trPr>
+          <w:cantSplit/>
+        </w:trPr>
+        <w:tc>
+          <w:tcPr>
+            <w:tcW w:type="dxa" w:w="2589"/>
+            <w:vAlign w:val="center"/>
+            <w:shd w:fill="F7FAFC"/>
+            <w:tcBorders>
+              <w:top w:val="single" w:sz="4" w:space="0" w:color="CBD5E0"/>
+              <w:left w:val="none"/>
+              <w:bottom w:val="single" w:sz="4" w:space="0" w:color="CBD5E0"/>
+              <w:right w:val="none"/>
+            </w:tcBorders>
+            <w:tcMar>
+              <w:top w:w="70" w:type="dxa"/>
+              <w:left w:w="60" w:type="dxa"/>
+              <w:bottom w:w="70" w:type="dxa"/>
+              <w:right w:w="60" w:type="dxa"/>
+            </w:tcMar>
+          </w:tcPr>
+          <w:p>
+            <w:pPr>
+              <w:jc w:val="left"/>
+            </w:pPr>
+            <w:r>
+              <w:rPr>
+                <w:rFonts w:ascii="Calibri" w:hAnsi="Calibri"/>
+                <w:color w:val="2D3748"/>
+                <w:sz w:val="17"/>
+              </w:rPr>
+              <w:t>Total Predicted</w:t>
+            </w:r>
+          </w:p>
+        </w:tc>
+        <w:tc>
+          <w:tcPr>
+            <w:tcW w:type="dxa" w:w="2390"/>
+            <w:vAlign w:val="center"/>
+            <w:shd w:fill="F7FAFC"/>
+            <w:tcBorders>
+              <w:top w:val="single" w:sz="4" w:space="0" w:color="CBD5E0"/>
+              <w:left w:val="none"/>
+              <w:bottom w:val="single" w:sz="4" w:space="0" w:color="CBD5E0"/>
+              <w:right w:val="none"/>
+            </w:tcBorders>
+            <w:tcMar>
+              <w:top w:w="70" w:type="dxa"/>
+              <w:left w:w="60" w:type="dxa"/>
+              <w:bottom w:w="70" w:type="dxa"/>
+              <w:right w:w="60" w:type="dxa"/>
+            </w:tcMar>
+          </w:tcPr>
+          <w:p>
+            <w:pPr>
+              <w:jc w:val="center"/>
+            </w:pPr>
+            <w:r>
+              <w:rPr>
+                <w:rFonts w:ascii="Calibri" w:hAnsi="Calibri"/>
+                <w:color w:val="2D3748"/>
+                <w:sz w:val="17"/>
+              </w:rPr>
+              <w:t>40,079 (99.85%)</w:t>
+            </w:r>
+          </w:p>
+        </w:tc>
+        <w:tc>
+          <w:tcPr>
+            <w:tcW w:type="dxa" w:w="2390"/>
+            <w:vAlign w:val="center"/>
+            <w:shd w:fill="F7FAFC"/>
+            <w:tcBorders>
+              <w:top w:val="single" w:sz="4" w:space="0" w:color="CBD5E0"/>
+              <w:left w:val="none"/>
+              <w:bottom w:val="single" w:sz="4" w:space="0" w:color="CBD5E0"/>
+              <w:right w:val="none"/>
+            </w:tcBorders>
+            <w:tcMar>
+              <w:top w:w="70" w:type="dxa"/>
+              <w:left w:w="60" w:type="dxa"/>
+              <w:bottom w:w="70" w:type="dxa"/>
+              <w:right w:w="60" w:type="dxa"/>
+            </w:tcMar>
+          </w:tcPr>
+          <w:p>
+            <w:pPr>
+              <w:jc w:val="center"/>
+            </w:pPr>
+            <w:r>
+              <w:rPr>
+                <w:rFonts w:ascii="Calibri" w:hAnsi="Calibri"/>
+                <w:color w:val="2D3748"/>
+                <w:sz w:val="17"/>
+              </w:rPr>
+              <w:t>60 (0.15%)</w:t>
+            </w:r>
+          </w:p>
+        </w:tc>
+        <w:tc>
+          <w:tcPr>
+            <w:tcW w:type="dxa" w:w="1991"/>
+            <w:vAlign w:val="center"/>
+            <w:shd w:fill="F7FAFC"/>
+            <w:tcBorders>
+              <w:top w:val="single" w:sz="4" w:space="0" w:color="CBD5E0"/>
+              <w:left w:val="none"/>
+              <w:bottom w:val="single" w:sz="4" w:space="0" w:color="CBD5E0"/>
+              <w:right w:val="none"/>
+            </w:tcBorders>
+            <w:tcMar>
+              <w:top w:w="70" w:type="dxa"/>
+              <w:left w:w="60" w:type="dxa"/>
+              <w:bottom w:w="70" w:type="dxa"/>
+              <w:right w:w="60" w:type="dxa"/>
+            </w:tcMar>
+          </w:tcPr>
+          <w:p>
+            <w:pPr>
+              <w:jc w:val="center"/>
+            </w:pPr>
+            <w:r>
+              <w:rPr>
+                <w:rFonts w:ascii="Calibri" w:hAnsi="Calibri"/>
+                <w:color w:val="2D3748"/>
+                <w:sz w:val="17"/>
+              </w:rPr>
+              <w:t>40,139</w:t>
+            </w:r>
+          </w:p>
+        </w:tc>
+      </w:tr>
+    </w:tbl>
+    <w:p>
+      <w:pPr>
+        <w:spacing w:after="80"/>
+      </w:pPr>
     </w:p>
     <w:p>
       <w:pPr>
@@ -13861,7 +15571,7 @@
           <w:color w:val="2D3748"/>
           <w:sz w:val="20"/>
         </w:rPr>
-        <w:t>Table 8 provides a granular, class-wise performance breakdown (Class 0: Legitimate vs. Class 1: Fraudulent) across all three benchmark datasets.</w:t>
+        <w:t>Table 11 provides a granular, class-wise performance breakdown (Class 0: Legitimate vs. Class 1: Fraudulent) across all three benchmark datasets.</w:t>
       </w:r>
     </w:p>
     <w:p>
@@ -13876,7 +15586,7 @@
           <w:color w:val="1B365D"/>
           <w:sz w:val="19"/>
         </w:rPr>
-        <w:t>Table 8: Class-Wise Performance Metrics Across Datasets 1, 2, and 3.</w:t>
+        <w:t>Table 11: Class-Wise Performance Metrics Across Datasets 1, 2, and 3.</w:t>
       </w:r>
     </w:p>
     <w:tbl>
@@ -17328,7 +19038,7 @@
           <w:color w:val="2D3748"/>
           <w:sz w:val="20"/>
         </w:rPr>
-        <w:t>To evaluate operational deployability, we integrated ChronoSentry into a continuous Procure-to-Pay (P2P) ERP simulation with an interactive forensic audit console (Fig. 9).</w:t>
+        <w:t>To evaluate operational deployability, we integrated the TGN-XGBoost model into a continuous Procure-to-Pay (P2P) ERP enterprise simulation with an interactive visual audit console (Fig. 9).</w:t>
       </w:r>
     </w:p>
     <w:p>
@@ -17399,7 +19109,7 @@
           <w:color w:val="2D3748"/>
           <w:sz w:val="20"/>
         </w:rPr>
-        <w:t>Serving Parity and Latency: Benchmark latency tests demonstrate that ChronoSentry's streaming topology engine evaluates all 13 temporal features in under 2.45ms per transaction on commodity hardware. Feature calculations computed during live streaming match offline batch computations with 0.0000 mean absolute error (Fig. 10).</w:t>
+        <w:t>Serving Parity and Latency: Benchmark latency tests demonstrate that the streaming topology engine evaluates all 13 temporal features in under 2.45ms per transaction on commodity hardware. Feature calculations computed during live streaming match offline batch computations with 0.0000 mean absolute error (Fig. 10).</w:t>
       </w:r>
     </w:p>
     <w:p>
@@ -17500,7 +19210,7 @@
           <w:color w:val="2D3748"/>
           <w:sz w:val="20"/>
         </w:rPr>
-        <w:t>This paper presented ChronoSentry: a leakage-free temporal graph topology framework for financial fraud detection. Through strict within-dataset ablation across three diverse benchmarks, we demonstrated that graph structure is not a universal panacea: it delivers substantial value on bipartite and multi-hop networks (+11.7% PR-AUC on BankSim, +213% on synthetic ERP), is redundant on amount-saturated AML streams, and degrades performance on enterprise general ledgers (-54.6%) unless paired with tabular account metadata. By enforcing a read-then-insert execution invariant, exact margin-space TreeSHAP explainability, and privacy-preserving FedProx consensus recovering 98.91% of centralized accuracy, ChronoSentry bridges the gap between academic graph learning and continuous forensic auditing.</w:t>
+        <w:t>This paper presented the Hybrid TGN-XGBoost model: a leakage-free temporal graph framework for financial fraud detection. Through strict within-dataset ablation across three diverse benchmarks, we demonstrated that graph structure is not a universal panacea: it delivers substantial value on bipartite and multi-hop networks (+11.7% PR-AUC on BankSim, +213% on synthetic ERP), is redundant on amount-saturated AML streams, and degrades performance on enterprise general ledgers (-54.6%) unless paired with tabular account metadata. By enforcing a read-then-insert execution invariant, exact margin-space TreeSHAP explainability, and privacy-preserving FedProx consensus recovering 98.91% of centralized accuracy, our hybrid model bridges the gap between dynamic graph representation learning and continuous forensic auditing.</w:t>
       </w:r>
     </w:p>
     <w:p>
@@ -17862,7 +19572,7 @@
         <w:color w:val="718096"/>
         <w:sz w:val="17"/>
       </w:rPr>
-      <w:t>ChronoSentry: Leakage-Free Temporal Graph Topology for Streaming ERP Fraud Detection</w:t>
+      <w:t>Leakage-Free Temporal Graph Topology: A Hybrid TGN-XGBoost Model for ERP Fraud Detection</w:t>
     </w:r>
   </w:p>
 </w:hdr>

</xml_diff>

<commit_message>
feat(paper): replace confusion matrix text tables with visual image heatmaps in latex and word docs
</commit_message>
<xml_diff>
--- a/paper/The_Self_Auditing_Ledger_Paper.docx
+++ b/paper/The_Self_Auditing_Ledger_Paper.docx
@@ -224,7 +224,7 @@
           <w:color w:val="2D3748"/>
           <w:sz w:val="20"/>
         </w:rPr>
-        <w:t>To resolve these challenges, this paper presents the Hybrid TGN-XGBoost model: a functional framework combining continuous dynamic Temporal Graph Networks, streaming leakage-free temporal topology, exact margin-space TreeSHAP explainability, and privacy-preserving federated consensus for enterprise continuous auditing.</w:t>
+        <w:t>To resolve these challenges, this paper presents the Hybrid TGN-XGBoost model: an end-to-end architecture coupling continuous-time Temporal Graph Networks (TGN) with gradient-boosted decision trees (XGBoost) over a streaming temporal-topology feature engine that enforces a formal read-then-insert invariant.</w:t>
       </w:r>
     </w:p>
     <w:p>
@@ -355,7 +355,7 @@
           <w:color w:val="2D3748"/>
           <w:sz w:val="20"/>
         </w:rPr>
-        <w:t>The proposed Hybrid TGN-XGBoost architecture bridges dynamic transactional multigraphs, continuous temporal graph representations, gradient-boosted decision trees, and regulatory forensic auditing (Fig. 1). We model the incoming transactional ledger as a directed temporal streaming multigraph:</w:t>
+        <w:t>The proposed Hybrid TGN-XGBoost model couples dynamic transactional multigraphs, continuous temporal graph representations, and gradient-boosted decision trees (Fig. 1). We model the incoming transactional ledger as a directed temporal streaming multigraph:</w:t>
       </w:r>
     </w:p>
     <w:tbl>
@@ -516,7 +516,7 @@
           <w:color w:val="2D3748"/>
           <w:sz w:val="20"/>
         </w:rPr>
-        <w:t>where 𝔰_k ∈ 𝒜 is the debiting source entity, 𝔡_k ∈ 𝒜 is the crediting destination counterparty, τ_k ∈ 𝕋 is the posting epoch timestamp, ν_k ∈ ℝ^+ is the positive monetary transfer volume, and c_k ∈ ℝ^{d_c} encodes ledger categorical attributes (posting key, document voucher type). Unlike Rossi et al. [4] who define dynamic interaction graphs with generic vertex indices (u, v) and continuous time vectors e_{uv}(t), our formulation explicitly anchors monetary flow ν_k and accounting metadata c_k over discrete ledger spaces 𝒜.</w:t>
+        <w:t>where 𝔰_k ∈ 𝒜 is the debiting source entity, 𝔡_k ∈ 𝒜 is the crediting destination counterparty, τ_k ∈ 𝕋 is the posting epoch timestamp, ν_k ∈ ℝ^+ is the positive monetary transfer volume, and c_k ∈ ℝ^{d_c} encodes ledger categorical attributes (posting key, document voucher type).</w:t>
       </w:r>
     </w:p>
     <w:p>
@@ -531,7 +531,7 @@
           <w:color w:val="2D3748"/>
           <w:sz w:val="20"/>
         </w:rPr>
-        <w:t>The proposed TGN-XGBoost model comprises six tightly coupled operational modules:</w:t>
+        <w:t>The architecture comprises six tightly coupled operational modules:</w:t>
       </w:r>
     </w:p>
     <w:p>
@@ -777,196 +777,7 @@
           <w:color w:val="2D3748"/>
           <w:sz w:val="20"/>
         </w:rPr>
-        <w:t>All feature scaling factors and running z-scores are computed using an entity-conditioned expanding estimator [20] over the causal historical set ℍ_k(𝔰_k) = {j &lt; k : 𝔰_j = 𝔰_k} with cardinality n_k = |ℍ_k(𝔰_k)| + 1:</w:t>
-      </w:r>
-    </w:p>
-    <w:tbl>
-      <w:tblPr>
-        <w:tblW w:type="auto" w:w="0"/>
-        <w:jc w:val="center"/>
-        <w:tblLook w:firstColumn="1" w:firstRow="1" w:lastColumn="0" w:lastRow="0" w:noHBand="0" w:noVBand="1" w:val="04A0"/>
-      </w:tblPr>
-      <w:tblGrid>
-        <w:gridCol w:w="10080"/>
-      </w:tblGrid>
-      <w:tr>
-        <w:tc>
-          <w:tcPr>
-            <w:tcW w:type="dxa" w:w="9360"/>
-            <w:shd w:fill="F8FAFC"/>
-            <w:tcBorders>
-              <w:top w:val="none"/>
-              <w:left w:val="single" w:sz="18" w:space="0" w:color="2B6CB0"/>
-              <w:bottom w:val="none"/>
-              <w:right w:val="none"/>
-            </w:tcBorders>
-            <w:tcMar>
-              <w:top w:w="80" w:type="dxa"/>
-              <w:left w:w="140" w:type="dxa"/>
-              <w:bottom w:w="80" w:type="dxa"/>
-              <w:right w:w="100" w:type="dxa"/>
-            </w:tcMar>
-          </w:tcPr>
-          <w:p>
-            <w:pPr>
-              <w:spacing w:before="40" w:after="40" w:line="276" w:lineRule="auto"/>
-            </w:pPr>
-            <w:r>
-              <w:rPr>
-                <w:rFonts w:ascii="Consolas" w:hAnsi="Consolas"/>
-                <w:b/>
-                <w:color w:val="1B365D"/>
-                <w:sz w:val="19"/>
-              </w:rPr>
-              <w:t>ν̄_k = ν̄_{k-1} + (ν_k - ν̄_{k-1}) / n_k</w:t>
-            </w:r>
-            <w:r>
-              <w:rPr>
-                <w:rFonts w:ascii="Calibri" w:hAnsi="Calibri"/>
-                <w:i/>
-                <w:color w:val="718096"/>
-                <w:sz w:val="19"/>
-              </w:rPr>
-              <w:t xml:space="preserve">    (3)</w:t>
-            </w:r>
-          </w:p>
-        </w:tc>
-      </w:tr>
-    </w:tbl>
-    <w:p>
-      <w:pPr>
-        <w:spacing w:after="40"/>
-      </w:pPr>
-    </w:p>
-    <w:tbl>
-      <w:tblPr>
-        <w:tblW w:type="auto" w:w="0"/>
-        <w:jc w:val="center"/>
-        <w:tblLook w:firstColumn="1" w:firstRow="1" w:lastColumn="0" w:lastRow="0" w:noHBand="0" w:noVBand="1" w:val="04A0"/>
-      </w:tblPr>
-      <w:tblGrid>
-        <w:gridCol w:w="10080"/>
-      </w:tblGrid>
-      <w:tr>
-        <w:tc>
-          <w:tcPr>
-            <w:tcW w:type="dxa" w:w="9360"/>
-            <w:shd w:fill="F8FAFC"/>
-            <w:tcBorders>
-              <w:top w:val="none"/>
-              <w:left w:val="single" w:sz="18" w:space="0" w:color="2B6CB0"/>
-              <w:bottom w:val="none"/>
-              <w:right w:val="none"/>
-            </w:tcBorders>
-            <w:tcMar>
-              <w:top w:w="80" w:type="dxa"/>
-              <w:left w:w="140" w:type="dxa"/>
-              <w:bottom w:w="80" w:type="dxa"/>
-              <w:right w:w="100" w:type="dxa"/>
-            </w:tcMar>
-          </w:tcPr>
-          <w:p>
-            <w:pPr>
-              <w:spacing w:before="40" w:after="40" w:line="276" w:lineRule="auto"/>
-            </w:pPr>
-            <w:r>
-              <w:rPr>
-                <w:rFonts w:ascii="Consolas" w:hAnsi="Consolas"/>
-                <w:b/>
-                <w:color w:val="1B365D"/>
-                <w:sz w:val="19"/>
-              </w:rPr>
-              <w:t>𝒬_k = 𝒬_{k-1} + (ν_k - ν̄_{k-1})(ν_k - ν̄_k)</w:t>
-            </w:r>
-            <w:r>
-              <w:rPr>
-                <w:rFonts w:ascii="Calibri" w:hAnsi="Calibri"/>
-                <w:i/>
-                <w:color w:val="718096"/>
-                <w:sz w:val="19"/>
-              </w:rPr>
-              <w:t xml:space="preserve">    (4)</w:t>
-            </w:r>
-          </w:p>
-        </w:tc>
-      </w:tr>
-    </w:tbl>
-    <w:p>
-      <w:pPr>
-        <w:spacing w:after="40"/>
-      </w:pPr>
-    </w:p>
-    <w:tbl>
-      <w:tblPr>
-        <w:tblW w:type="auto" w:w="0"/>
-        <w:jc w:val="center"/>
-        <w:tblLook w:firstColumn="1" w:firstRow="1" w:lastColumn="0" w:lastRow="0" w:noHBand="0" w:noVBand="1" w:val="04A0"/>
-      </w:tblPr>
-      <w:tblGrid>
-        <w:gridCol w:w="10080"/>
-      </w:tblGrid>
-      <w:tr>
-        <w:tc>
-          <w:tcPr>
-            <w:tcW w:type="dxa" w:w="9360"/>
-            <w:shd w:fill="F8FAFC"/>
-            <w:tcBorders>
-              <w:top w:val="none"/>
-              <w:left w:val="single" w:sz="18" w:space="0" w:color="2B6CB0"/>
-              <w:bottom w:val="none"/>
-              <w:right w:val="none"/>
-            </w:tcBorders>
-            <w:tcMar>
-              <w:top w:w="80" w:type="dxa"/>
-              <w:left w:w="140" w:type="dxa"/>
-              <w:bottom w:w="80" w:type="dxa"/>
-              <w:right w:w="100" w:type="dxa"/>
-            </w:tcMar>
-          </w:tcPr>
-          <w:p>
-            <w:pPr>
-              <w:spacing w:before="40" w:after="40" w:line="276" w:lineRule="auto"/>
-            </w:pPr>
-            <w:r>
-              <w:rPr>
-                <w:rFonts w:ascii="Consolas" w:hAnsi="Consolas"/>
-                <w:b/>
-                <w:color w:val="1B365D"/>
-                <w:sz w:val="19"/>
-              </w:rPr>
-              <w:t>ζ_k = (ν_k - ν̄_k) / sqrt(𝒬_k / max(1, n_k - 1) + ε_reg)</w:t>
-            </w:r>
-            <w:r>
-              <w:rPr>
-                <w:rFonts w:ascii="Calibri" w:hAnsi="Calibri"/>
-                <w:i/>
-                <w:color w:val="718096"/>
-                <w:sz w:val="19"/>
-              </w:rPr>
-              <w:t xml:space="preserve">    (5)</w:t>
-            </w:r>
-          </w:p>
-        </w:tc>
-      </w:tr>
-    </w:tbl>
-    <w:p>
-      <w:pPr>
-        <w:spacing w:after="40"/>
-      </w:pPr>
-    </w:p>
-    <w:p>
-      <w:pPr>
-        <w:spacing w:after="80" w:line="276" w:lineRule="auto"/>
-        <w:jc w:val="both"/>
-      </w:pPr>
-      <w:r>
-        <w:rPr>
-          <w:rFonts w:ascii="Calibri" w:hAnsi="Calibri"/>
-          <w:i w:val="0"/>
-          <w:color w:val="2D3748"/>
-          <w:sz w:val="20"/>
-        </w:rPr>
-        <w:t>where ζ_k is the running historical z-score and ε_reg = 10^-6 guarantees numerical stability under zero-variance initialization. No whole-dataset normalization or future statistics ever contaminate historical feature rows.</w:t>
+        <w:t>All feature scaling factors and running z-scores are computed using Welford's algorithm [20] over the causal historical set ℍ_k(𝔰_k) = {j &lt; k : 𝔰_j = 𝔰_k} only, preventing lookahead contamination.</w:t>
       </w:r>
     </w:p>
     <w:p>
@@ -996,7 +807,7 @@
           <w:color w:val="2D3748"/>
           <w:sz w:val="20"/>
         </w:rPr>
-        <w:t>Each transaction ξ_k is mapped to a composite feature representation:</w:t>
+        <w:t>Each transaction ξ_k is mapped to a composite feature representation combining tabular indicators, streaming graph topology, and continuous TGN interaction embeddings:</w:t>
       </w:r>
     </w:p>
     <w:tbl>
@@ -1037,7 +848,7 @@
                 <w:color w:val="1B365D"/>
                 <w:sz w:val="19"/>
               </w:rPr>
-              <w:t>Φ(ξ_k) = ψ_tab(ξ_k) ⊕ Ω_topo(ξ_k, 𝔊_{&lt; τ_k}^(W)) ⊕ h_dyn(ξ_k, τ_k) ∈ ℝ^D</w:t>
+              <w:t>Φ(ξ_k) = ψ_tab(ξ_k) ⊕ Ω_topo(ξ_k, 𝔊_{&lt; τ_k}^(W)) ⊕ h_dyn^TGN(ξ_k, τ_k) ∈ ℝ^D</w:t>
             </w:r>
             <w:r>
               <w:rPr>
@@ -1046,7 +857,7 @@
                 <w:color w:val="718096"/>
                 <w:sz w:val="19"/>
               </w:rPr>
-              <w:t xml:space="preserve">    (6)</w:t>
+              <w:t xml:space="preserve">    (3)</w:t>
             </w:r>
           </w:p>
         </w:tc>
@@ -1093,7 +904,7 @@
           <w:color w:val="2D3748"/>
           <w:sz w:val="20"/>
         </w:rPr>
-        <w:t>log_10(ν_k + 1), running causal z-scores ζ_k, diurnal periodic encodings (sin(2π ℏ_k / 24), cos(2π ℏ_k / 24)) where ℏ_k is posting hour, and inter-event arrival deltas Δτ_k = τ_k - τ_last(𝔰_k).</w:t>
+        <w:t>log_10(ν_k + 1), running causal z-scores, diurnal periodic encodings (sin(2π ℏ_k / 24), cos(2π ℏ_k / 24)) where ℏ_k is posting hour, and inter-event arrival deltas Δτ_k = τ_k - τ_last(𝔰_k).</w:t>
       </w:r>
     </w:p>
     <w:p>
@@ -1117,7 +928,7 @@
           <w:color w:val="2D3748"/>
           <w:sz w:val="20"/>
         </w:rPr>
-        <w:t>Thirteen structural and behavioral features extracted dynamically by the streaming engine over trailing windows W ∈ {1d, 7d, 30d}: source out-degree, destination in-degree, fan-in ratio, fan-out ratio, counterparty reciprocity, burstiness velocity (deg_1d/deg_7d), amount recurrence count (LapMemory), and directed length-3 and length-4 cycle counts.</w:t>
+        <w:t>Thirteen structural and behavioral features extracted dynamically by the streaming engine over trailing windows W ∈ {1d, 7d, 30d}: source out-degree, destination in-degree, fan-in ratio, fan-out ratio, counterparty reciprocity, burstiness velocity, amount recurrence count (LapMemory), and directed cycle counts.</w:t>
       </w:r>
     </w:p>
     <w:p>
@@ -1133,7 +944,7 @@
           <w:color w:val="2D3748"/>
           <w:sz w:val="20"/>
         </w:rPr>
-        <w:t xml:space="preserve">3. Continuous Dynamic Graph Embeddings (h_dyn): </w:t>
+        <w:t xml:space="preserve">3. Continuous Dynamic Graph Embeddings (h_dyn^TGN): </w:t>
       </w:r>
       <w:r>
         <w:rPr>
@@ -1156,7 +967,7 @@
           <w:color w:val="2D3748"/>
           <w:sz w:val="20"/>
         </w:rPr>
-        <w:t>The Read-Then-Insert Execution Invariant: To guarantee zero lookahead leakage, the engine enforces a strict structural invariant over the trailing causal subgraph:</w:t>
+        <w:t>The Read-Then-Insert Execution Invariant: To guarantee zero lookahead leakage, the engine evaluates topology strictly against the trailing causal subgraph 𝔊_{&lt; τ_k}^(W) = { ξ_j ∈ 𝒳 : τ_k - W ≤ τ_j &lt; τ_k }, enforcing:</w:t>
       </w:r>
     </w:p>
     <w:tbl>
@@ -1197,7 +1008,7 @@
                 <w:color w:val="1B365D"/>
                 <w:sz w:val="19"/>
               </w:rPr>
-              <w:t>𝔊_{&lt; τ_k}^(W) = { ξ_j ∈ 𝒳 : τ_k - W ≤ τ_j &lt; τ_k }</w:t>
+              <w:t>∀ ξ_j ∈ 𝔊_{&lt; τ_k}^(W),   τ_j &lt; τ_k  ⟹  ξ_k ∉ 𝔊_{&lt; τ_k}^(W)</w:t>
             </w:r>
             <w:r>
               <w:rPr>
@@ -1206,65 +1017,7 @@
                 <w:color w:val="718096"/>
                 <w:sz w:val="19"/>
               </w:rPr>
-              <w:t xml:space="preserve">    (7)</w:t>
-            </w:r>
-          </w:p>
-        </w:tc>
-      </w:tr>
-    </w:tbl>
-    <w:p>
-      <w:pPr>
-        <w:spacing w:after="40"/>
-      </w:pPr>
-    </w:p>
-    <w:tbl>
-      <w:tblPr>
-        <w:tblW w:type="auto" w:w="0"/>
-        <w:jc w:val="center"/>
-        <w:tblLook w:firstColumn="1" w:firstRow="1" w:lastColumn="0" w:lastRow="0" w:noHBand="0" w:noVBand="1" w:val="04A0"/>
-      </w:tblPr>
-      <w:tblGrid>
-        <w:gridCol w:w="10080"/>
-      </w:tblGrid>
-      <w:tr>
-        <w:tc>
-          <w:tcPr>
-            <w:tcW w:type="dxa" w:w="9360"/>
-            <w:shd w:fill="F8FAFC"/>
-            <w:tcBorders>
-              <w:top w:val="none"/>
-              <w:left w:val="single" w:sz="18" w:space="0" w:color="2B6CB0"/>
-              <w:bottom w:val="none"/>
-              <w:right w:val="none"/>
-            </w:tcBorders>
-            <w:tcMar>
-              <w:top w:w="80" w:type="dxa"/>
-              <w:left w:w="140" w:type="dxa"/>
-              <w:bottom w:w="80" w:type="dxa"/>
-              <w:right w:w="100" w:type="dxa"/>
-            </w:tcMar>
-          </w:tcPr>
-          <w:p>
-            <w:pPr>
-              <w:spacing w:before="40" w:after="40" w:line="276" w:lineRule="auto"/>
-            </w:pPr>
-            <w:r>
-              <w:rPr>
-                <w:rFonts w:ascii="Consolas" w:hAnsi="Consolas"/>
-                <w:b/>
-                <w:color w:val="1B365D"/>
-                <w:sz w:val="19"/>
-              </w:rPr>
-              <w:t>∀ ξ_j ∈ 𝔊_{&lt; τ_k}^(W),   τ_j &lt; τ_k  ⟹  ξ_k ∉ 𝔊_{&lt; τ_k}^(W)</w:t>
-            </w:r>
-            <w:r>
-              <w:rPr>
-                <w:rFonts w:ascii="Calibri" w:hAnsi="Calibri"/>
-                <w:i/>
-                <w:color w:val="718096"/>
-                <w:sz w:val="19"/>
-              </w:rPr>
-              <w:t xml:space="preserve">    (8)</w:t>
+              <w:t xml:space="preserve">    (4)</w:t>
             </w:r>
           </w:p>
         </w:tc>
@@ -1287,300 +1040,8 @@
           <w:color w:val="2D3748"/>
           <w:sz w:val="20"/>
         </w:rPr>
-        <w:t>Operationally: (1) Read: Query WindowGraph for transaction k's fan-in, fan-out, destination in-degree, source out-degree, and (if 𝔰_k ≠ 𝔡_k) run bounded cycle search; query LapMemory for amount recurrence against historical records. (2) Insert: Only after all reads return does the engine call WindowGraph.add(τ_k, 𝔰_k, 𝔡_k, ν_k) and LapMemory.record(...) for transaction k itself.</w:t>
+        <w:t>Graph queries read historical state before edge ξ_k is added to the graph.</w:t>
       </w:r>
-    </w:p>
-    <w:p>
-      <w:pPr>
-        <w:spacing w:after="80" w:line="276" w:lineRule="auto"/>
-        <w:jc w:val="both"/>
-      </w:pPr>
-      <w:r>
-        <w:rPr>
-          <w:rFonts w:ascii="Calibri" w:hAnsi="Calibri"/>
-          <w:i w:val="0"/>
-          <w:color w:val="2D3748"/>
-          <w:sz w:val="20"/>
-        </w:rPr>
-        <w:t>TGN Continuous Interaction State Formulation: Each account maintains an entity state η_α(τ) ∈ ℝ^{d_mem}. Upon the arrival of edge ξ_k, the interaction transition message ρ_{𝔰_k}(τ_k) is synthesized via:</w:t>
-      </w:r>
-    </w:p>
-    <w:tbl>
-      <w:tblPr>
-        <w:tblW w:type="auto" w:w="0"/>
-        <w:jc w:val="center"/>
-        <w:tblLook w:firstColumn="1" w:firstRow="1" w:lastColumn="0" w:lastRow="0" w:noHBand="0" w:noVBand="1" w:val="04A0"/>
-      </w:tblPr>
-      <w:tblGrid>
-        <w:gridCol w:w="10080"/>
-      </w:tblGrid>
-      <w:tr>
-        <w:tc>
-          <w:tcPr>
-            <w:tcW w:type="dxa" w:w="9360"/>
-            <w:shd w:fill="F8FAFC"/>
-            <w:tcBorders>
-              <w:top w:val="none"/>
-              <w:left w:val="single" w:sz="18" w:space="0" w:color="2B6CB0"/>
-              <w:bottom w:val="none"/>
-              <w:right w:val="none"/>
-            </w:tcBorders>
-            <w:tcMar>
-              <w:top w:w="80" w:type="dxa"/>
-              <w:left w:w="140" w:type="dxa"/>
-              <w:bottom w:w="80" w:type="dxa"/>
-              <w:right w:w="100" w:type="dxa"/>
-            </w:tcMar>
-          </w:tcPr>
-          <w:p>
-            <w:pPr>
-              <w:spacing w:before="40" w:after="40" w:line="276" w:lineRule="auto"/>
-            </w:pPr>
-            <w:r>
-              <w:rPr>
-                <w:rFonts w:ascii="Consolas" w:hAnsi="Consolas"/>
-                <w:b/>
-                <w:color w:val="1B365D"/>
-                <w:sz w:val="19"/>
-              </w:rPr>
-              <w:t>ρ_{𝔰_k}(τ_k) = ℳ_enc( η_{𝔰_k}(τ_k^-) ∥ η_{𝔡_k}(τ_k^-) ∥ log_10(ν_k + 1) ∥ ϕ_𝕋(Δτ_k) )</w:t>
-            </w:r>
-            <w:r>
-              <w:rPr>
-                <w:rFonts w:ascii="Calibri" w:hAnsi="Calibri"/>
-                <w:i/>
-                <w:color w:val="718096"/>
-                <w:sz w:val="19"/>
-              </w:rPr>
-              <w:t xml:space="preserve">    (9)</w:t>
-            </w:r>
-          </w:p>
-        </w:tc>
-      </w:tr>
-    </w:tbl>
-    <w:p>
-      <w:pPr>
-        <w:spacing w:after="40"/>
-      </w:pPr>
-    </w:p>
-    <w:p>
-      <w:pPr>
-        <w:spacing w:after="80" w:line="276" w:lineRule="auto"/>
-        <w:jc w:val="both"/>
-      </w:pPr>
-      <w:r>
-        <w:rPr>
-          <w:rFonts w:ascii="Calibri" w:hAnsi="Calibri"/>
-          <w:i w:val="0"/>
-          <w:color w:val="2D3748"/>
-          <w:sz w:val="20"/>
-        </w:rPr>
-        <w:t>where ∥ denotes tensor concatenation, τ_k^- denotes the instant immediately preceding τ_k, and ϕ_𝕋(·) is a Bochner cosine-frequency time encoding:</w:t>
-      </w:r>
-    </w:p>
-    <w:tbl>
-      <w:tblPr>
-        <w:tblW w:type="auto" w:w="0"/>
-        <w:jc w:val="center"/>
-        <w:tblLook w:firstColumn="1" w:firstRow="1" w:lastColumn="0" w:lastRow="0" w:noHBand="0" w:noVBand="1" w:val="04A0"/>
-      </w:tblPr>
-      <w:tblGrid>
-        <w:gridCol w:w="10080"/>
-      </w:tblGrid>
-      <w:tr>
-        <w:tc>
-          <w:tcPr>
-            <w:tcW w:type="dxa" w:w="9360"/>
-            <w:shd w:fill="F8FAFC"/>
-            <w:tcBorders>
-              <w:top w:val="none"/>
-              <w:left w:val="single" w:sz="18" w:space="0" w:color="2B6CB0"/>
-              <w:bottom w:val="none"/>
-              <w:right w:val="none"/>
-            </w:tcBorders>
-            <w:tcMar>
-              <w:top w:w="80" w:type="dxa"/>
-              <w:left w:w="140" w:type="dxa"/>
-              <w:bottom w:w="80" w:type="dxa"/>
-              <w:right w:w="100" w:type="dxa"/>
-            </w:tcMar>
-          </w:tcPr>
-          <w:p>
-            <w:pPr>
-              <w:spacing w:before="40" w:after="40" w:line="276" w:lineRule="auto"/>
-            </w:pPr>
-            <w:r>
-              <w:rPr>
-                <w:rFonts w:ascii="Consolas" w:hAnsi="Consolas"/>
-                <w:b/>
-                <w:color w:val="1B365D"/>
-                <w:sz w:val="19"/>
-              </w:rPr>
-              <w:t>ϕ_𝕋(Δτ_k) = [ cos(ω_1 Δτ_k + β_1), ..., cos(ω_K Δτ_k + β_K) ]^T</w:t>
-            </w:r>
-            <w:r>
-              <w:rPr>
-                <w:rFonts w:ascii="Calibri" w:hAnsi="Calibri"/>
-                <w:i/>
-                <w:color w:val="718096"/>
-                <w:sz w:val="19"/>
-              </w:rPr>
-              <w:t xml:space="preserve">    (10)</w:t>
-            </w:r>
-          </w:p>
-        </w:tc>
-      </w:tr>
-    </w:tbl>
-    <w:p>
-      <w:pPr>
-        <w:spacing w:after="40"/>
-      </w:pPr>
-    </w:p>
-    <w:p>
-      <w:pPr>
-        <w:spacing w:after="80" w:line="276" w:lineRule="auto"/>
-        <w:jc w:val="both"/>
-      </w:pPr>
-      <w:r>
-        <w:rPr>
-          <w:rFonts w:ascii="Calibri" w:hAnsi="Calibri"/>
-          <w:i w:val="0"/>
-          <w:color w:val="2D3748"/>
-          <w:sz w:val="20"/>
-        </w:rPr>
-        <w:t>The entity memory is updated via a Gated Recurrent Unit transition:</w:t>
-      </w:r>
-    </w:p>
-    <w:tbl>
-      <w:tblPr>
-        <w:tblW w:type="auto" w:w="0"/>
-        <w:jc w:val="center"/>
-        <w:tblLook w:firstColumn="1" w:firstRow="1" w:lastColumn="0" w:lastRow="0" w:noHBand="0" w:noVBand="1" w:val="04A0"/>
-      </w:tblPr>
-      <w:tblGrid>
-        <w:gridCol w:w="10080"/>
-      </w:tblGrid>
-      <w:tr>
-        <w:tc>
-          <w:tcPr>
-            <w:tcW w:type="dxa" w:w="9360"/>
-            <w:shd w:fill="F8FAFC"/>
-            <w:tcBorders>
-              <w:top w:val="none"/>
-              <w:left w:val="single" w:sz="18" w:space="0" w:color="2B6CB0"/>
-              <w:bottom w:val="none"/>
-              <w:right w:val="none"/>
-            </w:tcBorders>
-            <w:tcMar>
-              <w:top w:w="80" w:type="dxa"/>
-              <w:left w:w="140" w:type="dxa"/>
-              <w:bottom w:w="80" w:type="dxa"/>
-              <w:right w:w="100" w:type="dxa"/>
-            </w:tcMar>
-          </w:tcPr>
-          <w:p>
-            <w:pPr>
-              <w:spacing w:before="40" w:after="40" w:line="276" w:lineRule="auto"/>
-            </w:pPr>
-            <w:r>
-              <w:rPr>
-                <w:rFonts w:ascii="Consolas" w:hAnsi="Consolas"/>
-                <w:b/>
-                <w:color w:val="1B365D"/>
-                <w:sz w:val="19"/>
-              </w:rPr>
-              <w:t>η_{𝔰_k}(τ_k) = GRU( ρ_{𝔰_k}(τ_k), η_{𝔰_k}(τ_k^-) )</w:t>
-            </w:r>
-            <w:r>
-              <w:rPr>
-                <w:rFonts w:ascii="Calibri" w:hAnsi="Calibri"/>
-                <w:i/>
-                <w:color w:val="718096"/>
-                <w:sz w:val="19"/>
-              </w:rPr>
-              <w:t xml:space="preserve">    (11)</w:t>
-            </w:r>
-          </w:p>
-        </w:tc>
-      </w:tr>
-    </w:tbl>
-    <w:p>
-      <w:pPr>
-        <w:spacing w:after="40"/>
-      </w:pPr>
-    </w:p>
-    <w:p>
-      <w:pPr>
-        <w:spacing w:after="80" w:line="276" w:lineRule="auto"/>
-        <w:jc w:val="both"/>
-      </w:pPr>
-      <w:r>
-        <w:rPr>
-          <w:rFonts w:ascii="Calibri" w:hAnsi="Calibri"/>
-          <w:i w:val="0"/>
-          <w:color w:val="2D3748"/>
-          <w:sz w:val="20"/>
-        </w:rPr>
-        <w:t>The pairwise dynamic embedding vector is projected through a parameterized LeakyReLU layer (α = 0.1):</w:t>
-      </w:r>
-    </w:p>
-    <w:tbl>
-      <w:tblPr>
-        <w:tblW w:type="auto" w:w="0"/>
-        <w:jc w:val="center"/>
-        <w:tblLook w:firstColumn="1" w:firstRow="1" w:lastColumn="0" w:lastRow="0" w:noHBand="0" w:noVBand="1" w:val="04A0"/>
-      </w:tblPr>
-      <w:tblGrid>
-        <w:gridCol w:w="10080"/>
-      </w:tblGrid>
-      <w:tr>
-        <w:tc>
-          <w:tcPr>
-            <w:tcW w:type="dxa" w:w="9360"/>
-            <w:shd w:fill="F8FAFC"/>
-            <w:tcBorders>
-              <w:top w:val="none"/>
-              <w:left w:val="single" w:sz="18" w:space="0" w:color="2B6CB0"/>
-              <w:bottom w:val="none"/>
-              <w:right w:val="none"/>
-            </w:tcBorders>
-            <w:tcMar>
-              <w:top w:w="80" w:type="dxa"/>
-              <w:left w:w="140" w:type="dxa"/>
-              <w:bottom w:w="80" w:type="dxa"/>
-              <w:right w:w="100" w:type="dxa"/>
-            </w:tcMar>
-          </w:tcPr>
-          <w:p>
-            <w:pPr>
-              <w:spacing w:before="40" w:after="40" w:line="276" w:lineRule="auto"/>
-            </w:pPr>
-            <w:r>
-              <w:rPr>
-                <w:rFonts w:ascii="Consolas" w:hAnsi="Consolas"/>
-                <w:b/>
-                <w:color w:val="1B365D"/>
-                <w:sz w:val="19"/>
-              </w:rPr>
-              <w:t>h_dyn(ξ_k, τ_k) = max(0.1 · Γ_k, Γ_k),   Γ_k = W_proj [ η_{𝔰_k}(τ_k) ∥ η_{𝔡_k}(τ_k) ] + b_proj</w:t>
-            </w:r>
-            <w:r>
-              <w:rPr>
-                <w:rFonts w:ascii="Calibri" w:hAnsi="Calibri"/>
-                <w:i/>
-                <w:color w:val="718096"/>
-                <w:sz w:val="19"/>
-              </w:rPr>
-              <w:t xml:space="preserve">    (12)</w:t>
-            </w:r>
-          </w:p>
-        </w:tc>
-      </w:tr>
-    </w:tbl>
-    <w:p>
-      <w:pPr>
-        <w:spacing w:after="40"/>
-      </w:pPr>
     </w:p>
     <w:p>
       <w:pPr>
@@ -1665,7 +1126,7 @@
           <w:color w:val="2D3748"/>
           <w:sz w:val="20"/>
         </w:rPr>
-        <w:t>The finalized TGN-XGBoost champion model couples continuous TGN embeddings with gradient-boosted trees:</w:t>
+        <w:t>The proposed TGN-XGBoost champion model couples the composite representation with gradient-boosted decision trees [19]:</w:t>
       </w:r>
     </w:p>
     <w:tbl>
@@ -1715,7 +1176,7 @@
                 <w:color w:val="718096"/>
                 <w:sz w:val="19"/>
               </w:rPr>
-              <w:t xml:space="preserve">    (13)</w:t>
+              <w:t xml:space="preserve">    (5)</w:t>
             </w:r>
           </w:p>
         </w:tc>
@@ -1738,7 +1199,7 @@
           <w:color w:val="2D3748"/>
           <w:sz w:val="20"/>
         </w:rPr>
-        <w:t>where 𝒯_GBDT denotes an ensemble of gradient-boosted decision trees [19] optimized under an unweighted, symmetric α-free focal loss [17]:</w:t>
+        <w:t>optimized under an unweighted, symmetric α-free focal loss [17]:</w:t>
       </w:r>
     </w:p>
     <w:tbl>
@@ -1788,7 +1249,7 @@
                 <w:color w:val="718096"/>
                 <w:sz w:val="19"/>
               </w:rPr>
-              <w:t xml:space="preserve">    (14)</w:t>
+              <w:t xml:space="preserve">    (6)</w:t>
             </w:r>
           </w:p>
         </w:tc>
@@ -1811,241 +1272,7 @@
           <w:color w:val="2D3748"/>
           <w:sz w:val="20"/>
         </w:rPr>
-        <w:t>where π̂_k = σ(θ_k) = (1 + e^-θ_k)^-1 is the sigmoid posterior of predicted log-odds margin θ_k ∈ ℝ, y_k ∈ {0, 1} is the ground-truth forensic label, and γ ∈ ℝ^+ is the focusing factor (γ = 1.0 for BankSim, γ = 2.0 for SAP Würzburg).</w:t>
-      </w:r>
-    </w:p>
-    <w:p>
-      <w:pPr>
-        <w:spacing w:after="80" w:line="276" w:lineRule="auto"/>
-        <w:jc w:val="both"/>
-      </w:pPr>
-      <w:r>
-        <w:rPr>
-          <w:rFonts w:ascii="Calibri" w:hAnsi="Calibri"/>
-          <w:i w:val="0"/>
-          <w:color w:val="2D3748"/>
-          <w:sz w:val="20"/>
-        </w:rPr>
-        <w:t>The closed-form directional first-order gradient g_k = ∂𝒥_focal / ∂θ_k is:</w:t>
-      </w:r>
-    </w:p>
-    <w:tbl>
-      <w:tblPr>
-        <w:tblW w:type="auto" w:w="0"/>
-        <w:jc w:val="center"/>
-        <w:tblLook w:firstColumn="1" w:firstRow="1" w:lastColumn="0" w:lastRow="0" w:noHBand="0" w:noVBand="1" w:val="04A0"/>
-      </w:tblPr>
-      <w:tblGrid>
-        <w:gridCol w:w="10080"/>
-      </w:tblGrid>
-      <w:tr>
-        <w:tc>
-          <w:tcPr>
-            <w:tcW w:type="dxa" w:w="9360"/>
-            <w:shd w:fill="F8FAFC"/>
-            <w:tcBorders>
-              <w:top w:val="none"/>
-              <w:left w:val="single" w:sz="18" w:space="0" w:color="2B6CB0"/>
-              <w:bottom w:val="none"/>
-              <w:right w:val="none"/>
-            </w:tcBorders>
-            <w:tcMar>
-              <w:top w:w="80" w:type="dxa"/>
-              <w:left w:w="140" w:type="dxa"/>
-              <w:bottom w:w="80" w:type="dxa"/>
-              <w:right w:w="100" w:type="dxa"/>
-            </w:tcMar>
-          </w:tcPr>
-          <w:p>
-            <w:pPr>
-              <w:spacing w:before="40" w:after="40" w:line="276" w:lineRule="auto"/>
-            </w:pPr>
-            <w:r>
-              <w:rPr>
-                <w:rFonts w:ascii="Consolas" w:hAnsi="Consolas"/>
-                <w:b/>
-                <w:color w:val="1B365D"/>
-                <w:sz w:val="19"/>
-              </w:rPr>
-              <w:t>g_k = γ π̂_k (1 - π̂_k)^γ ln(π̂_k) - (1 - π̂_k)^{γ+1}   [if y_k=1],   π̂_k^{γ+1} - γ (1 - π̂_k) π̂_k^γ ln(1 - π̂_k)   [if y_k=0]</w:t>
-            </w:r>
-            <w:r>
-              <w:rPr>
-                <w:rFonts w:ascii="Calibri" w:hAnsi="Calibri"/>
-                <w:i/>
-                <w:color w:val="718096"/>
-                <w:sz w:val="19"/>
-              </w:rPr>
-              <w:t xml:space="preserve">    (15)</w:t>
-            </w:r>
-          </w:p>
-        </w:tc>
-      </w:tr>
-    </w:tbl>
-    <w:p>
-      <w:pPr>
-        <w:spacing w:after="40"/>
-      </w:pPr>
-    </w:p>
-    <w:p>
-      <w:pPr>
-        <w:spacing w:after="80" w:line="276" w:lineRule="auto"/>
-        <w:jc w:val="both"/>
-      </w:pPr>
-      <w:r>
-        <w:rPr>
-          <w:rFonts w:ascii="Calibri" w:hAnsi="Calibri"/>
-          <w:i w:val="0"/>
-          <w:color w:val="2D3748"/>
-          <w:sz w:val="20"/>
-        </w:rPr>
-        <w:t>The second-order curvature hessian H_k = ∂²𝒥_focal / ∂θ_k² is evaluated via central difference perturbation with step δε = 10^-4:</w:t>
-      </w:r>
-    </w:p>
-    <w:tbl>
-      <w:tblPr>
-        <w:tblW w:type="auto" w:w="0"/>
-        <w:jc w:val="center"/>
-        <w:tblLook w:firstColumn="1" w:firstRow="1" w:lastColumn="0" w:lastRow="0" w:noHBand="0" w:noVBand="1" w:val="04A0"/>
-      </w:tblPr>
-      <w:tblGrid>
-        <w:gridCol w:w="10080"/>
-      </w:tblGrid>
-      <w:tr>
-        <w:tc>
-          <w:tcPr>
-            <w:tcW w:type="dxa" w:w="9360"/>
-            <w:shd w:fill="F8FAFC"/>
-            <w:tcBorders>
-              <w:top w:val="none"/>
-              <w:left w:val="single" w:sz="18" w:space="0" w:color="2B6CB0"/>
-              <w:bottom w:val="none"/>
-              <w:right w:val="none"/>
-            </w:tcBorders>
-            <w:tcMar>
-              <w:top w:w="80" w:type="dxa"/>
-              <w:left w:w="140" w:type="dxa"/>
-              <w:bottom w:w="80" w:type="dxa"/>
-              <w:right w:w="100" w:type="dxa"/>
-            </w:tcMar>
-          </w:tcPr>
-          <w:p>
-            <w:pPr>
-              <w:spacing w:before="40" w:after="40" w:line="276" w:lineRule="auto"/>
-            </w:pPr>
-            <w:r>
-              <w:rPr>
-                <w:rFonts w:ascii="Consolas" w:hAnsi="Consolas"/>
-                <w:b/>
-                <w:color w:val="1B365D"/>
-                <w:sz w:val="19"/>
-              </w:rPr>
-              <w:t>H_k ≈ [ g_k(θ_k + δε) - g_k(θ_k - δε) ] / (2 δε)</w:t>
-            </w:r>
-            <w:r>
-              <w:rPr>
-                <w:rFonts w:ascii="Calibri" w:hAnsi="Calibri"/>
-                <w:i/>
-                <w:color w:val="718096"/>
-                <w:sz w:val="19"/>
-              </w:rPr>
-              <w:t xml:space="preserve">    (16)</w:t>
-            </w:r>
-          </w:p>
-        </w:tc>
-      </w:tr>
-    </w:tbl>
-    <w:p>
-      <w:pPr>
-        <w:spacing w:after="40"/>
-      </w:pPr>
-    </w:p>
-    <w:p>
-      <w:pPr>
-        <w:spacing w:after="80" w:line="276" w:lineRule="auto"/>
-        <w:jc w:val="both"/>
-      </w:pPr>
-      <w:r>
-        <w:rPr>
-          <w:rFonts w:ascii="Calibri" w:hAnsi="Calibri"/>
-          <w:i w:val="0"/>
-          <w:color w:val="2D3748"/>
-          <w:sz w:val="20"/>
-        </w:rPr>
-        <w:t>The operational decision threshold is tuned strictly on validation set 𝒟_val and frozen:</w:t>
-      </w:r>
-    </w:p>
-    <w:tbl>
-      <w:tblPr>
-        <w:tblW w:type="auto" w:w="0"/>
-        <w:jc w:val="center"/>
-        <w:tblLook w:firstColumn="1" w:firstRow="1" w:lastColumn="0" w:lastRow="0" w:noHBand="0" w:noVBand="1" w:val="04A0"/>
-      </w:tblPr>
-      <w:tblGrid>
-        <w:gridCol w:w="10080"/>
-      </w:tblGrid>
-      <w:tr>
-        <w:tc>
-          <w:tcPr>
-            <w:tcW w:type="dxa" w:w="9360"/>
-            <w:shd w:fill="F8FAFC"/>
-            <w:tcBorders>
-              <w:top w:val="none"/>
-              <w:left w:val="single" w:sz="18" w:space="0" w:color="2B6CB0"/>
-              <w:bottom w:val="none"/>
-              <w:right w:val="none"/>
-            </w:tcBorders>
-            <w:tcMar>
-              <w:top w:w="80" w:type="dxa"/>
-              <w:left w:w="140" w:type="dxa"/>
-              <w:bottom w:w="80" w:type="dxa"/>
-              <w:right w:w="100" w:type="dxa"/>
-            </w:tcMar>
-          </w:tcPr>
-          <w:p>
-            <w:pPr>
-              <w:spacing w:before="40" w:after="40" w:line="276" w:lineRule="auto"/>
-            </w:pPr>
-            <w:r>
-              <w:rPr>
-                <w:rFonts w:ascii="Consolas" w:hAnsi="Consolas"/>
-                <w:b/>
-                <w:color w:val="1B365D"/>
-                <w:sz w:val="19"/>
-              </w:rPr>
-              <w:t>θ_audit* = argmax_θ ℱ_1( 𝒟_val, θ ),   ŷ_k = 𝕀( π̂_k ≥ θ_audit* )</w:t>
-            </w:r>
-            <w:r>
-              <w:rPr>
-                <w:rFonts w:ascii="Calibri" w:hAnsi="Calibri"/>
-                <w:i/>
-                <w:color w:val="718096"/>
-                <w:sz w:val="19"/>
-              </w:rPr>
-              <w:t xml:space="preserve">    (17)</w:t>
-            </w:r>
-          </w:p>
-        </w:tc>
-      </w:tr>
-    </w:tbl>
-    <w:p>
-      <w:pPr>
-        <w:spacing w:after="40"/>
-      </w:pPr>
-    </w:p>
-    <w:p>
-      <w:pPr>
-        <w:spacing w:after="80" w:line="276" w:lineRule="auto"/>
-        <w:jc w:val="both"/>
-      </w:pPr>
-      <w:r>
-        <w:rPr>
-          <w:rFonts w:ascii="Calibri" w:hAnsi="Calibri"/>
-          <w:i w:val="0"/>
-          <w:color w:val="2D3748"/>
-          <w:sz w:val="20"/>
-        </w:rPr>
-        <w:t>and frozen for test evaluation. Test metrics are never evaluated at an uncalibrated default 0.5 threshold.</w:t>
+        <w:t>where π̂_k = σ(θ_k) = (1 + e^-θ_k)^-1 is the sigmoid posterior of predicted log-odds margin θ_k ∈ ℝ, y_k ∈ {0, 1} is the forensic label, and γ ∈ ℝ^+ is the focusing factor (γ = 1.0 for BankSim, γ = 2.0 for SAP Würzburg). Decision thresholds θ_audit* are tuned strictly on validation splits and frozen for test evaluation.</w:t>
       </w:r>
     </w:p>
     <w:p>
@@ -2075,7 +1302,7 @@
           <w:color w:val="2D3748"/>
           <w:sz w:val="20"/>
         </w:rPr>
-        <w:t>To overcome cross-institutional banking secrecy barriers (GDPR, GLBA), we deploy a Score-Level Ensemble Consensus architecture across C=4 heterogeneous institutional clients partitioned via k-means clustering on transaction volume. Rather than naive uniform averaging (FedAvg) [14], which allows fraud-starved institutions to dilute the consensus, our server implements empirical validation reliability weighting (FedProx) [15]. Across C decentralized clients c ∈ {1, ..., C} with private validation precision-recall area 𝒫_val^(c) = PR-AUC(𝒟_val^(c)), the central aggregator computes institutional reliability coefficients:</w:t>
+        <w:t>To overcome cross-institutional banking secrecy barriers (GDPR, GLBA), we deploy a Score-Level Ensemble Consensus architecture across C=4 heterogeneous institutional clients. Rather than uniform averaging (FedAvg) [14], our server implements empirical validation reliability weighting (FedProx) [15]:</w:t>
       </w:r>
     </w:p>
     <w:tbl>
@@ -2116,7 +1343,7 @@
                 <w:color w:val="1B365D"/>
                 <w:sz w:val="19"/>
               </w:rPr>
-              <w:t>ϖ_c = (𝒫_val^(c))^κ / ∑_{m=1}^C (𝒫_val^(m))^κ</w:t>
+              <w:t>ϖ_c = (𝒫_val^(c))^κ / ∑_{m=1}^C (𝒫_val^(m))^κ,   Π̂_consensus(ξ_k) = ∑_{c=1}^C ϖ_c · ℳ^(c)( Φ(ξ_k) )</w:t>
             </w:r>
             <w:r>
               <w:rPr>
@@ -2125,7 +1352,7 @@
                 <w:color w:val="718096"/>
                 <w:sz w:val="19"/>
               </w:rPr>
-              <w:t xml:space="preserve">    (18)</w:t>
+              <w:t xml:space="preserve">    (7)</w:t>
             </w:r>
           </w:p>
         </w:tc>
@@ -2148,80 +1375,7 @@
           <w:color w:val="2D3748"/>
           <w:sz w:val="20"/>
         </w:rPr>
-        <w:t>where κ ≥ 1.0 is the empirical confidence sharpening exponent. The global federated consensus prediction is:</w:t>
-      </w:r>
-    </w:p>
-    <w:tbl>
-      <w:tblPr>
-        <w:tblW w:type="auto" w:w="0"/>
-        <w:jc w:val="center"/>
-        <w:tblLook w:firstColumn="1" w:firstRow="1" w:lastColumn="0" w:lastRow="0" w:noHBand="0" w:noVBand="1" w:val="04A0"/>
-      </w:tblPr>
-      <w:tblGrid>
-        <w:gridCol w:w="10080"/>
-      </w:tblGrid>
-      <w:tr>
-        <w:tc>
-          <w:tcPr>
-            <w:tcW w:type="dxa" w:w="9360"/>
-            <w:shd w:fill="F8FAFC"/>
-            <w:tcBorders>
-              <w:top w:val="none"/>
-              <w:left w:val="single" w:sz="18" w:space="0" w:color="2B6CB0"/>
-              <w:bottom w:val="none"/>
-              <w:right w:val="none"/>
-            </w:tcBorders>
-            <w:tcMar>
-              <w:top w:w="80" w:type="dxa"/>
-              <w:left w:w="140" w:type="dxa"/>
-              <w:bottom w:w="80" w:type="dxa"/>
-              <w:right w:w="100" w:type="dxa"/>
-            </w:tcMar>
-          </w:tcPr>
-          <w:p>
-            <w:pPr>
-              <w:spacing w:before="40" w:after="40" w:line="276" w:lineRule="auto"/>
-            </w:pPr>
-            <w:r>
-              <w:rPr>
-                <w:rFonts w:ascii="Consolas" w:hAnsi="Consolas"/>
-                <w:b/>
-                <w:color w:val="1B365D"/>
-                <w:sz w:val="19"/>
-              </w:rPr>
-              <w:t>Π̂_consensus(ξ_k) = ∑_{c=1}^C ϖ_c · ℳ^(c)( Φ(ξ_k) )</w:t>
-            </w:r>
-            <w:r>
-              <w:rPr>
-                <w:rFonts w:ascii="Calibri" w:hAnsi="Calibri"/>
-                <w:i/>
-                <w:color w:val="718096"/>
-                <w:sz w:val="19"/>
-              </w:rPr>
-              <w:t xml:space="preserve">    (19)</w:t>
-            </w:r>
-          </w:p>
-        </w:tc>
-      </w:tr>
-    </w:tbl>
-    <w:p>
-      <w:pPr>
-        <w:spacing w:after="40"/>
-      </w:pPr>
-    </w:p>
-    <w:p>
-      <w:pPr>
-        <w:spacing w:after="80" w:line="276" w:lineRule="auto"/>
-        <w:jc w:val="both"/>
-      </w:pPr>
-      <w:r>
-        <w:rPr>
-          <w:rFonts w:ascii="Calibri" w:hAnsi="Calibri"/>
-          <w:i w:val="0"/>
-          <w:color w:val="2D3748"/>
-          <w:sz w:val="20"/>
-        </w:rPr>
-        <w:t>Each client trains autonomously on its private transaction partition, early-stops on local validation data, and communicates only prediction scores and validation confidence metrics to the central aggregator.</w:t>
+        <w:t>where 𝒫_val^(c) = PR-AUC(𝒟_val^(c)) and κ ≥ 1.0.</w:t>
       </w:r>
     </w:p>
     <w:p>
@@ -2251,7 +1405,7 @@
           <w:color w:val="2D3748"/>
           <w:sz w:val="20"/>
         </w:rPr>
-        <w:t xml:space="preserve">Regulatory compliance (Sarbanes-Oxley Act, Basel III) requires verifiable evidence trails [9, 10]. Every reported feature attribution is computed via TreeSHAP [18] in unconstrained log-odds margin space θ_k = ln(π̂_k / (1 - π̂_k)): </w:t>
+        <w:t>Regulatory compliance requires verifiable evidence trails [9, 10]. Feature attributions are computed via exact TreeSHAP [18] in log-odds margin space:</w:t>
       </w:r>
     </w:p>
     <w:tbl>
@@ -2292,7 +1446,7 @@
                 <w:color w:val="1B365D"/>
                 <w:sz w:val="19"/>
               </w:rPr>
-              <w:t>θ_k = Λ_0 + ∑_{d=1}^D Λ_d( Φ(ξ_k) )</w:t>
+              <w:t>θ_k = ln( π̂_k / (1 - π̂_k) ) = Λ_0 + ∑_{d=1}^D Λ_d( Φ(ξ_k) )</w:t>
             </w:r>
             <w:r>
               <w:rPr>
@@ -2301,7 +1455,7 @@
                 <w:color w:val="718096"/>
                 <w:sz w:val="19"/>
               </w:rPr>
-              <w:t xml:space="preserve">    (20)</w:t>
+              <w:t xml:space="preserve">    (8)</w:t>
             </w:r>
           </w:p>
         </w:tc>
@@ -2324,22 +1478,7 @@
           <w:color w:val="2D3748"/>
           <w:sz w:val="20"/>
         </w:rPr>
-        <w:t>where Λ_0 = 𝔼_Φ[θ] represents the base ledger log-odds prior, and Λ_d ∈ ℝ represents the exact, sign-consistent marginal attribution of the d-th feature. This executes the exact TreeSHAP recursion as a pure traversal of the fitted tree ensemble, returning signed attributions additive in log-odds space. It is exact (not sampled) and valid under focal gradients.</w:t>
-      </w:r>
-    </w:p>
-    <w:p>
-      <w:pPr>
-        <w:spacing w:after="80" w:line="276" w:lineRule="auto"/>
-        <w:jc w:val="both"/>
-      </w:pPr>
-      <w:r>
-        <w:rPr>
-          <w:rFonts w:ascii="Calibri" w:hAnsi="Calibri"/>
-          <w:i w:val="0"/>
-          <w:color w:val="2D3748"/>
-          <w:sz w:val="20"/>
-        </w:rPr>
-        <w:t>When an anomaly score exceeds θ_audit*, the continuous auditing console synthesizes a two-layer forensic alert packet: (1) Layer 1 (Model Attribution): Top 3 signed driving features in log-odds space (e.g., +0.43 log_amount, +0.29 dest_in_degree); and (2) Layer 2 (Reconstructed Graph Evidence): A deterministic Cypher query executing against Neo4j that extracts the historical subgraph surrounding the flagged transaction, confirming counterparty identities and payment paths for forensic review.</w:t>
+        <w:t>When an anomaly score exceeds θ_audit*, the continuous auditing console synthesizes a two-layer forensic alert packet: (1) Layer 1: Top 3 signed driving features in log-odds space; and (2) Layer 2: A deterministic Cypher query executing against Neo4j extracting the historical subgraph.</w:t>
       </w:r>
     </w:p>
     <w:p>
@@ -13775,1718 +12914,8 @@
           <w:color w:val="2D3748"/>
           <w:sz w:val="20"/>
         </w:rPr>
-        <w:t>Tables 8, 9, and 10 present the explicit 2x2 confusion contingency matrices evaluated on held-out test splits under frozen operational thresholds θ_audit*, and Fig. 7 provides the corresponding visual contingency heatmaps across all three benchmark datasets.</w:t>
+        <w:t>To provide full empirical forensic transparency into classification error distributions without reliance on text tabular abstractions, Fig. 7 presents the visual 2x2 confusion contingency matrices for the proposed TGN-XGBoost model evaluated across all three benchmark datasets on the chronologically held-out test splits under frozen operational decision thresholds θ_audit*.</w:t>
       </w:r>
-    </w:p>
-    <w:p>
-      <w:pPr>
-        <w:keepNext/>
-        <w:spacing w:before="160" w:after="40"/>
-      </w:pPr>
-      <w:r>
-        <w:rPr>
-          <w:rFonts w:ascii="Calibri" w:hAnsi="Calibri"/>
-          <w:b/>
-          <w:color w:val="1B365D"/>
-          <w:sz w:val="19"/>
-        </w:rPr>
-        <w:t>Table 8: Confusion Matrix for Dataset 1 (BankSim) under Frozen Operational Threshold θ_audit* = 0.534.</w:t>
-      </w:r>
-    </w:p>
-    <w:tbl>
-      <w:tblPr>
-        <w:tblW w:type="auto" w:w="0"/>
-        <w:jc w:val="center"/>
-        <w:tblLook w:firstColumn="1" w:firstRow="1" w:lastColumn="0" w:lastRow="0" w:noHBand="0" w:noVBand="1" w:val="04A0"/>
-      </w:tblPr>
-      <w:tblGrid>
-        <w:gridCol w:w="2520"/>
-        <w:gridCol w:w="2520"/>
-        <w:gridCol w:w="2520"/>
-        <w:gridCol w:w="2520"/>
-      </w:tblGrid>
-      <w:tr>
-        <w:trPr>
-          <w:tblHeader/>
-          <w:cantSplit/>
-        </w:trPr>
-        <w:tc>
-          <w:tcPr>
-            <w:tcW w:type="dxa" w:w="2589"/>
-            <w:vAlign w:val="center"/>
-            <w:shd w:fill="1B365D"/>
-            <w:tcBorders>
-              <w:top w:val="single" w:sz="4" w:space="0" w:color="CBD5E0"/>
-              <w:left w:val="none"/>
-              <w:bottom w:val="double" w:sz="12" w:space="0" w:color="1B365D"/>
-              <w:right w:val="none"/>
-            </w:tcBorders>
-            <w:tcMar>
-              <w:top w:w="70" w:type="dxa"/>
-              <w:left w:w="60" w:type="dxa"/>
-              <w:bottom w:w="70" w:type="dxa"/>
-              <w:right w:w="60" w:type="dxa"/>
-            </w:tcMar>
-          </w:tcPr>
-          <w:p>
-            <w:pPr>
-              <w:jc w:val="center"/>
-            </w:pPr>
-            <w:r>
-              <w:rPr>
-                <w:rFonts w:ascii="Calibri" w:hAnsi="Calibri"/>
-                <w:b/>
-                <w:color w:val="FFFFFF"/>
-                <w:sz w:val="17"/>
-              </w:rPr>
-              <w:t>Actual \ Predicted</w:t>
-            </w:r>
-          </w:p>
-        </w:tc>
-        <w:tc>
-          <w:tcPr>
-            <w:tcW w:type="dxa" w:w="2390"/>
-            <w:vAlign w:val="center"/>
-            <w:shd w:fill="1B365D"/>
-            <w:tcBorders>
-              <w:top w:val="single" w:sz="4" w:space="0" w:color="CBD5E0"/>
-              <w:left w:val="none"/>
-              <w:bottom w:val="double" w:sz="12" w:space="0" w:color="1B365D"/>
-              <w:right w:val="none"/>
-            </w:tcBorders>
-            <w:tcMar>
-              <w:top w:w="70" w:type="dxa"/>
-              <w:left w:w="60" w:type="dxa"/>
-              <w:bottom w:w="70" w:type="dxa"/>
-              <w:right w:w="60" w:type="dxa"/>
-            </w:tcMar>
-          </w:tcPr>
-          <w:p>
-            <w:pPr>
-              <w:jc w:val="center"/>
-            </w:pPr>
-            <w:r>
-              <w:rPr>
-                <w:rFonts w:ascii="Calibri" w:hAnsi="Calibri"/>
-                <w:b/>
-                <w:color w:val="FFFFFF"/>
-                <w:sz w:val="17"/>
-              </w:rPr>
-              <w:t>Pred. Non-Fraud</w:t>
-            </w:r>
-          </w:p>
-        </w:tc>
-        <w:tc>
-          <w:tcPr>
-            <w:tcW w:type="dxa" w:w="2390"/>
-            <w:vAlign w:val="center"/>
-            <w:shd w:fill="1B365D"/>
-            <w:tcBorders>
-              <w:top w:val="single" w:sz="4" w:space="0" w:color="CBD5E0"/>
-              <w:left w:val="none"/>
-              <w:bottom w:val="double" w:sz="12" w:space="0" w:color="1B365D"/>
-              <w:right w:val="none"/>
-            </w:tcBorders>
-            <w:tcMar>
-              <w:top w:w="70" w:type="dxa"/>
-              <w:left w:w="60" w:type="dxa"/>
-              <w:bottom w:w="70" w:type="dxa"/>
-              <w:right w:w="60" w:type="dxa"/>
-            </w:tcMar>
-          </w:tcPr>
-          <w:p>
-            <w:pPr>
-              <w:jc w:val="center"/>
-            </w:pPr>
-            <w:r>
-              <w:rPr>
-                <w:rFonts w:ascii="Calibri" w:hAnsi="Calibri"/>
-                <w:b/>
-                <w:color w:val="FFFFFF"/>
-                <w:sz w:val="17"/>
-              </w:rPr>
-              <w:t>Pred. Fraud</w:t>
-            </w:r>
-          </w:p>
-        </w:tc>
-        <w:tc>
-          <w:tcPr>
-            <w:tcW w:type="dxa" w:w="1991"/>
-            <w:vAlign w:val="center"/>
-            <w:shd w:fill="1B365D"/>
-            <w:tcBorders>
-              <w:top w:val="single" w:sz="4" w:space="0" w:color="CBD5E0"/>
-              <w:left w:val="none"/>
-              <w:bottom w:val="double" w:sz="12" w:space="0" w:color="1B365D"/>
-              <w:right w:val="none"/>
-            </w:tcBorders>
-            <w:tcMar>
-              <w:top w:w="70" w:type="dxa"/>
-              <w:left w:w="60" w:type="dxa"/>
-              <w:bottom w:w="70" w:type="dxa"/>
-              <w:right w:w="60" w:type="dxa"/>
-            </w:tcMar>
-          </w:tcPr>
-          <w:p>
-            <w:pPr>
-              <w:jc w:val="center"/>
-            </w:pPr>
-            <w:r>
-              <w:rPr>
-                <w:rFonts w:ascii="Calibri" w:hAnsi="Calibri"/>
-                <w:b/>
-                <w:color w:val="FFFFFF"/>
-                <w:sz w:val="17"/>
-              </w:rPr>
-              <w:t>Total Actual</w:t>
-            </w:r>
-          </w:p>
-        </w:tc>
-      </w:tr>
-      <w:tr>
-        <w:trPr>
-          <w:cantSplit/>
-        </w:trPr>
-        <w:tc>
-          <w:tcPr>
-            <w:tcW w:type="dxa" w:w="2589"/>
-            <w:vAlign w:val="center"/>
-            <w:shd w:fill="F7FAFC"/>
-            <w:tcBorders>
-              <w:top w:val="single" w:sz="4" w:space="0" w:color="CBD5E0"/>
-              <w:left w:val="none"/>
-              <w:bottom w:val="single" w:sz="4" w:space="0" w:color="CBD5E0"/>
-              <w:right w:val="none"/>
-            </w:tcBorders>
-            <w:tcMar>
-              <w:top w:w="70" w:type="dxa"/>
-              <w:left w:w="60" w:type="dxa"/>
-              <w:bottom w:w="70" w:type="dxa"/>
-              <w:right w:w="60" w:type="dxa"/>
-            </w:tcMar>
-          </w:tcPr>
-          <w:p>
-            <w:pPr>
-              <w:jc w:val="left"/>
-            </w:pPr>
-            <w:r>
-              <w:rPr>
-                <w:rFonts w:ascii="Calibri" w:hAnsi="Calibri"/>
-                <w:color w:val="2D3748"/>
-                <w:sz w:val="17"/>
-              </w:rPr>
-              <w:t>Actual Non-Fraud</w:t>
-            </w:r>
-          </w:p>
-        </w:tc>
-        <w:tc>
-          <w:tcPr>
-            <w:tcW w:type="dxa" w:w="2390"/>
-            <w:vAlign w:val="center"/>
-            <w:shd w:fill="F7FAFC"/>
-            <w:tcBorders>
-              <w:top w:val="single" w:sz="4" w:space="0" w:color="CBD5E0"/>
-              <w:left w:val="none"/>
-              <w:bottom w:val="single" w:sz="4" w:space="0" w:color="CBD5E0"/>
-              <w:right w:val="none"/>
-            </w:tcBorders>
-            <w:tcMar>
-              <w:top w:w="70" w:type="dxa"/>
-              <w:left w:w="60" w:type="dxa"/>
-              <w:bottom w:w="70" w:type="dxa"/>
-              <w:right w:w="60" w:type="dxa"/>
-            </w:tcMar>
-          </w:tcPr>
-          <w:p>
-            <w:pPr>
-              <w:jc w:val="center"/>
-            </w:pPr>
-            <w:r>
-              <w:rPr>
-                <w:rFonts w:ascii="Calibri" w:hAnsi="Calibri"/>
-                <w:color w:val="2D3748"/>
-                <w:sz w:val="17"/>
-              </w:rPr>
-              <w:t>120,809 (TN: 98.80%)</w:t>
-            </w:r>
-          </w:p>
-        </w:tc>
-        <w:tc>
-          <w:tcPr>
-            <w:tcW w:type="dxa" w:w="2390"/>
-            <w:vAlign w:val="center"/>
-            <w:shd w:fill="F7FAFC"/>
-            <w:tcBorders>
-              <w:top w:val="single" w:sz="4" w:space="0" w:color="CBD5E0"/>
-              <w:left w:val="none"/>
-              <w:bottom w:val="single" w:sz="4" w:space="0" w:color="CBD5E0"/>
-              <w:right w:val="none"/>
-            </w:tcBorders>
-            <w:tcMar>
-              <w:top w:w="70" w:type="dxa"/>
-              <w:left w:w="60" w:type="dxa"/>
-              <w:bottom w:w="70" w:type="dxa"/>
-              <w:right w:w="60" w:type="dxa"/>
-            </w:tcMar>
-          </w:tcPr>
-          <w:p>
-            <w:pPr>
-              <w:jc w:val="center"/>
-            </w:pPr>
-            <w:r>
-              <w:rPr>
-                <w:rFonts w:ascii="Calibri" w:hAnsi="Calibri"/>
-                <w:color w:val="2D3748"/>
-                <w:sz w:val="17"/>
-              </w:rPr>
-              <w:t>149 (FP: 0.12%)</w:t>
-            </w:r>
-          </w:p>
-        </w:tc>
-        <w:tc>
-          <w:tcPr>
-            <w:tcW w:type="dxa" w:w="1991"/>
-            <w:vAlign w:val="center"/>
-            <w:shd w:fill="F7FAFC"/>
-            <w:tcBorders>
-              <w:top w:val="single" w:sz="4" w:space="0" w:color="CBD5E0"/>
-              <w:left w:val="none"/>
-              <w:bottom w:val="single" w:sz="4" w:space="0" w:color="CBD5E0"/>
-              <w:right w:val="none"/>
-            </w:tcBorders>
-            <w:tcMar>
-              <w:top w:w="70" w:type="dxa"/>
-              <w:left w:w="60" w:type="dxa"/>
-              <w:bottom w:w="70" w:type="dxa"/>
-              <w:right w:w="60" w:type="dxa"/>
-            </w:tcMar>
-          </w:tcPr>
-          <w:p>
-            <w:pPr>
-              <w:jc w:val="center"/>
-            </w:pPr>
-            <w:r>
-              <w:rPr>
-                <w:rFonts w:ascii="Calibri" w:hAnsi="Calibri"/>
-                <w:color w:val="2D3748"/>
-                <w:sz w:val="17"/>
-              </w:rPr>
-              <w:t>120,958</w:t>
-            </w:r>
-          </w:p>
-        </w:tc>
-      </w:tr>
-      <w:tr>
-        <w:trPr>
-          <w:cantSplit/>
-        </w:trPr>
-        <w:tc>
-          <w:tcPr>
-            <w:tcW w:type="dxa" w:w="2589"/>
-            <w:vAlign w:val="center"/>
-            <w:shd w:fill="FFFFFF"/>
-            <w:tcBorders>
-              <w:top w:val="single" w:sz="4" w:space="0" w:color="CBD5E0"/>
-              <w:left w:val="none"/>
-              <w:bottom w:val="single" w:sz="4" w:space="0" w:color="CBD5E0"/>
-              <w:right w:val="none"/>
-            </w:tcBorders>
-            <w:tcMar>
-              <w:top w:w="70" w:type="dxa"/>
-              <w:left w:w="60" w:type="dxa"/>
-              <w:bottom w:w="70" w:type="dxa"/>
-              <w:right w:w="60" w:type="dxa"/>
-            </w:tcMar>
-          </w:tcPr>
-          <w:p>
-            <w:pPr>
-              <w:jc w:val="left"/>
-            </w:pPr>
-            <w:r>
-              <w:rPr>
-                <w:rFonts w:ascii="Calibri" w:hAnsi="Calibri"/>
-                <w:color w:val="2D3748"/>
-                <w:sz w:val="17"/>
-              </w:rPr>
-              <w:t>Actual Fraud</w:t>
-            </w:r>
-          </w:p>
-        </w:tc>
-        <w:tc>
-          <w:tcPr>
-            <w:tcW w:type="dxa" w:w="2390"/>
-            <w:vAlign w:val="center"/>
-            <w:shd w:fill="FFFFFF"/>
-            <w:tcBorders>
-              <w:top w:val="single" w:sz="4" w:space="0" w:color="CBD5E0"/>
-              <w:left w:val="none"/>
-              <w:bottom w:val="single" w:sz="4" w:space="0" w:color="CBD5E0"/>
-              <w:right w:val="none"/>
-            </w:tcBorders>
-            <w:tcMar>
-              <w:top w:w="70" w:type="dxa"/>
-              <w:left w:w="60" w:type="dxa"/>
-              <w:bottom w:w="70" w:type="dxa"/>
-              <w:right w:w="60" w:type="dxa"/>
-            </w:tcMar>
-          </w:tcPr>
-          <w:p>
-            <w:pPr>
-              <w:jc w:val="center"/>
-            </w:pPr>
-            <w:r>
-              <w:rPr>
-                <w:rFonts w:ascii="Calibri" w:hAnsi="Calibri"/>
-                <w:color w:val="2D3748"/>
-                <w:sz w:val="17"/>
-              </w:rPr>
-              <w:t>236 (FN: 0.19%)</w:t>
-            </w:r>
-          </w:p>
-        </w:tc>
-        <w:tc>
-          <w:tcPr>
-            <w:tcW w:type="dxa" w:w="2390"/>
-            <w:vAlign w:val="center"/>
-            <w:shd w:fill="FFFFFF"/>
-            <w:tcBorders>
-              <w:top w:val="single" w:sz="4" w:space="0" w:color="CBD5E0"/>
-              <w:left w:val="none"/>
-              <w:bottom w:val="single" w:sz="4" w:space="0" w:color="CBD5E0"/>
-              <w:right w:val="none"/>
-            </w:tcBorders>
-            <w:tcMar>
-              <w:top w:w="70" w:type="dxa"/>
-              <w:left w:w="60" w:type="dxa"/>
-              <w:bottom w:w="70" w:type="dxa"/>
-              <w:right w:w="60" w:type="dxa"/>
-            </w:tcMar>
-          </w:tcPr>
-          <w:p>
-            <w:pPr>
-              <w:jc w:val="center"/>
-            </w:pPr>
-            <w:r>
-              <w:rPr>
-                <w:rFonts w:ascii="Calibri" w:hAnsi="Calibri"/>
-                <w:color w:val="2D3748"/>
-                <w:sz w:val="17"/>
-              </w:rPr>
-              <w:t>1,084 (TP: 0.89%)</w:t>
-            </w:r>
-          </w:p>
-        </w:tc>
-        <w:tc>
-          <w:tcPr>
-            <w:tcW w:type="dxa" w:w="1991"/>
-            <w:vAlign w:val="center"/>
-            <w:shd w:fill="FFFFFF"/>
-            <w:tcBorders>
-              <w:top w:val="single" w:sz="4" w:space="0" w:color="CBD5E0"/>
-              <w:left w:val="none"/>
-              <w:bottom w:val="single" w:sz="4" w:space="0" w:color="CBD5E0"/>
-              <w:right w:val="none"/>
-            </w:tcBorders>
-            <w:tcMar>
-              <w:top w:w="70" w:type="dxa"/>
-              <w:left w:w="60" w:type="dxa"/>
-              <w:bottom w:w="70" w:type="dxa"/>
-              <w:right w:w="60" w:type="dxa"/>
-            </w:tcMar>
-          </w:tcPr>
-          <w:p>
-            <w:pPr>
-              <w:jc w:val="center"/>
-            </w:pPr>
-            <w:r>
-              <w:rPr>
-                <w:rFonts w:ascii="Calibri" w:hAnsi="Calibri"/>
-                <w:color w:val="2D3748"/>
-                <w:sz w:val="17"/>
-              </w:rPr>
-              <w:t>1,320</w:t>
-            </w:r>
-          </w:p>
-        </w:tc>
-      </w:tr>
-      <w:tr>
-        <w:trPr>
-          <w:cantSplit/>
-        </w:trPr>
-        <w:tc>
-          <w:tcPr>
-            <w:tcW w:type="dxa" w:w="2589"/>
-            <w:vAlign w:val="center"/>
-            <w:shd w:fill="F7FAFC"/>
-            <w:tcBorders>
-              <w:top w:val="single" w:sz="4" w:space="0" w:color="CBD5E0"/>
-              <w:left w:val="none"/>
-              <w:bottom w:val="single" w:sz="4" w:space="0" w:color="CBD5E0"/>
-              <w:right w:val="none"/>
-            </w:tcBorders>
-            <w:tcMar>
-              <w:top w:w="70" w:type="dxa"/>
-              <w:left w:w="60" w:type="dxa"/>
-              <w:bottom w:w="70" w:type="dxa"/>
-              <w:right w:w="60" w:type="dxa"/>
-            </w:tcMar>
-          </w:tcPr>
-          <w:p>
-            <w:pPr>
-              <w:jc w:val="left"/>
-            </w:pPr>
-            <w:r>
-              <w:rPr>
-                <w:rFonts w:ascii="Calibri" w:hAnsi="Calibri"/>
-                <w:color w:val="2D3748"/>
-                <w:sz w:val="17"/>
-              </w:rPr>
-              <w:t>Total Predicted</w:t>
-            </w:r>
-          </w:p>
-        </w:tc>
-        <w:tc>
-          <w:tcPr>
-            <w:tcW w:type="dxa" w:w="2390"/>
-            <w:vAlign w:val="center"/>
-            <w:shd w:fill="F7FAFC"/>
-            <w:tcBorders>
-              <w:top w:val="single" w:sz="4" w:space="0" w:color="CBD5E0"/>
-              <w:left w:val="none"/>
-              <w:bottom w:val="single" w:sz="4" w:space="0" w:color="CBD5E0"/>
-              <w:right w:val="none"/>
-            </w:tcBorders>
-            <w:tcMar>
-              <w:top w:w="70" w:type="dxa"/>
-              <w:left w:w="60" w:type="dxa"/>
-              <w:bottom w:w="70" w:type="dxa"/>
-              <w:right w:w="60" w:type="dxa"/>
-            </w:tcMar>
-          </w:tcPr>
-          <w:p>
-            <w:pPr>
-              <w:jc w:val="center"/>
-            </w:pPr>
-            <w:r>
-              <w:rPr>
-                <w:rFonts w:ascii="Calibri" w:hAnsi="Calibri"/>
-                <w:color w:val="2D3748"/>
-                <w:sz w:val="17"/>
-              </w:rPr>
-              <w:t>121,045 (98.99%)</w:t>
-            </w:r>
-          </w:p>
-        </w:tc>
-        <w:tc>
-          <w:tcPr>
-            <w:tcW w:type="dxa" w:w="2390"/>
-            <w:vAlign w:val="center"/>
-            <w:shd w:fill="F7FAFC"/>
-            <w:tcBorders>
-              <w:top w:val="single" w:sz="4" w:space="0" w:color="CBD5E0"/>
-              <w:left w:val="none"/>
-              <w:bottom w:val="single" w:sz="4" w:space="0" w:color="CBD5E0"/>
-              <w:right w:val="none"/>
-            </w:tcBorders>
-            <w:tcMar>
-              <w:top w:w="70" w:type="dxa"/>
-              <w:left w:w="60" w:type="dxa"/>
-              <w:bottom w:w="70" w:type="dxa"/>
-              <w:right w:w="60" w:type="dxa"/>
-            </w:tcMar>
-          </w:tcPr>
-          <w:p>
-            <w:pPr>
-              <w:jc w:val="center"/>
-            </w:pPr>
-            <w:r>
-              <w:rPr>
-                <w:rFonts w:ascii="Calibri" w:hAnsi="Calibri"/>
-                <w:color w:val="2D3748"/>
-                <w:sz w:val="17"/>
-              </w:rPr>
-              <w:t>1,233 (1.01%)</w:t>
-            </w:r>
-          </w:p>
-        </w:tc>
-        <w:tc>
-          <w:tcPr>
-            <w:tcW w:type="dxa" w:w="1991"/>
-            <w:vAlign w:val="center"/>
-            <w:shd w:fill="F7FAFC"/>
-            <w:tcBorders>
-              <w:top w:val="single" w:sz="4" w:space="0" w:color="CBD5E0"/>
-              <w:left w:val="none"/>
-              <w:bottom w:val="single" w:sz="4" w:space="0" w:color="CBD5E0"/>
-              <w:right w:val="none"/>
-            </w:tcBorders>
-            <w:tcMar>
-              <w:top w:w="70" w:type="dxa"/>
-              <w:left w:w="60" w:type="dxa"/>
-              <w:bottom w:w="70" w:type="dxa"/>
-              <w:right w:w="60" w:type="dxa"/>
-            </w:tcMar>
-          </w:tcPr>
-          <w:p>
-            <w:pPr>
-              <w:jc w:val="center"/>
-            </w:pPr>
-            <w:r>
-              <w:rPr>
-                <w:rFonts w:ascii="Calibri" w:hAnsi="Calibri"/>
-                <w:color w:val="2D3748"/>
-                <w:sz w:val="17"/>
-              </w:rPr>
-              <w:t>122,278</w:t>
-            </w:r>
-          </w:p>
-        </w:tc>
-      </w:tr>
-    </w:tbl>
-    <w:p>
-      <w:pPr>
-        <w:spacing w:after="80"/>
-      </w:pPr>
-    </w:p>
-    <w:p>
-      <w:pPr>
-        <w:keepNext/>
-        <w:spacing w:before="160" w:after="40"/>
-      </w:pPr>
-      <w:r>
-        <w:rPr>
-          <w:rFonts w:ascii="Calibri" w:hAnsi="Calibri"/>
-          <w:b/>
-          <w:color w:val="1B365D"/>
-          <w:sz w:val="19"/>
-        </w:rPr>
-        <w:t>Table 9: Confusion Matrix for Dataset 2 (IBM AML) under Frozen Operational Threshold θ_audit* = 0.490.</w:t>
-      </w:r>
-    </w:p>
-    <w:tbl>
-      <w:tblPr>
-        <w:tblW w:type="auto" w:w="0"/>
-        <w:jc w:val="center"/>
-        <w:tblLook w:firstColumn="1" w:firstRow="1" w:lastColumn="0" w:lastRow="0" w:noHBand="0" w:noVBand="1" w:val="04A0"/>
-      </w:tblPr>
-      <w:tblGrid>
-        <w:gridCol w:w="2520"/>
-        <w:gridCol w:w="2520"/>
-        <w:gridCol w:w="2520"/>
-        <w:gridCol w:w="2520"/>
-      </w:tblGrid>
-      <w:tr>
-        <w:trPr>
-          <w:tblHeader/>
-          <w:cantSplit/>
-        </w:trPr>
-        <w:tc>
-          <w:tcPr>
-            <w:tcW w:type="dxa" w:w="2589"/>
-            <w:vAlign w:val="center"/>
-            <w:shd w:fill="1B365D"/>
-            <w:tcBorders>
-              <w:top w:val="single" w:sz="4" w:space="0" w:color="CBD5E0"/>
-              <w:left w:val="none"/>
-              <w:bottom w:val="double" w:sz="12" w:space="0" w:color="1B365D"/>
-              <w:right w:val="none"/>
-            </w:tcBorders>
-            <w:tcMar>
-              <w:top w:w="70" w:type="dxa"/>
-              <w:left w:w="60" w:type="dxa"/>
-              <w:bottom w:w="70" w:type="dxa"/>
-              <w:right w:w="60" w:type="dxa"/>
-            </w:tcMar>
-          </w:tcPr>
-          <w:p>
-            <w:pPr>
-              <w:jc w:val="center"/>
-            </w:pPr>
-            <w:r>
-              <w:rPr>
-                <w:rFonts w:ascii="Calibri" w:hAnsi="Calibri"/>
-                <w:b/>
-                <w:color w:val="FFFFFF"/>
-                <w:sz w:val="17"/>
-              </w:rPr>
-              <w:t>Actual \ Predicted</w:t>
-            </w:r>
-          </w:p>
-        </w:tc>
-        <w:tc>
-          <w:tcPr>
-            <w:tcW w:type="dxa" w:w="2390"/>
-            <w:vAlign w:val="center"/>
-            <w:shd w:fill="1B365D"/>
-            <w:tcBorders>
-              <w:top w:val="single" w:sz="4" w:space="0" w:color="CBD5E0"/>
-              <w:left w:val="none"/>
-              <w:bottom w:val="double" w:sz="12" w:space="0" w:color="1B365D"/>
-              <w:right w:val="none"/>
-            </w:tcBorders>
-            <w:tcMar>
-              <w:top w:w="70" w:type="dxa"/>
-              <w:left w:w="60" w:type="dxa"/>
-              <w:bottom w:w="70" w:type="dxa"/>
-              <w:right w:w="60" w:type="dxa"/>
-            </w:tcMar>
-          </w:tcPr>
-          <w:p>
-            <w:pPr>
-              <w:jc w:val="center"/>
-            </w:pPr>
-            <w:r>
-              <w:rPr>
-                <w:rFonts w:ascii="Calibri" w:hAnsi="Calibri"/>
-                <w:b/>
-                <w:color w:val="FFFFFF"/>
-                <w:sz w:val="17"/>
-              </w:rPr>
-              <w:t>Pred. Non-Fraud</w:t>
-            </w:r>
-          </w:p>
-        </w:tc>
-        <w:tc>
-          <w:tcPr>
-            <w:tcW w:type="dxa" w:w="2390"/>
-            <w:vAlign w:val="center"/>
-            <w:shd w:fill="1B365D"/>
-            <w:tcBorders>
-              <w:top w:val="single" w:sz="4" w:space="0" w:color="CBD5E0"/>
-              <w:left w:val="none"/>
-              <w:bottom w:val="double" w:sz="12" w:space="0" w:color="1B365D"/>
-              <w:right w:val="none"/>
-            </w:tcBorders>
-            <w:tcMar>
-              <w:top w:w="70" w:type="dxa"/>
-              <w:left w:w="60" w:type="dxa"/>
-              <w:bottom w:w="70" w:type="dxa"/>
-              <w:right w:w="60" w:type="dxa"/>
-            </w:tcMar>
-          </w:tcPr>
-          <w:p>
-            <w:pPr>
-              <w:jc w:val="center"/>
-            </w:pPr>
-            <w:r>
-              <w:rPr>
-                <w:rFonts w:ascii="Calibri" w:hAnsi="Calibri"/>
-                <w:b/>
-                <w:color w:val="FFFFFF"/>
-                <w:sz w:val="17"/>
-              </w:rPr>
-              <w:t>Pred. Fraud</w:t>
-            </w:r>
-          </w:p>
-        </w:tc>
-        <w:tc>
-          <w:tcPr>
-            <w:tcW w:type="dxa" w:w="1991"/>
-            <w:vAlign w:val="center"/>
-            <w:shd w:fill="1B365D"/>
-            <w:tcBorders>
-              <w:top w:val="single" w:sz="4" w:space="0" w:color="CBD5E0"/>
-              <w:left w:val="none"/>
-              <w:bottom w:val="double" w:sz="12" w:space="0" w:color="1B365D"/>
-              <w:right w:val="none"/>
-            </w:tcBorders>
-            <w:tcMar>
-              <w:top w:w="70" w:type="dxa"/>
-              <w:left w:w="60" w:type="dxa"/>
-              <w:bottom w:w="70" w:type="dxa"/>
-              <w:right w:w="60" w:type="dxa"/>
-            </w:tcMar>
-          </w:tcPr>
-          <w:p>
-            <w:pPr>
-              <w:jc w:val="center"/>
-            </w:pPr>
-            <w:r>
-              <w:rPr>
-                <w:rFonts w:ascii="Calibri" w:hAnsi="Calibri"/>
-                <w:b/>
-                <w:color w:val="FFFFFF"/>
-                <w:sz w:val="17"/>
-              </w:rPr>
-              <w:t>Total Actual</w:t>
-            </w:r>
-          </w:p>
-        </w:tc>
-      </w:tr>
-      <w:tr>
-        <w:trPr>
-          <w:cantSplit/>
-        </w:trPr>
-        <w:tc>
-          <w:tcPr>
-            <w:tcW w:type="dxa" w:w="2589"/>
-            <w:vAlign w:val="center"/>
-            <w:shd w:fill="F7FAFC"/>
-            <w:tcBorders>
-              <w:top w:val="single" w:sz="4" w:space="0" w:color="CBD5E0"/>
-              <w:left w:val="none"/>
-              <w:bottom w:val="single" w:sz="4" w:space="0" w:color="CBD5E0"/>
-              <w:right w:val="none"/>
-            </w:tcBorders>
-            <w:tcMar>
-              <w:top w:w="70" w:type="dxa"/>
-              <w:left w:w="60" w:type="dxa"/>
-              <w:bottom w:w="70" w:type="dxa"/>
-              <w:right w:w="60" w:type="dxa"/>
-            </w:tcMar>
-          </w:tcPr>
-          <w:p>
-            <w:pPr>
-              <w:jc w:val="left"/>
-            </w:pPr>
-            <w:r>
-              <w:rPr>
-                <w:rFonts w:ascii="Calibri" w:hAnsi="Calibri"/>
-                <w:color w:val="2D3748"/>
-                <w:sz w:val="17"/>
-              </w:rPr>
-              <w:t>Actual Non-Fraud</w:t>
-            </w:r>
-          </w:p>
-        </w:tc>
-        <w:tc>
-          <w:tcPr>
-            <w:tcW w:type="dxa" w:w="2390"/>
-            <w:vAlign w:val="center"/>
-            <w:shd w:fill="F7FAFC"/>
-            <w:tcBorders>
-              <w:top w:val="single" w:sz="4" w:space="0" w:color="CBD5E0"/>
-              <w:left w:val="none"/>
-              <w:bottom w:val="single" w:sz="4" w:space="0" w:color="CBD5E0"/>
-              <w:right w:val="none"/>
-            </w:tcBorders>
-            <w:tcMar>
-              <w:top w:w="70" w:type="dxa"/>
-              <w:left w:w="60" w:type="dxa"/>
-              <w:bottom w:w="70" w:type="dxa"/>
-              <w:right w:w="60" w:type="dxa"/>
-            </w:tcMar>
-          </w:tcPr>
-          <w:p>
-            <w:pPr>
-              <w:jc w:val="center"/>
-            </w:pPr>
-            <w:r>
-              <w:rPr>
-                <w:rFonts w:ascii="Calibri" w:hAnsi="Calibri"/>
-                <w:color w:val="2D3748"/>
-                <w:sz w:val="17"/>
-              </w:rPr>
-              <w:t>265,822 (TN: 99.86%)</w:t>
-            </w:r>
-          </w:p>
-        </w:tc>
-        <w:tc>
-          <w:tcPr>
-            <w:tcW w:type="dxa" w:w="2390"/>
-            <w:vAlign w:val="center"/>
-            <w:shd w:fill="F7FAFC"/>
-            <w:tcBorders>
-              <w:top w:val="single" w:sz="4" w:space="0" w:color="CBD5E0"/>
-              <w:left w:val="none"/>
-              <w:bottom w:val="single" w:sz="4" w:space="0" w:color="CBD5E0"/>
-              <w:right w:val="none"/>
-            </w:tcBorders>
-            <w:tcMar>
-              <w:top w:w="70" w:type="dxa"/>
-              <w:left w:w="60" w:type="dxa"/>
-              <w:bottom w:w="70" w:type="dxa"/>
-              <w:right w:w="60" w:type="dxa"/>
-            </w:tcMar>
-          </w:tcPr>
-          <w:p>
-            <w:pPr>
-              <w:jc w:val="center"/>
-            </w:pPr>
-            <w:r>
-              <w:rPr>
-                <w:rFonts w:ascii="Calibri" w:hAnsi="Calibri"/>
-                <w:color w:val="2D3748"/>
-                <w:sz w:val="17"/>
-              </w:rPr>
-              <w:t>0 (FP: 0.00%)</w:t>
-            </w:r>
-          </w:p>
-        </w:tc>
-        <w:tc>
-          <w:tcPr>
-            <w:tcW w:type="dxa" w:w="1991"/>
-            <w:vAlign w:val="center"/>
-            <w:shd w:fill="F7FAFC"/>
-            <w:tcBorders>
-              <w:top w:val="single" w:sz="4" w:space="0" w:color="CBD5E0"/>
-              <w:left w:val="none"/>
-              <w:bottom w:val="single" w:sz="4" w:space="0" w:color="CBD5E0"/>
-              <w:right w:val="none"/>
-            </w:tcBorders>
-            <w:tcMar>
-              <w:top w:w="70" w:type="dxa"/>
-              <w:left w:w="60" w:type="dxa"/>
-              <w:bottom w:w="70" w:type="dxa"/>
-              <w:right w:w="60" w:type="dxa"/>
-            </w:tcMar>
-          </w:tcPr>
-          <w:p>
-            <w:pPr>
-              <w:jc w:val="center"/>
-            </w:pPr>
-            <w:r>
-              <w:rPr>
-                <w:rFonts w:ascii="Calibri" w:hAnsi="Calibri"/>
-                <w:color w:val="2D3748"/>
-                <w:sz w:val="17"/>
-              </w:rPr>
-              <w:t>265,822</w:t>
-            </w:r>
-          </w:p>
-        </w:tc>
-      </w:tr>
-      <w:tr>
-        <w:trPr>
-          <w:cantSplit/>
-        </w:trPr>
-        <w:tc>
-          <w:tcPr>
-            <w:tcW w:type="dxa" w:w="2589"/>
-            <w:vAlign w:val="center"/>
-            <w:shd w:fill="FFFFFF"/>
-            <w:tcBorders>
-              <w:top w:val="single" w:sz="4" w:space="0" w:color="CBD5E0"/>
-              <w:left w:val="none"/>
-              <w:bottom w:val="single" w:sz="4" w:space="0" w:color="CBD5E0"/>
-              <w:right w:val="none"/>
-            </w:tcBorders>
-            <w:tcMar>
-              <w:top w:w="70" w:type="dxa"/>
-              <w:left w:w="60" w:type="dxa"/>
-              <w:bottom w:w="70" w:type="dxa"/>
-              <w:right w:w="60" w:type="dxa"/>
-            </w:tcMar>
-          </w:tcPr>
-          <w:p>
-            <w:pPr>
-              <w:jc w:val="left"/>
-            </w:pPr>
-            <w:r>
-              <w:rPr>
-                <w:rFonts w:ascii="Calibri" w:hAnsi="Calibri"/>
-                <w:color w:val="2D3748"/>
-                <w:sz w:val="17"/>
-              </w:rPr>
-              <w:t>Actual Fraud</w:t>
-            </w:r>
-          </w:p>
-        </w:tc>
-        <w:tc>
-          <w:tcPr>
-            <w:tcW w:type="dxa" w:w="2390"/>
-            <w:vAlign w:val="center"/>
-            <w:shd w:fill="FFFFFF"/>
-            <w:tcBorders>
-              <w:top w:val="single" w:sz="4" w:space="0" w:color="CBD5E0"/>
-              <w:left w:val="none"/>
-              <w:bottom w:val="single" w:sz="4" w:space="0" w:color="CBD5E0"/>
-              <w:right w:val="none"/>
-            </w:tcBorders>
-            <w:tcMar>
-              <w:top w:w="70" w:type="dxa"/>
-              <w:left w:w="60" w:type="dxa"/>
-              <w:bottom w:w="70" w:type="dxa"/>
-              <w:right w:w="60" w:type="dxa"/>
-            </w:tcMar>
-          </w:tcPr>
-          <w:p>
-            <w:pPr>
-              <w:jc w:val="center"/>
-            </w:pPr>
-            <w:r>
-              <w:rPr>
-                <w:rFonts w:ascii="Calibri" w:hAnsi="Calibri"/>
-                <w:color w:val="2D3748"/>
-                <w:sz w:val="17"/>
-              </w:rPr>
-              <w:t>0 (FN: 0.00%)</w:t>
-            </w:r>
-          </w:p>
-        </w:tc>
-        <w:tc>
-          <w:tcPr>
-            <w:tcW w:type="dxa" w:w="2390"/>
-            <w:vAlign w:val="center"/>
-            <w:shd w:fill="FFFFFF"/>
-            <w:tcBorders>
-              <w:top w:val="single" w:sz="4" w:space="0" w:color="CBD5E0"/>
-              <w:left w:val="none"/>
-              <w:bottom w:val="single" w:sz="4" w:space="0" w:color="CBD5E0"/>
-              <w:right w:val="none"/>
-            </w:tcBorders>
-            <w:tcMar>
-              <w:top w:w="70" w:type="dxa"/>
-              <w:left w:w="60" w:type="dxa"/>
-              <w:bottom w:w="70" w:type="dxa"/>
-              <w:right w:w="60" w:type="dxa"/>
-            </w:tcMar>
-          </w:tcPr>
-          <w:p>
-            <w:pPr>
-              <w:jc w:val="center"/>
-            </w:pPr>
-            <w:r>
-              <w:rPr>
-                <w:rFonts w:ascii="Calibri" w:hAnsi="Calibri"/>
-                <w:color w:val="2D3748"/>
-                <w:sz w:val="17"/>
-              </w:rPr>
-              <w:t>377 (TP: 0.14%)</w:t>
-            </w:r>
-          </w:p>
-        </w:tc>
-        <w:tc>
-          <w:tcPr>
-            <w:tcW w:type="dxa" w:w="1991"/>
-            <w:vAlign w:val="center"/>
-            <w:shd w:fill="FFFFFF"/>
-            <w:tcBorders>
-              <w:top w:val="single" w:sz="4" w:space="0" w:color="CBD5E0"/>
-              <w:left w:val="none"/>
-              <w:bottom w:val="single" w:sz="4" w:space="0" w:color="CBD5E0"/>
-              <w:right w:val="none"/>
-            </w:tcBorders>
-            <w:tcMar>
-              <w:top w:w="70" w:type="dxa"/>
-              <w:left w:w="60" w:type="dxa"/>
-              <w:bottom w:w="70" w:type="dxa"/>
-              <w:right w:w="60" w:type="dxa"/>
-            </w:tcMar>
-          </w:tcPr>
-          <w:p>
-            <w:pPr>
-              <w:jc w:val="center"/>
-            </w:pPr>
-            <w:r>
-              <w:rPr>
-                <w:rFonts w:ascii="Calibri" w:hAnsi="Calibri"/>
-                <w:color w:val="2D3748"/>
-                <w:sz w:val="17"/>
-              </w:rPr>
-              <w:t>377</w:t>
-            </w:r>
-          </w:p>
-        </w:tc>
-      </w:tr>
-      <w:tr>
-        <w:trPr>
-          <w:cantSplit/>
-        </w:trPr>
-        <w:tc>
-          <w:tcPr>
-            <w:tcW w:type="dxa" w:w="2589"/>
-            <w:vAlign w:val="center"/>
-            <w:shd w:fill="F7FAFC"/>
-            <w:tcBorders>
-              <w:top w:val="single" w:sz="4" w:space="0" w:color="CBD5E0"/>
-              <w:left w:val="none"/>
-              <w:bottom w:val="single" w:sz="4" w:space="0" w:color="CBD5E0"/>
-              <w:right w:val="none"/>
-            </w:tcBorders>
-            <w:tcMar>
-              <w:top w:w="70" w:type="dxa"/>
-              <w:left w:w="60" w:type="dxa"/>
-              <w:bottom w:w="70" w:type="dxa"/>
-              <w:right w:w="60" w:type="dxa"/>
-            </w:tcMar>
-          </w:tcPr>
-          <w:p>
-            <w:pPr>
-              <w:jc w:val="left"/>
-            </w:pPr>
-            <w:r>
-              <w:rPr>
-                <w:rFonts w:ascii="Calibri" w:hAnsi="Calibri"/>
-                <w:color w:val="2D3748"/>
-                <w:sz w:val="17"/>
-              </w:rPr>
-              <w:t>Total Predicted</w:t>
-            </w:r>
-          </w:p>
-        </w:tc>
-        <w:tc>
-          <w:tcPr>
-            <w:tcW w:type="dxa" w:w="2390"/>
-            <w:vAlign w:val="center"/>
-            <w:shd w:fill="F7FAFC"/>
-            <w:tcBorders>
-              <w:top w:val="single" w:sz="4" w:space="0" w:color="CBD5E0"/>
-              <w:left w:val="none"/>
-              <w:bottom w:val="single" w:sz="4" w:space="0" w:color="CBD5E0"/>
-              <w:right w:val="none"/>
-            </w:tcBorders>
-            <w:tcMar>
-              <w:top w:w="70" w:type="dxa"/>
-              <w:left w:w="60" w:type="dxa"/>
-              <w:bottom w:w="70" w:type="dxa"/>
-              <w:right w:w="60" w:type="dxa"/>
-            </w:tcMar>
-          </w:tcPr>
-          <w:p>
-            <w:pPr>
-              <w:jc w:val="center"/>
-            </w:pPr>
-            <w:r>
-              <w:rPr>
-                <w:rFonts w:ascii="Calibri" w:hAnsi="Calibri"/>
-                <w:color w:val="2D3748"/>
-                <w:sz w:val="17"/>
-              </w:rPr>
-              <w:t>265,822 (99.86%)</w:t>
-            </w:r>
-          </w:p>
-        </w:tc>
-        <w:tc>
-          <w:tcPr>
-            <w:tcW w:type="dxa" w:w="2390"/>
-            <w:vAlign w:val="center"/>
-            <w:shd w:fill="F7FAFC"/>
-            <w:tcBorders>
-              <w:top w:val="single" w:sz="4" w:space="0" w:color="CBD5E0"/>
-              <w:left w:val="none"/>
-              <w:bottom w:val="single" w:sz="4" w:space="0" w:color="CBD5E0"/>
-              <w:right w:val="none"/>
-            </w:tcBorders>
-            <w:tcMar>
-              <w:top w:w="70" w:type="dxa"/>
-              <w:left w:w="60" w:type="dxa"/>
-              <w:bottom w:w="70" w:type="dxa"/>
-              <w:right w:w="60" w:type="dxa"/>
-            </w:tcMar>
-          </w:tcPr>
-          <w:p>
-            <w:pPr>
-              <w:jc w:val="center"/>
-            </w:pPr>
-            <w:r>
-              <w:rPr>
-                <w:rFonts w:ascii="Calibri" w:hAnsi="Calibri"/>
-                <w:color w:val="2D3748"/>
-                <w:sz w:val="17"/>
-              </w:rPr>
-              <w:t>377 (0.14%)</w:t>
-            </w:r>
-          </w:p>
-        </w:tc>
-        <w:tc>
-          <w:tcPr>
-            <w:tcW w:type="dxa" w:w="1991"/>
-            <w:vAlign w:val="center"/>
-            <w:shd w:fill="F7FAFC"/>
-            <w:tcBorders>
-              <w:top w:val="single" w:sz="4" w:space="0" w:color="CBD5E0"/>
-              <w:left w:val="none"/>
-              <w:bottom w:val="single" w:sz="4" w:space="0" w:color="CBD5E0"/>
-              <w:right w:val="none"/>
-            </w:tcBorders>
-            <w:tcMar>
-              <w:top w:w="70" w:type="dxa"/>
-              <w:left w:w="60" w:type="dxa"/>
-              <w:bottom w:w="70" w:type="dxa"/>
-              <w:right w:w="60" w:type="dxa"/>
-            </w:tcMar>
-          </w:tcPr>
-          <w:p>
-            <w:pPr>
-              <w:jc w:val="center"/>
-            </w:pPr>
-            <w:r>
-              <w:rPr>
-                <w:rFonts w:ascii="Calibri" w:hAnsi="Calibri"/>
-                <w:color w:val="2D3748"/>
-                <w:sz w:val="17"/>
-              </w:rPr>
-              <w:t>266,199</w:t>
-            </w:r>
-          </w:p>
-        </w:tc>
-      </w:tr>
-    </w:tbl>
-    <w:p>
-      <w:pPr>
-        <w:spacing w:after="80"/>
-      </w:pPr>
-    </w:p>
-    <w:p>
-      <w:pPr>
-        <w:keepNext/>
-        <w:spacing w:before="160" w:after="40"/>
-      </w:pPr>
-      <w:r>
-        <w:rPr>
-          <w:rFonts w:ascii="Calibri" w:hAnsi="Calibri"/>
-          <w:b/>
-          <w:color w:val="1B365D"/>
-          <w:sz w:val="19"/>
-        </w:rPr>
-        <w:t>Table 10: Confusion Matrix for Dataset 3 (SAP Würzburg) under Frozen Operational Threshold θ_audit* = 0.215.</w:t>
-      </w:r>
-    </w:p>
-    <w:tbl>
-      <w:tblPr>
-        <w:tblW w:type="auto" w:w="0"/>
-        <w:jc w:val="center"/>
-        <w:tblLook w:firstColumn="1" w:firstRow="1" w:lastColumn="0" w:lastRow="0" w:noHBand="0" w:noVBand="1" w:val="04A0"/>
-      </w:tblPr>
-      <w:tblGrid>
-        <w:gridCol w:w="2520"/>
-        <w:gridCol w:w="2520"/>
-        <w:gridCol w:w="2520"/>
-        <w:gridCol w:w="2520"/>
-      </w:tblGrid>
-      <w:tr>
-        <w:trPr>
-          <w:tblHeader/>
-          <w:cantSplit/>
-        </w:trPr>
-        <w:tc>
-          <w:tcPr>
-            <w:tcW w:type="dxa" w:w="2589"/>
-            <w:vAlign w:val="center"/>
-            <w:shd w:fill="1B365D"/>
-            <w:tcBorders>
-              <w:top w:val="single" w:sz="4" w:space="0" w:color="CBD5E0"/>
-              <w:left w:val="none"/>
-              <w:bottom w:val="double" w:sz="12" w:space="0" w:color="1B365D"/>
-              <w:right w:val="none"/>
-            </w:tcBorders>
-            <w:tcMar>
-              <w:top w:w="70" w:type="dxa"/>
-              <w:left w:w="60" w:type="dxa"/>
-              <w:bottom w:w="70" w:type="dxa"/>
-              <w:right w:w="60" w:type="dxa"/>
-            </w:tcMar>
-          </w:tcPr>
-          <w:p>
-            <w:pPr>
-              <w:jc w:val="center"/>
-            </w:pPr>
-            <w:r>
-              <w:rPr>
-                <w:rFonts w:ascii="Calibri" w:hAnsi="Calibri"/>
-                <w:b/>
-                <w:color w:val="FFFFFF"/>
-                <w:sz w:val="17"/>
-              </w:rPr>
-              <w:t>Actual \ Predicted</w:t>
-            </w:r>
-          </w:p>
-        </w:tc>
-        <w:tc>
-          <w:tcPr>
-            <w:tcW w:type="dxa" w:w="2390"/>
-            <w:vAlign w:val="center"/>
-            <w:shd w:fill="1B365D"/>
-            <w:tcBorders>
-              <w:top w:val="single" w:sz="4" w:space="0" w:color="CBD5E0"/>
-              <w:left w:val="none"/>
-              <w:bottom w:val="double" w:sz="12" w:space="0" w:color="1B365D"/>
-              <w:right w:val="none"/>
-            </w:tcBorders>
-            <w:tcMar>
-              <w:top w:w="70" w:type="dxa"/>
-              <w:left w:w="60" w:type="dxa"/>
-              <w:bottom w:w="70" w:type="dxa"/>
-              <w:right w:w="60" w:type="dxa"/>
-            </w:tcMar>
-          </w:tcPr>
-          <w:p>
-            <w:pPr>
-              <w:jc w:val="center"/>
-            </w:pPr>
-            <w:r>
-              <w:rPr>
-                <w:rFonts w:ascii="Calibri" w:hAnsi="Calibri"/>
-                <w:b/>
-                <w:color w:val="FFFFFF"/>
-                <w:sz w:val="17"/>
-              </w:rPr>
-              <w:t>Pred. Non-Fraud</w:t>
-            </w:r>
-          </w:p>
-        </w:tc>
-        <w:tc>
-          <w:tcPr>
-            <w:tcW w:type="dxa" w:w="2390"/>
-            <w:vAlign w:val="center"/>
-            <w:shd w:fill="1B365D"/>
-            <w:tcBorders>
-              <w:top w:val="single" w:sz="4" w:space="0" w:color="CBD5E0"/>
-              <w:left w:val="none"/>
-              <w:bottom w:val="double" w:sz="12" w:space="0" w:color="1B365D"/>
-              <w:right w:val="none"/>
-            </w:tcBorders>
-            <w:tcMar>
-              <w:top w:w="70" w:type="dxa"/>
-              <w:left w:w="60" w:type="dxa"/>
-              <w:bottom w:w="70" w:type="dxa"/>
-              <w:right w:w="60" w:type="dxa"/>
-            </w:tcMar>
-          </w:tcPr>
-          <w:p>
-            <w:pPr>
-              <w:jc w:val="center"/>
-            </w:pPr>
-            <w:r>
-              <w:rPr>
-                <w:rFonts w:ascii="Calibri" w:hAnsi="Calibri"/>
-                <w:b/>
-                <w:color w:val="FFFFFF"/>
-                <w:sz w:val="17"/>
-              </w:rPr>
-              <w:t>Pred. Fraud</w:t>
-            </w:r>
-          </w:p>
-        </w:tc>
-        <w:tc>
-          <w:tcPr>
-            <w:tcW w:type="dxa" w:w="1991"/>
-            <w:vAlign w:val="center"/>
-            <w:shd w:fill="1B365D"/>
-            <w:tcBorders>
-              <w:top w:val="single" w:sz="4" w:space="0" w:color="CBD5E0"/>
-              <w:left w:val="none"/>
-              <w:bottom w:val="double" w:sz="12" w:space="0" w:color="1B365D"/>
-              <w:right w:val="none"/>
-            </w:tcBorders>
-            <w:tcMar>
-              <w:top w:w="70" w:type="dxa"/>
-              <w:left w:w="60" w:type="dxa"/>
-              <w:bottom w:w="70" w:type="dxa"/>
-              <w:right w:w="60" w:type="dxa"/>
-            </w:tcMar>
-          </w:tcPr>
-          <w:p>
-            <w:pPr>
-              <w:jc w:val="center"/>
-            </w:pPr>
-            <w:r>
-              <w:rPr>
-                <w:rFonts w:ascii="Calibri" w:hAnsi="Calibri"/>
-                <w:b/>
-                <w:color w:val="FFFFFF"/>
-                <w:sz w:val="17"/>
-              </w:rPr>
-              <w:t>Total Actual</w:t>
-            </w:r>
-          </w:p>
-        </w:tc>
-      </w:tr>
-      <w:tr>
-        <w:trPr>
-          <w:cantSplit/>
-        </w:trPr>
-        <w:tc>
-          <w:tcPr>
-            <w:tcW w:type="dxa" w:w="2589"/>
-            <w:vAlign w:val="center"/>
-            <w:shd w:fill="F7FAFC"/>
-            <w:tcBorders>
-              <w:top w:val="single" w:sz="4" w:space="0" w:color="CBD5E0"/>
-              <w:left w:val="none"/>
-              <w:bottom w:val="single" w:sz="4" w:space="0" w:color="CBD5E0"/>
-              <w:right w:val="none"/>
-            </w:tcBorders>
-            <w:tcMar>
-              <w:top w:w="70" w:type="dxa"/>
-              <w:left w:w="60" w:type="dxa"/>
-              <w:bottom w:w="70" w:type="dxa"/>
-              <w:right w:w="60" w:type="dxa"/>
-            </w:tcMar>
-          </w:tcPr>
-          <w:p>
-            <w:pPr>
-              <w:jc w:val="left"/>
-            </w:pPr>
-            <w:r>
-              <w:rPr>
-                <w:rFonts w:ascii="Calibri" w:hAnsi="Calibri"/>
-                <w:color w:val="2D3748"/>
-                <w:sz w:val="17"/>
-              </w:rPr>
-              <w:t>Actual Non-Fraud</w:t>
-            </w:r>
-          </w:p>
-        </w:tc>
-        <w:tc>
-          <w:tcPr>
-            <w:tcW w:type="dxa" w:w="2390"/>
-            <w:vAlign w:val="center"/>
-            <w:shd w:fill="F7FAFC"/>
-            <w:tcBorders>
-              <w:top w:val="single" w:sz="4" w:space="0" w:color="CBD5E0"/>
-              <w:left w:val="none"/>
-              <w:bottom w:val="single" w:sz="4" w:space="0" w:color="CBD5E0"/>
-              <w:right w:val="none"/>
-            </w:tcBorders>
-            <w:tcMar>
-              <w:top w:w="70" w:type="dxa"/>
-              <w:left w:w="60" w:type="dxa"/>
-              <w:bottom w:w="70" w:type="dxa"/>
-              <w:right w:w="60" w:type="dxa"/>
-            </w:tcMar>
-          </w:tcPr>
-          <w:p>
-            <w:pPr>
-              <w:jc w:val="center"/>
-            </w:pPr>
-            <w:r>
-              <w:rPr>
-                <w:rFonts w:ascii="Calibri" w:hAnsi="Calibri"/>
-                <w:color w:val="2D3748"/>
-                <w:sz w:val="17"/>
-              </w:rPr>
-              <w:t>40,062 (TN: 99.81%)</w:t>
-            </w:r>
-          </w:p>
-        </w:tc>
-        <w:tc>
-          <w:tcPr>
-            <w:tcW w:type="dxa" w:w="2390"/>
-            <w:vAlign w:val="center"/>
-            <w:shd w:fill="F7FAFC"/>
-            <w:tcBorders>
-              <w:top w:val="single" w:sz="4" w:space="0" w:color="CBD5E0"/>
-              <w:left w:val="none"/>
-              <w:bottom w:val="single" w:sz="4" w:space="0" w:color="CBD5E0"/>
-              <w:right w:val="none"/>
-            </w:tcBorders>
-            <w:tcMar>
-              <w:top w:w="70" w:type="dxa"/>
-              <w:left w:w="60" w:type="dxa"/>
-              <w:bottom w:w="70" w:type="dxa"/>
-              <w:right w:w="60" w:type="dxa"/>
-            </w:tcMar>
-          </w:tcPr>
-          <w:p>
-            <w:pPr>
-              <w:jc w:val="center"/>
-            </w:pPr>
-            <w:r>
-              <w:rPr>
-                <w:rFonts w:ascii="Calibri" w:hAnsi="Calibri"/>
-                <w:color w:val="2D3748"/>
-                <w:sz w:val="17"/>
-              </w:rPr>
-              <w:t>52 (FP: 0.13%)</w:t>
-            </w:r>
-          </w:p>
-        </w:tc>
-        <w:tc>
-          <w:tcPr>
-            <w:tcW w:type="dxa" w:w="1991"/>
-            <w:vAlign w:val="center"/>
-            <w:shd w:fill="F7FAFC"/>
-            <w:tcBorders>
-              <w:top w:val="single" w:sz="4" w:space="0" w:color="CBD5E0"/>
-              <w:left w:val="none"/>
-              <w:bottom w:val="single" w:sz="4" w:space="0" w:color="CBD5E0"/>
-              <w:right w:val="none"/>
-            </w:tcBorders>
-            <w:tcMar>
-              <w:top w:w="70" w:type="dxa"/>
-              <w:left w:w="60" w:type="dxa"/>
-              <w:bottom w:w="70" w:type="dxa"/>
-              <w:right w:w="60" w:type="dxa"/>
-            </w:tcMar>
-          </w:tcPr>
-          <w:p>
-            <w:pPr>
-              <w:jc w:val="center"/>
-            </w:pPr>
-            <w:r>
-              <w:rPr>
-                <w:rFonts w:ascii="Calibri" w:hAnsi="Calibri"/>
-                <w:color w:val="2D3748"/>
-                <w:sz w:val="17"/>
-              </w:rPr>
-              <w:t>40,114</w:t>
-            </w:r>
-          </w:p>
-        </w:tc>
-      </w:tr>
-      <w:tr>
-        <w:trPr>
-          <w:cantSplit/>
-        </w:trPr>
-        <w:tc>
-          <w:tcPr>
-            <w:tcW w:type="dxa" w:w="2589"/>
-            <w:vAlign w:val="center"/>
-            <w:shd w:fill="FFFFFF"/>
-            <w:tcBorders>
-              <w:top w:val="single" w:sz="4" w:space="0" w:color="CBD5E0"/>
-              <w:left w:val="none"/>
-              <w:bottom w:val="single" w:sz="4" w:space="0" w:color="CBD5E0"/>
-              <w:right w:val="none"/>
-            </w:tcBorders>
-            <w:tcMar>
-              <w:top w:w="70" w:type="dxa"/>
-              <w:left w:w="60" w:type="dxa"/>
-              <w:bottom w:w="70" w:type="dxa"/>
-              <w:right w:w="60" w:type="dxa"/>
-            </w:tcMar>
-          </w:tcPr>
-          <w:p>
-            <w:pPr>
-              <w:jc w:val="left"/>
-            </w:pPr>
-            <w:r>
-              <w:rPr>
-                <w:rFonts w:ascii="Calibri" w:hAnsi="Calibri"/>
-                <w:color w:val="2D3748"/>
-                <w:sz w:val="17"/>
-              </w:rPr>
-              <w:t>Actual Fraud</w:t>
-            </w:r>
-          </w:p>
-        </w:tc>
-        <w:tc>
-          <w:tcPr>
-            <w:tcW w:type="dxa" w:w="2390"/>
-            <w:vAlign w:val="center"/>
-            <w:shd w:fill="FFFFFF"/>
-            <w:tcBorders>
-              <w:top w:val="single" w:sz="4" w:space="0" w:color="CBD5E0"/>
-              <w:left w:val="none"/>
-              <w:bottom w:val="single" w:sz="4" w:space="0" w:color="CBD5E0"/>
-              <w:right w:val="none"/>
-            </w:tcBorders>
-            <w:tcMar>
-              <w:top w:w="70" w:type="dxa"/>
-              <w:left w:w="60" w:type="dxa"/>
-              <w:bottom w:w="70" w:type="dxa"/>
-              <w:right w:w="60" w:type="dxa"/>
-            </w:tcMar>
-          </w:tcPr>
-          <w:p>
-            <w:pPr>
-              <w:jc w:val="center"/>
-            </w:pPr>
-            <w:r>
-              <w:rPr>
-                <w:rFonts w:ascii="Calibri" w:hAnsi="Calibri"/>
-                <w:color w:val="2D3748"/>
-                <w:sz w:val="17"/>
-              </w:rPr>
-              <w:t>17 (FN: 0.04%)</w:t>
-            </w:r>
-          </w:p>
-        </w:tc>
-        <w:tc>
-          <w:tcPr>
-            <w:tcW w:type="dxa" w:w="2390"/>
-            <w:vAlign w:val="center"/>
-            <w:shd w:fill="FFFFFF"/>
-            <w:tcBorders>
-              <w:top w:val="single" w:sz="4" w:space="0" w:color="CBD5E0"/>
-              <w:left w:val="none"/>
-              <w:bottom w:val="single" w:sz="4" w:space="0" w:color="CBD5E0"/>
-              <w:right w:val="none"/>
-            </w:tcBorders>
-            <w:tcMar>
-              <w:top w:w="70" w:type="dxa"/>
-              <w:left w:w="60" w:type="dxa"/>
-              <w:bottom w:w="70" w:type="dxa"/>
-              <w:right w:w="60" w:type="dxa"/>
-            </w:tcMar>
-          </w:tcPr>
-          <w:p>
-            <w:pPr>
-              <w:jc w:val="center"/>
-            </w:pPr>
-            <w:r>
-              <w:rPr>
-                <w:rFonts w:ascii="Calibri" w:hAnsi="Calibri"/>
-                <w:color w:val="2D3748"/>
-                <w:sz w:val="17"/>
-              </w:rPr>
-              <w:t>8 (TP: 0.02%)</w:t>
-            </w:r>
-          </w:p>
-        </w:tc>
-        <w:tc>
-          <w:tcPr>
-            <w:tcW w:type="dxa" w:w="1991"/>
-            <w:vAlign w:val="center"/>
-            <w:shd w:fill="FFFFFF"/>
-            <w:tcBorders>
-              <w:top w:val="single" w:sz="4" w:space="0" w:color="CBD5E0"/>
-              <w:left w:val="none"/>
-              <w:bottom w:val="single" w:sz="4" w:space="0" w:color="CBD5E0"/>
-              <w:right w:val="none"/>
-            </w:tcBorders>
-            <w:tcMar>
-              <w:top w:w="70" w:type="dxa"/>
-              <w:left w:w="60" w:type="dxa"/>
-              <w:bottom w:w="70" w:type="dxa"/>
-              <w:right w:w="60" w:type="dxa"/>
-            </w:tcMar>
-          </w:tcPr>
-          <w:p>
-            <w:pPr>
-              <w:jc w:val="center"/>
-            </w:pPr>
-            <w:r>
-              <w:rPr>
-                <w:rFonts w:ascii="Calibri" w:hAnsi="Calibri"/>
-                <w:color w:val="2D3748"/>
-                <w:sz w:val="17"/>
-              </w:rPr>
-              <w:t>25</w:t>
-            </w:r>
-          </w:p>
-        </w:tc>
-      </w:tr>
-      <w:tr>
-        <w:trPr>
-          <w:cantSplit/>
-        </w:trPr>
-        <w:tc>
-          <w:tcPr>
-            <w:tcW w:type="dxa" w:w="2589"/>
-            <w:vAlign w:val="center"/>
-            <w:shd w:fill="F7FAFC"/>
-            <w:tcBorders>
-              <w:top w:val="single" w:sz="4" w:space="0" w:color="CBD5E0"/>
-              <w:left w:val="none"/>
-              <w:bottom w:val="single" w:sz="4" w:space="0" w:color="CBD5E0"/>
-              <w:right w:val="none"/>
-            </w:tcBorders>
-            <w:tcMar>
-              <w:top w:w="70" w:type="dxa"/>
-              <w:left w:w="60" w:type="dxa"/>
-              <w:bottom w:w="70" w:type="dxa"/>
-              <w:right w:w="60" w:type="dxa"/>
-            </w:tcMar>
-          </w:tcPr>
-          <w:p>
-            <w:pPr>
-              <w:jc w:val="left"/>
-            </w:pPr>
-            <w:r>
-              <w:rPr>
-                <w:rFonts w:ascii="Calibri" w:hAnsi="Calibri"/>
-                <w:color w:val="2D3748"/>
-                <w:sz w:val="17"/>
-              </w:rPr>
-              <w:t>Total Predicted</w:t>
-            </w:r>
-          </w:p>
-        </w:tc>
-        <w:tc>
-          <w:tcPr>
-            <w:tcW w:type="dxa" w:w="2390"/>
-            <w:vAlign w:val="center"/>
-            <w:shd w:fill="F7FAFC"/>
-            <w:tcBorders>
-              <w:top w:val="single" w:sz="4" w:space="0" w:color="CBD5E0"/>
-              <w:left w:val="none"/>
-              <w:bottom w:val="single" w:sz="4" w:space="0" w:color="CBD5E0"/>
-              <w:right w:val="none"/>
-            </w:tcBorders>
-            <w:tcMar>
-              <w:top w:w="70" w:type="dxa"/>
-              <w:left w:w="60" w:type="dxa"/>
-              <w:bottom w:w="70" w:type="dxa"/>
-              <w:right w:w="60" w:type="dxa"/>
-            </w:tcMar>
-          </w:tcPr>
-          <w:p>
-            <w:pPr>
-              <w:jc w:val="center"/>
-            </w:pPr>
-            <w:r>
-              <w:rPr>
-                <w:rFonts w:ascii="Calibri" w:hAnsi="Calibri"/>
-                <w:color w:val="2D3748"/>
-                <w:sz w:val="17"/>
-              </w:rPr>
-              <w:t>40,079 (99.85%)</w:t>
-            </w:r>
-          </w:p>
-        </w:tc>
-        <w:tc>
-          <w:tcPr>
-            <w:tcW w:type="dxa" w:w="2390"/>
-            <w:vAlign w:val="center"/>
-            <w:shd w:fill="F7FAFC"/>
-            <w:tcBorders>
-              <w:top w:val="single" w:sz="4" w:space="0" w:color="CBD5E0"/>
-              <w:left w:val="none"/>
-              <w:bottom w:val="single" w:sz="4" w:space="0" w:color="CBD5E0"/>
-              <w:right w:val="none"/>
-            </w:tcBorders>
-            <w:tcMar>
-              <w:top w:w="70" w:type="dxa"/>
-              <w:left w:w="60" w:type="dxa"/>
-              <w:bottom w:w="70" w:type="dxa"/>
-              <w:right w:w="60" w:type="dxa"/>
-            </w:tcMar>
-          </w:tcPr>
-          <w:p>
-            <w:pPr>
-              <w:jc w:val="center"/>
-            </w:pPr>
-            <w:r>
-              <w:rPr>
-                <w:rFonts w:ascii="Calibri" w:hAnsi="Calibri"/>
-                <w:color w:val="2D3748"/>
-                <w:sz w:val="17"/>
-              </w:rPr>
-              <w:t>60 (0.15%)</w:t>
-            </w:r>
-          </w:p>
-        </w:tc>
-        <w:tc>
-          <w:tcPr>
-            <w:tcW w:type="dxa" w:w="1991"/>
-            <w:vAlign w:val="center"/>
-            <w:shd w:fill="F7FAFC"/>
-            <w:tcBorders>
-              <w:top w:val="single" w:sz="4" w:space="0" w:color="CBD5E0"/>
-              <w:left w:val="none"/>
-              <w:bottom w:val="single" w:sz="4" w:space="0" w:color="CBD5E0"/>
-              <w:right w:val="none"/>
-            </w:tcBorders>
-            <w:tcMar>
-              <w:top w:w="70" w:type="dxa"/>
-              <w:left w:w="60" w:type="dxa"/>
-              <w:bottom w:w="70" w:type="dxa"/>
-              <w:right w:w="60" w:type="dxa"/>
-            </w:tcMar>
-          </w:tcPr>
-          <w:p>
-            <w:pPr>
-              <w:jc w:val="center"/>
-            </w:pPr>
-            <w:r>
-              <w:rPr>
-                <w:rFonts w:ascii="Calibri" w:hAnsi="Calibri"/>
-                <w:color w:val="2D3748"/>
-                <w:sz w:val="17"/>
-              </w:rPr>
-              <w:t>40,139</w:t>
-            </w:r>
-          </w:p>
-        </w:tc>
-      </w:tr>
-    </w:tbl>
-    <w:p>
-      <w:pPr>
-        <w:spacing w:after="80"/>
-      </w:pPr>
     </w:p>
     <w:p>
       <w:pPr>
@@ -15497,7 +12926,7 @@
       <w:r>
         <w:drawing>
           <wp:inline xmlns:a="http://schemas.openxmlformats.org/drawingml/2006/main" xmlns:pic="http://schemas.openxmlformats.org/drawingml/2006/picture">
-            <wp:extent cx="5852160" cy="1835225"/>
+            <wp:extent cx="5852160" cy="1762810"/>
             <wp:docPr id="7" name="Picture 7"/>
             <wp:cNvGraphicFramePr>
               <a:graphicFrameLocks noChangeAspect="1"/>
@@ -15518,7 +12947,7 @@
                   <pic:spPr>
                     <a:xfrm>
                       <a:off x="0" y="0"/>
-                      <a:ext cx="5852160" cy="1835225"/>
+                      <a:ext cx="5852160" cy="1762810"/>
                     </a:xfrm>
                     <a:prstGeom prst="rect"/>
                   </pic:spPr>
@@ -15541,7 +12970,94 @@
           <w:color w:val="2D3748"/>
           <w:sz w:val="17"/>
         </w:rPr>
-        <w:t>Fig. 7: Class-wise 2x2 confusion matrices evaluated on held-out test splits under frozen operational thresholds for Dataset 1 (BankSim), Dataset 2 (IBM AML), and Dataset 3 (SAP Würzburg).</w:t>
+        <w:t>Fig. 7: Visual 2x2 confusion contingency matrices for the proposed TGN-XGBoost model evaluated on held-out test splits under frozen operational decision thresholds θ_audit* across: (left) Dataset 1 (BankSim), (middle) Dataset 2 (IBM AML), and (right) Dataset 3 (SAP Würzburg General Ledger). Each cell displays the quadrant designation (TN, FP, FN, TP), exact instance count, and percentage share of the test split.</w:t>
+      </w:r>
+    </w:p>
+    <w:p>
+      <w:pPr>
+        <w:spacing w:after="80" w:line="276" w:lineRule="auto"/>
+        <w:jc w:val="both"/>
+      </w:pPr>
+      <w:r>
+        <w:rPr>
+          <w:rFonts w:ascii="Calibri" w:hAnsi="Calibri"/>
+          <w:i w:val="0"/>
+          <w:color w:val="2D3748"/>
+          <w:sz w:val="20"/>
+        </w:rPr>
+        <w:t>Confusion Matrix Findings &amp; Analysis Across Benchmark Datasets:</w:t>
+      </w:r>
+    </w:p>
+    <w:p>
+      <w:pPr>
+        <w:pStyle w:val="ListBullet"/>
+        <w:spacing w:after="60" w:line="276" w:lineRule="auto"/>
+        <w:jc w:val="both"/>
+      </w:pPr>
+      <w:r>
+        <w:rPr>
+          <w:rFonts w:ascii="Calibri" w:hAnsi="Calibri"/>
+          <w:b/>
+          <w:color w:val="2D3748"/>
+          <w:sz w:val="20"/>
+        </w:rPr>
+        <w:t xml:space="preserve">Dataset 1 (BankSim): </w:t>
+      </w:r>
+      <w:r>
+        <w:rPr>
+          <w:rFonts w:ascii="Calibri" w:hAnsi="Calibri"/>
+          <w:color w:val="2D3748"/>
+          <w:sz w:val="20"/>
+        </w:rPr>
+        <w:t>Evaluated at θ_audit* = 0.534 on N = 122,278 transactions. The model achieves 120,809 True Negatives (98.80% of all instances) and 1,084 True Positives (0.89%), maintaining an ultra-low False Positive rate with only 149 legitimate payments flagged (0.12%) against 236 False Negatives (0.19%), yielding an operational Precision of 87.92% and Recall of 82.12% (F1 = 0.8492, PR-AUC = 0.9364).</w:t>
+      </w:r>
+    </w:p>
+    <w:p>
+      <w:pPr>
+        <w:pStyle w:val="ListBullet"/>
+        <w:spacing w:after="60" w:line="276" w:lineRule="auto"/>
+        <w:jc w:val="both"/>
+      </w:pPr>
+      <w:r>
+        <w:rPr>
+          <w:rFonts w:ascii="Calibri" w:hAnsi="Calibri"/>
+          <w:b/>
+          <w:color w:val="2D3748"/>
+          <w:sz w:val="20"/>
+        </w:rPr>
+        <w:t xml:space="preserve">Dataset 2 (IBM AML): </w:t>
+      </w:r>
+      <w:r>
+        <w:rPr>
+          <w:rFonts w:ascii="Calibri" w:hAnsi="Calibri"/>
+          <w:color w:val="2D3748"/>
+          <w:sz w:val="20"/>
+        </w:rPr>
+        <w:t>Evaluated at θ_audit* = 0.490 on N = 266,199 multi-hop transactions. The structural amount-derived recurrence allows TGN-XGBoost to cleanly isolate laundering topologies, yielding 265,822 True Negatives (99.86%) and 377 True Positives (0.14%) with zero False Positives (0.00%) and zero False Negatives (0.00%), achieving perfect discrimination (F1 = 1.0000, PR-AUC = 1.0000).</w:t>
+      </w:r>
+    </w:p>
+    <w:p>
+      <w:pPr>
+        <w:pStyle w:val="ListBullet"/>
+        <w:spacing w:after="60" w:line="276" w:lineRule="auto"/>
+        <w:jc w:val="both"/>
+      </w:pPr>
+      <w:r>
+        <w:rPr>
+          <w:rFonts w:ascii="Calibri" w:hAnsi="Calibri"/>
+          <w:b/>
+          <w:color w:val="2D3748"/>
+          <w:sz w:val="20"/>
+        </w:rPr>
+        <w:t xml:space="preserve">Dataset 3 (SAP Würzburg General Ledger): </w:t>
+      </w:r>
+      <w:r>
+        <w:rPr>
+          <w:rFonts w:ascii="Calibri" w:hAnsi="Calibri"/>
+          <w:color w:val="2D3748"/>
+          <w:sz w:val="20"/>
+        </w:rPr>
+        <w:t>Evaluated at θ_audit* = 0.215 on N = 40,139 accounting postings under extreme class imbalance (only 25 true anomalous journal entries, or 0.062% incidence). The model correctly captures 40,062 True Negatives (99.81%) and identifies 8 high-risk True Positives (0.02%) while restricting False Positives to 52 clearing hub postings (0.13%) and 17 False Negatives (0.04%), yielding Precision = 13.33%, Recall = 32.00%, and PR-AUC = 0.1557 (over 126x random baseline).</w:t>
       </w:r>
     </w:p>
     <w:p>
@@ -15571,7 +13087,7 @@
           <w:color w:val="2D3748"/>
           <w:sz w:val="20"/>
         </w:rPr>
-        <w:t>Table 11 provides a granular, class-wise performance breakdown (Class 0: Legitimate vs. Class 1: Fraudulent) across all three benchmark datasets.</w:t>
+        <w:t>Table 8 provides a granular, class-wise performance breakdown (Class 0: Legitimate vs. Class 1: Fraudulent) across all three benchmark datasets.</w:t>
       </w:r>
     </w:p>
     <w:p>
@@ -15586,7 +13102,7 @@
           <w:color w:val="1B365D"/>
           <w:sz w:val="19"/>
         </w:rPr>
-        <w:t>Table 11: Class-Wise Performance Metrics Across Datasets 1, 2, and 3.</w:t>
+        <w:t>Table 8: Class-Wise Performance Metrics Across Datasets 1, 2, and 3.</w:t>
       </w:r>
     </w:p>
     <w:tbl>

</xml_diff>

<commit_message>
docs(paper): reduce equations to 4 core conceptual equations and adopt clean regular variable notation
</commit_message>
<xml_diff>
--- a/paper/The_Self_Auditing_Ledger_Paper.docx
+++ b/paper/The_Self_Auditing_Ledger_Paper.docx
@@ -355,168 +355,7 @@
           <w:color w:val="2D3748"/>
           <w:sz w:val="20"/>
         </w:rPr>
-        <w:t>The proposed Hybrid TGN-XGBoost model couples dynamic transactional multigraphs, continuous temporal graph representations, and gradient-boosted decision trees (Fig. 1). We model the incoming transactional ledger as a directed temporal streaming multigraph:</w:t>
-      </w:r>
-    </w:p>
-    <w:tbl>
-      <w:tblPr>
-        <w:tblW w:type="auto" w:w="0"/>
-        <w:jc w:val="center"/>
-        <w:tblLook w:firstColumn="1" w:firstRow="1" w:lastColumn="0" w:lastRow="0" w:noHBand="0" w:noVBand="1" w:val="04A0"/>
-      </w:tblPr>
-      <w:tblGrid>
-        <w:gridCol w:w="10080"/>
-      </w:tblGrid>
-      <w:tr>
-        <w:tc>
-          <w:tcPr>
-            <w:tcW w:type="dxa" w:w="9360"/>
-            <w:shd w:fill="F8FAFC"/>
-            <w:tcBorders>
-              <w:top w:val="none"/>
-              <w:left w:val="single" w:sz="18" w:space="0" w:color="2B6CB0"/>
-              <w:bottom w:val="none"/>
-              <w:right w:val="none"/>
-            </w:tcBorders>
-            <w:tcMar>
-              <w:top w:w="80" w:type="dxa"/>
-              <w:left w:w="140" w:type="dxa"/>
-              <w:bottom w:w="80" w:type="dxa"/>
-              <w:right w:w="100" w:type="dxa"/>
-            </w:tcMar>
-          </w:tcPr>
-          <w:p>
-            <w:pPr>
-              <w:spacing w:before="40" w:after="40" w:line="276" w:lineRule="auto"/>
-            </w:pPr>
-            <w:r>
-              <w:rPr>
-                <w:rFonts w:ascii="Consolas" w:hAnsi="Consolas"/>
-                <w:b/>
-                <w:color w:val="1B365D"/>
-                <w:sz w:val="19"/>
-              </w:rPr>
-              <w:t>𝔊 = (𝒜, 𝒳, 𝕋)</w:t>
-            </w:r>
-            <w:r>
-              <w:rPr>
-                <w:rFonts w:ascii="Calibri" w:hAnsi="Calibri"/>
-                <w:i/>
-                <w:color w:val="718096"/>
-                <w:sz w:val="19"/>
-              </w:rPr>
-              <w:t xml:space="preserve">    (1)</w:t>
-            </w:r>
-          </w:p>
-        </w:tc>
-      </w:tr>
-    </w:tbl>
-    <w:p>
-      <w:pPr>
-        <w:spacing w:after="40"/>
-      </w:pPr>
-    </w:p>
-    <w:p>
-      <w:pPr>
-        <w:spacing w:after="80" w:line="276" w:lineRule="auto"/>
-        <w:jc w:val="both"/>
-      </w:pPr>
-      <w:r>
-        <w:rPr>
-          <w:rFonts w:ascii="Calibri" w:hAnsi="Calibri"/>
-          <w:i w:val="0"/>
-          <w:color w:val="2D3748"/>
-          <w:sz w:val="20"/>
-        </w:rPr>
-        <w:t>where 𝒜 = {α_1, α_2, ..., α_|𝒜|} denotes the universe of financial ledger accounts, counterparties, or general-ledger entities, and 𝕋 = {τ_1, τ_2, ...} ⊂ ℕ represents strictly ordered epoch posting timestamps (τ_k ≤ τ_{k+1}).</w:t>
-      </w:r>
-    </w:p>
-    <w:p>
-      <w:pPr>
-        <w:spacing w:after="80" w:line="276" w:lineRule="auto"/>
-        <w:jc w:val="both"/>
-      </w:pPr>
-      <w:r>
-        <w:rPr>
-          <w:rFonts w:ascii="Calibri" w:hAnsi="Calibri"/>
-          <w:i w:val="0"/>
-          <w:color w:val="2D3748"/>
-          <w:sz w:val="20"/>
-        </w:rPr>
-        <w:t>Each transactional edge is represented as an ordered quintuple:</w:t>
-      </w:r>
-    </w:p>
-    <w:tbl>
-      <w:tblPr>
-        <w:tblW w:type="auto" w:w="0"/>
-        <w:jc w:val="center"/>
-        <w:tblLook w:firstColumn="1" w:firstRow="1" w:lastColumn="0" w:lastRow="0" w:noHBand="0" w:noVBand="1" w:val="04A0"/>
-      </w:tblPr>
-      <w:tblGrid>
-        <w:gridCol w:w="10080"/>
-      </w:tblGrid>
-      <w:tr>
-        <w:tc>
-          <w:tcPr>
-            <w:tcW w:type="dxa" w:w="9360"/>
-            <w:shd w:fill="F8FAFC"/>
-            <w:tcBorders>
-              <w:top w:val="none"/>
-              <w:left w:val="single" w:sz="18" w:space="0" w:color="2B6CB0"/>
-              <w:bottom w:val="none"/>
-              <w:right w:val="none"/>
-            </w:tcBorders>
-            <w:tcMar>
-              <w:top w:w="80" w:type="dxa"/>
-              <w:left w:w="140" w:type="dxa"/>
-              <w:bottom w:w="80" w:type="dxa"/>
-              <w:right w:w="100" w:type="dxa"/>
-            </w:tcMar>
-          </w:tcPr>
-          <w:p>
-            <w:pPr>
-              <w:spacing w:before="40" w:after="40" w:line="276" w:lineRule="auto"/>
-            </w:pPr>
-            <w:r>
-              <w:rPr>
-                <w:rFonts w:ascii="Consolas" w:hAnsi="Consolas"/>
-                <w:b/>
-                <w:color w:val="1B365D"/>
-                <w:sz w:val="19"/>
-              </w:rPr>
-              <w:t>ξ_k = (𝔰_k, 𝔡_k, τ_k, ν_k, c_k) ∈ 𝒳</w:t>
-            </w:r>
-            <w:r>
-              <w:rPr>
-                <w:rFonts w:ascii="Calibri" w:hAnsi="Calibri"/>
-                <w:i/>
-                <w:color w:val="718096"/>
-                <w:sz w:val="19"/>
-              </w:rPr>
-              <w:t xml:space="preserve">    (2)</w:t>
-            </w:r>
-          </w:p>
-        </w:tc>
-      </w:tr>
-    </w:tbl>
-    <w:p>
-      <w:pPr>
-        <w:spacing w:after="40"/>
-      </w:pPr>
-    </w:p>
-    <w:p>
-      <w:pPr>
-        <w:spacing w:after="80" w:line="276" w:lineRule="auto"/>
-        <w:jc w:val="both"/>
-      </w:pPr>
-      <w:r>
-        <w:rPr>
-          <w:rFonts w:ascii="Calibri" w:hAnsi="Calibri"/>
-          <w:i w:val="0"/>
-          <w:color w:val="2D3748"/>
-          <w:sz w:val="20"/>
-        </w:rPr>
-        <w:t>where 𝔰_k ∈ 𝒜 is the debiting source entity, 𝔡_k ∈ 𝒜 is the crediting destination counterparty, τ_k ∈ 𝕋 is the posting epoch timestamp, ν_k ∈ ℝ^+ is the positive monetary transfer volume, and c_k ∈ ℝ^{d_c} encodes ledger categorical attributes (posting key, document voucher type).</w:t>
+        <w:t>The proposed Hybrid TGN-XGBoost model couples dynamic transactional multigraphs, continuous temporal graph representations, and gradient-boosted decision trees (Fig. 1). We model the incoming transactional ledger as a directed temporal streaming multigraph G = (V, E, T), where V = {v_1, v_2, ..., v_|V|} denotes the discrete universe of financial ledger accounts or counterparties, and T = {t_1, t_2, ...} ⊂ ℕ represents strictly ordered epoch posting timestamps (t_k ≤ t_{k+1}). Each transactional edge is represented as an ordered quintuple e_k = (u_k, v_k, t_k, a_k, c_k) ∈ E, where u_k ∈ V is the debiting source entity, v_k ∈ V is the crediting destination counterparty, t_k ∈ T is the posting epoch timestamp, a_k ∈ ℝ^+ is the positive monetary transfer volume, and c_k ∈ ℝ^{d_c} encodes ledger categorical voucher attributes (posting key, document type).</w:t>
       </w:r>
     </w:p>
     <w:p>
@@ -579,7 +418,7 @@
           <w:color w:val="2D3748"/>
           <w:sz w:val="20"/>
         </w:rPr>
-        <w:t>Evaluates sliding-window structural metrics solely against historical graph state 𝔊_{&lt; τ_k}.</w:t>
+        <w:t>Evaluates sliding-window structural metrics solely against historical graph state G_{&lt; t_k}.</w:t>
       </w:r>
     </w:p>
     <w:p>
@@ -729,7 +568,7 @@
           <w:color w:val="2D3748"/>
           <w:sz w:val="20"/>
         </w:rPr>
-        <w:t>Timestamps are coerced to integer epoch seconds; monetary amounts ν_k &gt; 0 are converted to double-precision floats; categorical metadata are dictionary-encoded with reserved unseen-category indices.</w:t>
+        <w:t>Timestamps are coerced to integer epoch seconds; monetary amounts a_k &gt; 0 are converted to double-precision floats; categorical metadata are dictionary-encoded with reserved unseen-category indices.</w:t>
       </w:r>
     </w:p>
     <w:p>
@@ -753,7 +592,7 @@
           <w:color w:val="2D3748"/>
           <w:sz w:val="20"/>
         </w:rPr>
-        <w:t>Transactions are sorted by the composite key (τ_k, tx_id). The data is partitioned into strictly ordered chronological splits: 60% training (τ &lt; T_1), 20% validation (T_1 ≤ τ &lt; T_2), and 20% held-out test (τ ≥ T_2). No shuffling, random cross-validation, or bidirectional temporal imputation is permitted.</w:t>
+        <w:t>Transactions are sorted by the composite key (t_k, tx_id). The data is partitioned into strictly ordered chronological splits: 60% training (t &lt; T_1), 20% validation (T_1 ≤ t &lt; T_2), and 20% held-out test (t ≥ T_2). No shuffling, random cross-validation, or bidirectional temporal imputation is permitted.</w:t>
       </w:r>
     </w:p>
     <w:p>
@@ -777,7 +616,7 @@
           <w:color w:val="2D3748"/>
           <w:sz w:val="20"/>
         </w:rPr>
-        <w:t>All feature scaling factors and running z-scores are computed using Welford's algorithm [20] over the causal historical set ℍ_k(𝔰_k) = {j &lt; k : 𝔰_j = 𝔰_k} only, preventing lookahead contamination.</w:t>
+        <w:t>All feature scaling factors and running z-scores are computed using Welford's algorithm [20] over the causal historical set H_k(u_k) = {j &lt; k : u_j = u_k} only, preventing lookahead contamination.</w:t>
       </w:r>
     </w:p>
     <w:p>
@@ -807,7 +646,7 @@
           <w:color w:val="2D3748"/>
           <w:sz w:val="20"/>
         </w:rPr>
-        <w:t>Each transaction ξ_k is mapped to a composite feature representation combining tabular indicators, streaming graph topology, and continuous TGN interaction embeddings:</w:t>
+        <w:t>Each transaction e_k is mapped to a composite feature representation combining tabular indicators, streaming graph topology, and continuous TGN interaction embeddings:</w:t>
       </w:r>
     </w:p>
     <w:tbl>
@@ -848,7 +687,7 @@
                 <w:color w:val="1B365D"/>
                 <w:sz w:val="19"/>
               </w:rPr>
-              <w:t>Φ(ξ_k) = ψ_tab(ξ_k) ⊕ Ω_topo(ξ_k, 𝔊_{&lt; τ_k}^(W)) ⊕ h_dyn^TGN(ξ_k, τ_k) ∈ ℝ^D</w:t>
+              <w:t>z_k = x_tab(e_k) ⊕ g_topo(e_k, H_k^(W)) ⊕ h_dyn(e_k, t_k) ∈ ℝ^D</w:t>
             </w:r>
             <w:r>
               <w:rPr>
@@ -857,7 +696,7 @@
                 <w:color w:val="718096"/>
                 <w:sz w:val="19"/>
               </w:rPr>
-              <w:t xml:space="preserve">    (3)</w:t>
+              <w:t xml:space="preserve">    (1)</w:t>
             </w:r>
           </w:p>
         </w:tc>
@@ -896,7 +735,7 @@
           <w:color w:val="2D3748"/>
           <w:sz w:val="20"/>
         </w:rPr>
-        <w:t xml:space="preserve">1. Ordinary Tabular Features (ψ_tab): </w:t>
+        <w:t xml:space="preserve">1. Ordinary Tabular Features (x_tab): </w:t>
       </w:r>
       <w:r>
         <w:rPr>
@@ -904,7 +743,7 @@
           <w:color w:val="2D3748"/>
           <w:sz w:val="20"/>
         </w:rPr>
-        <w:t>log_10(ν_k + 1), running causal z-scores, diurnal periodic encodings (sin(2π ℏ_k / 24), cos(2π ℏ_k / 24)) where ℏ_k is posting hour, and inter-event arrival deltas Δτ_k = τ_k - τ_last(𝔰_k).</w:t>
+        <w:t>log_10(a_k + 1), running causal z-scores, diurnal periodic encodings (sin(2π h_k / 24), cos(2π h_k / 24)) where h_k is posting hour, and inter-event arrival deltas Δt_k.</w:t>
       </w:r>
     </w:p>
     <w:p>
@@ -920,7 +759,7 @@
           <w:color w:val="2D3748"/>
           <w:sz w:val="20"/>
         </w:rPr>
-        <w:t xml:space="preserve">2. Handcrafted Streaming Topology (Ω_topo): </w:t>
+        <w:t xml:space="preserve">2. Handcrafted Streaming Topology (g_topo): </w:t>
       </w:r>
       <w:r>
         <w:rPr>
@@ -944,7 +783,7 @@
           <w:color w:val="2D3748"/>
           <w:sz w:val="20"/>
         </w:rPr>
-        <w:t xml:space="preserve">3. Continuous Dynamic Graph Embeddings (h_dyn^TGN): </w:t>
+        <w:t xml:space="preserve">3. Continuous Dynamic Graph Embeddings (h_dyn): </w:t>
       </w:r>
       <w:r>
         <w:rPr>
@@ -967,80 +806,7 @@
           <w:color w:val="2D3748"/>
           <w:sz w:val="20"/>
         </w:rPr>
-        <w:t>The Read-Then-Insert Execution Invariant: To guarantee zero lookahead leakage, the engine evaluates topology strictly against the trailing causal subgraph 𝔊_{&lt; τ_k}^(W) = { ξ_j ∈ 𝒳 : τ_k - W ≤ τ_j &lt; τ_k }, enforcing:</w:t>
-      </w:r>
-    </w:p>
-    <w:tbl>
-      <w:tblPr>
-        <w:tblW w:type="auto" w:w="0"/>
-        <w:jc w:val="center"/>
-        <w:tblLook w:firstColumn="1" w:firstRow="1" w:lastColumn="0" w:lastRow="0" w:noHBand="0" w:noVBand="1" w:val="04A0"/>
-      </w:tblPr>
-      <w:tblGrid>
-        <w:gridCol w:w="10080"/>
-      </w:tblGrid>
-      <w:tr>
-        <w:tc>
-          <w:tcPr>
-            <w:tcW w:type="dxa" w:w="9360"/>
-            <w:shd w:fill="F8FAFC"/>
-            <w:tcBorders>
-              <w:top w:val="none"/>
-              <w:left w:val="single" w:sz="18" w:space="0" w:color="2B6CB0"/>
-              <w:bottom w:val="none"/>
-              <w:right w:val="none"/>
-            </w:tcBorders>
-            <w:tcMar>
-              <w:top w:w="80" w:type="dxa"/>
-              <w:left w:w="140" w:type="dxa"/>
-              <w:bottom w:w="80" w:type="dxa"/>
-              <w:right w:w="100" w:type="dxa"/>
-            </w:tcMar>
-          </w:tcPr>
-          <w:p>
-            <w:pPr>
-              <w:spacing w:before="40" w:after="40" w:line="276" w:lineRule="auto"/>
-            </w:pPr>
-            <w:r>
-              <w:rPr>
-                <w:rFonts w:ascii="Consolas" w:hAnsi="Consolas"/>
-                <w:b/>
-                <w:color w:val="1B365D"/>
-                <w:sz w:val="19"/>
-              </w:rPr>
-              <w:t>∀ ξ_j ∈ 𝔊_{&lt; τ_k}^(W),   τ_j &lt; τ_k  ⟹  ξ_k ∉ 𝔊_{&lt; τ_k}^(W)</w:t>
-            </w:r>
-            <w:r>
-              <w:rPr>
-                <w:rFonts w:ascii="Calibri" w:hAnsi="Calibri"/>
-                <w:i/>
-                <w:color w:val="718096"/>
-                <w:sz w:val="19"/>
-              </w:rPr>
-              <w:t xml:space="preserve">    (4)</w:t>
-            </w:r>
-          </w:p>
-        </w:tc>
-      </w:tr>
-    </w:tbl>
-    <w:p>
-      <w:pPr>
-        <w:spacing w:after="40"/>
-      </w:pPr>
-    </w:p>
-    <w:p>
-      <w:pPr>
-        <w:spacing w:after="80" w:line="276" w:lineRule="auto"/>
-        <w:jc w:val="both"/>
-      </w:pPr>
-      <w:r>
-        <w:rPr>
-          <w:rFonts w:ascii="Calibri" w:hAnsi="Calibri"/>
-          <w:i w:val="0"/>
-          <w:color w:val="2D3748"/>
-          <w:sz w:val="20"/>
-        </w:rPr>
-        <w:t>Graph queries read historical state before edge ξ_k is added to the graph.</w:t>
+        <w:t>The Read-Then-Insert Execution Invariant: To guarantee zero lookahead leakage, the engine evaluates topology strictly against the trailing causal subgraph H_k^(W) = { e_j ∈ E : t_k - W ≤ t_j &lt; t_k }, enforcing that ∀ e_j ∈ H_k^(W), t_j &lt; t_k ⟹ e_k ∉ H_k^(W). Graph queries read historical state before edge e_k is added to the graph.</w:t>
       </w:r>
     </w:p>
     <w:p>
@@ -1126,7 +892,7 @@
           <w:color w:val="2D3748"/>
           <w:sz w:val="20"/>
         </w:rPr>
-        <w:t>The proposed TGN-XGBoost champion model couples the composite representation with gradient-boosted decision trees [19]:</w:t>
+        <w:t>The proposed TGN-XGBoost champion model couples the composite representation z_k with gradient-boosted decision trees [19], producing a forensic margin score s_k ∈ ℝ mapped to predicted fraud posterior probability p_k = σ(s_k) ∈ (0, 1). The tree ensemble is optimized under an unweighted, symmetric α-free focal loss [17]:</w:t>
       </w:r>
     </w:p>
     <w:tbl>
@@ -1167,7 +933,7 @@
                 <w:color w:val="1B365D"/>
                 <w:sz w:val="19"/>
               </w:rPr>
-              <w:t>f_TGN-XGBoost(ξ_k) = 𝒯_GBDT( Φ(ξ_k); 𝒥_focal, Θ* )</w:t>
+              <w:t>ℓ_focal(p_k, y_k) = - y_k (1 - p_k)^γ ln(p_k) - (1 - y_k) p_k^γ ln(1 - p_k)</w:t>
             </w:r>
             <w:r>
               <w:rPr>
@@ -1176,7 +942,7 @@
                 <w:color w:val="718096"/>
                 <w:sz w:val="19"/>
               </w:rPr>
-              <w:t xml:space="preserve">    (5)</w:t>
+              <w:t xml:space="preserve">    (2)</w:t>
             </w:r>
           </w:p>
         </w:tc>
@@ -1199,80 +965,7 @@
           <w:color w:val="2D3748"/>
           <w:sz w:val="20"/>
         </w:rPr>
-        <w:t>optimized under an unweighted, symmetric α-free focal loss [17]:</w:t>
-      </w:r>
-    </w:p>
-    <w:tbl>
-      <w:tblPr>
-        <w:tblW w:type="auto" w:w="0"/>
-        <w:jc w:val="center"/>
-        <w:tblLook w:firstColumn="1" w:firstRow="1" w:lastColumn="0" w:lastRow="0" w:noHBand="0" w:noVBand="1" w:val="04A0"/>
-      </w:tblPr>
-      <w:tblGrid>
-        <w:gridCol w:w="10080"/>
-      </w:tblGrid>
-      <w:tr>
-        <w:tc>
-          <w:tcPr>
-            <w:tcW w:type="dxa" w:w="9360"/>
-            <w:shd w:fill="F8FAFC"/>
-            <w:tcBorders>
-              <w:top w:val="none"/>
-              <w:left w:val="single" w:sz="18" w:space="0" w:color="2B6CB0"/>
-              <w:bottom w:val="none"/>
-              <w:right w:val="none"/>
-            </w:tcBorders>
-            <w:tcMar>
-              <w:top w:w="80" w:type="dxa"/>
-              <w:left w:w="140" w:type="dxa"/>
-              <w:bottom w:w="80" w:type="dxa"/>
-              <w:right w:w="100" w:type="dxa"/>
-            </w:tcMar>
-          </w:tcPr>
-          <w:p>
-            <w:pPr>
-              <w:spacing w:before="40" w:after="40" w:line="276" w:lineRule="auto"/>
-            </w:pPr>
-            <w:r>
-              <w:rPr>
-                <w:rFonts w:ascii="Consolas" w:hAnsi="Consolas"/>
-                <w:b/>
-                <w:color w:val="1B365D"/>
-                <w:sz w:val="19"/>
-              </w:rPr>
-              <w:t>𝒥_focal(π̂_k, y_k) = - y_k (1 - π̂_k)^γ ln(π̂_k) - (1 - y_k) π̂_k^γ ln(1 - π̂_k)</w:t>
-            </w:r>
-            <w:r>
-              <w:rPr>
-                <w:rFonts w:ascii="Calibri" w:hAnsi="Calibri"/>
-                <w:i/>
-                <w:color w:val="718096"/>
-                <w:sz w:val="19"/>
-              </w:rPr>
-              <w:t xml:space="preserve">    (6)</w:t>
-            </w:r>
-          </w:p>
-        </w:tc>
-      </w:tr>
-    </w:tbl>
-    <w:p>
-      <w:pPr>
-        <w:spacing w:after="40"/>
-      </w:pPr>
-    </w:p>
-    <w:p>
-      <w:pPr>
-        <w:spacing w:after="80" w:line="276" w:lineRule="auto"/>
-        <w:jc w:val="both"/>
-      </w:pPr>
-      <w:r>
-        <w:rPr>
-          <w:rFonts w:ascii="Calibri" w:hAnsi="Calibri"/>
-          <w:i w:val="0"/>
-          <w:color w:val="2D3748"/>
-          <w:sz w:val="20"/>
-        </w:rPr>
-        <w:t>where π̂_k = σ(θ_k) = (1 + e^-θ_k)^-1 is the sigmoid posterior of predicted log-odds margin θ_k ∈ ℝ, y_k ∈ {0, 1} is the forensic label, and γ ∈ ℝ^+ is the focusing factor (γ = 1.0 for BankSim, γ = 2.0 for SAP Würzburg). Decision thresholds θ_audit* are tuned strictly on validation splits and frozen for test evaluation.</w:t>
+        <w:t>where y_k ∈ {0, 1} is the forensic audit label and γ &gt; 0 is the focusing factor (γ = 1.0 for BankSim, γ = 2.0 for SAP Würzburg). Decision thresholds θ_audit* are tuned strictly on validation splits and frozen for test evaluation.</w:t>
       </w:r>
     </w:p>
     <w:p>
@@ -1343,7 +1036,7 @@
                 <w:color w:val="1B365D"/>
                 <w:sz w:val="19"/>
               </w:rPr>
-              <w:t>ϖ_c = (𝒫_val^(c))^κ / ∑_{m=1}^C (𝒫_val^(m))^κ,   Π̂_consensus(ξ_k) = ∑_{c=1}^C ϖ_c · ℳ^(c)( Φ(ξ_k) )</w:t>
+              <w:t>ω_c = R_c^β / ∑_{m=1}^C R_m^β,   S_ens(z_k) = ∑_{c=1}^C ω_c · M_c(z_k)</w:t>
             </w:r>
             <w:r>
               <w:rPr>
@@ -1352,7 +1045,7 @@
                 <w:color w:val="718096"/>
                 <w:sz w:val="19"/>
               </w:rPr>
-              <w:t xml:space="preserve">    (7)</w:t>
+              <w:t xml:space="preserve">    (3)</w:t>
             </w:r>
           </w:p>
         </w:tc>
@@ -1375,7 +1068,7 @@
           <w:color w:val="2D3748"/>
           <w:sz w:val="20"/>
         </w:rPr>
-        <w:t>where 𝒫_val^(c) = PR-AUC(𝒟_val^(c)) and κ ≥ 1.0.</w:t>
+        <w:t>where R_c = PR-AUC(D_val^(c)) is the empirical validation reliability score of institution c, β ≥ 1.0 is the sharpness parameter, and M_c(z_k) is the prediction from client model c.</w:t>
       </w:r>
     </w:p>
     <w:p>
@@ -1446,7 +1139,7 @@
                 <w:color w:val="1B365D"/>
                 <w:sz w:val="19"/>
               </w:rPr>
-              <w:t>θ_k = ln( π̂_k / (1 - π̂_k) ) = Λ_0 + ∑_{d=1}^D Λ_d( Φ(ξ_k) )</w:t>
+              <w:t>s_k = ln( p_k / (1 - p_k) ) = ϕ_0 + ∑_{j=1}^D ϕ_j(z_k)</w:t>
             </w:r>
             <w:r>
               <w:rPr>
@@ -1455,7 +1148,7 @@
                 <w:color w:val="718096"/>
                 <w:sz w:val="19"/>
               </w:rPr>
-              <w:t xml:space="preserve">    (8)</w:t>
+              <w:t xml:space="preserve">    (4)</w:t>
             </w:r>
           </w:p>
         </w:tc>
@@ -1478,7 +1171,7 @@
           <w:color w:val="2D3748"/>
           <w:sz w:val="20"/>
         </w:rPr>
-        <w:t>When an anomaly score exceeds θ_audit*, the continuous auditing console synthesizes a two-layer forensic alert packet: (1) Layer 1: Top 3 signed driving features in log-odds space; and (2) Layer 2: A deterministic Cypher query executing against Neo4j extracting the historical subgraph.</w:t>
+        <w:t>where ϕ_0 = E[s] represents the expected baseline ledger risk and ϕ_j(z_k) is the exact additive attribution of feature j ∈ {1, ..., D}. When an anomaly score exceeds θ_audit*, the continuous auditing console synthesizes a two-layer forensic alert packet: (1) Layer 1: Top 3 signed driving features in log-odds space; and (2) Layer 2: A deterministic Cypher query executing against Neo4j extracting the historical subgraph.</w:t>
       </w:r>
     </w:p>
     <w:p>
@@ -8332,7 +8025,7 @@
                 <w:color w:val="2D3748"/>
                 <w:sz w:val="17"/>
               </w:rPr>
-              <w:t>1. Baseline Tabular (ψ_tab)</w:t>
+              <w:t>1. Baseline Tabular (x_tab)</w:t>
             </w:r>
           </w:p>
         </w:tc>
@@ -8598,7 +8291,7 @@
                 <w:color w:val="2D3748"/>
                 <w:sz w:val="17"/>
               </w:rPr>
-              <w:t>3. Handcrafted Topology Only (Ω_topo)</w:t>
+              <w:t>3. Handcrafted Topology Only (g_topo)</w:t>
             </w:r>
           </w:p>
         </w:tc>

</xml_diff>

<commit_message>
feat(paper): add dedicated Hybrid TGN-XGBoost model architecture diagram and phase-wise descriptions under Architecture section
</commit_message>
<xml_diff>
--- a/paper/The_Self_Auditing_Ledger_Paper.docx
+++ b/paper/The_Self_Auditing_Ledger_Paper.docx
@@ -275,62 +275,6 @@
     <w:p>
       <w:pPr>
         <w:keepNext/>
-        <w:spacing w:before="120" w:after="40"/>
-        <w:jc w:val="center"/>
-      </w:pPr>
-      <w:r>
-        <w:drawing>
-          <wp:inline xmlns:a="http://schemas.openxmlformats.org/drawingml/2006/main" xmlns:pic="http://schemas.openxmlformats.org/drawingml/2006/picture">
-            <wp:extent cx="5852160" cy="1839250"/>
-            <wp:docPr id="1" name="Picture 1"/>
-            <wp:cNvGraphicFramePr>
-              <a:graphicFrameLocks noChangeAspect="1"/>
-            </wp:cNvGraphicFramePr>
-            <a:graphic>
-              <a:graphicData uri="http://schemas.openxmlformats.org/drawingml/2006/picture">
-                <pic:pic>
-                  <pic:nvPicPr>
-                    <pic:cNvPr id="0" name="pipeline_overview.png"/>
-                    <pic:cNvPicPr/>
-                  </pic:nvPicPr>
-                  <pic:blipFill>
-                    <a:blip r:embed="rId11"/>
-                    <a:stretch>
-                      <a:fillRect/>
-                    </a:stretch>
-                  </pic:blipFill>
-                  <pic:spPr>
-                    <a:xfrm>
-                      <a:off x="0" y="0"/>
-                      <a:ext cx="5852160" cy="1839250"/>
-                    </a:xfrm>
-                    <a:prstGeom prst="rect"/>
-                  </pic:spPr>
-                </pic:pic>
-              </a:graphicData>
-            </a:graphic>
-          </wp:inline>
-        </w:drawing>
-      </w:r>
-    </w:p>
-    <w:p>
-      <w:pPr>
-        <w:spacing w:before="40" w:after="160"/>
-        <w:jc w:val="both"/>
-      </w:pPr>
-      <w:r>
-        <w:rPr>
-          <w:rFonts w:ascii="Calibri" w:hAnsi="Calibri"/>
-          <w:i/>
-          <w:color w:val="2D3748"/>
-          <w:sz w:val="17"/>
-        </w:rPr>
-        <w:t>Fig. 1: End-to-end architectural pipeline of the proposed Hybrid TGN-XGBoost model: from raw ERP/banking transaction ingestion and bipartite graph projection, through the streaming leakage-free temporal topology engine and continuous TGN embedding extraction, to imbalance-aware gradient-boosted tree scoring, TreeSHAP forensic alert packet synthesis, and privacy-preserving federated consensus.</w:t>
-      </w:r>
-    </w:p>
-    <w:p>
-      <w:pPr>
-        <w:keepNext/>
         <w:spacing w:before="160" w:after="40"/>
       </w:pPr>
       <w:r>
@@ -355,7 +299,63 @@
           <w:color w:val="2D3748"/>
           <w:sz w:val="20"/>
         </w:rPr>
-        <w:t>The proposed Hybrid TGN-XGBoost model couples dynamic transactional multigraphs, continuous temporal graph representations, and gradient-boosted decision trees (Fig. 1). We model the incoming transactional ledger as a directed temporal streaming multigraph G = (V, E, T), where V = {v_1, v_2, ..., v_|V|} denotes the discrete universe of financial ledger accounts or counterparties, and T = {t_1, t_2, ...} ⊂ ℕ represents strictly ordered epoch posting timestamps (t_k ≤ t_{k+1}). Each transactional edge is represented as an ordered quintuple e_k = (u_k, v_k, t_k, a_k, c_k) ∈ E, where u_k ∈ V is the debiting source entity, v_k ∈ V is the crediting destination counterparty, t_k ∈ T is the posting epoch timestamp, a_k ∈ ℝ^+ is the positive monetary transfer volume, and c_k ∈ ℝ^{d_c} encodes ledger categorical voucher attributes (posting key, document type).</w:t>
+        <w:t>Rather than treating fraud detection as a generic black-box pipeline, the proposed Hybrid TGN-XGBoost model couples continuous-time temporal graph representations, streaming causal topological metrics, and gradient-boosted decision trees into a unified multi-phase architecture (Fig. 1).</w:t>
+      </w:r>
+    </w:p>
+    <w:p>
+      <w:pPr>
+        <w:keepNext/>
+        <w:spacing w:before="120" w:after="40"/>
+        <w:jc w:val="center"/>
+      </w:pPr>
+      <w:r>
+        <w:drawing>
+          <wp:inline xmlns:a="http://schemas.openxmlformats.org/drawingml/2006/main" xmlns:pic="http://schemas.openxmlformats.org/drawingml/2006/picture">
+            <wp:extent cx="5852160" cy="3503841"/>
+            <wp:docPr id="1" name="Picture 1"/>
+            <wp:cNvGraphicFramePr>
+              <a:graphicFrameLocks noChangeAspect="1"/>
+            </wp:cNvGraphicFramePr>
+            <a:graphic>
+              <a:graphicData uri="http://schemas.openxmlformats.org/drawingml/2006/picture">
+                <pic:pic>
+                  <pic:nvPicPr>
+                    <pic:cNvPr id="0" name="proposed_model_architecture.png"/>
+                    <pic:cNvPicPr/>
+                  </pic:nvPicPr>
+                  <pic:blipFill>
+                    <a:blip r:embed="rId11"/>
+                    <a:stretch>
+                      <a:fillRect/>
+                    </a:stretch>
+                  </pic:blipFill>
+                  <pic:spPr>
+                    <a:xfrm>
+                      <a:off x="0" y="0"/>
+                      <a:ext cx="5852160" cy="3503841"/>
+                    </a:xfrm>
+                    <a:prstGeom prst="rect"/>
+                  </pic:spPr>
+                </pic:pic>
+              </a:graphicData>
+            </a:graphic>
+          </wp:inline>
+        </w:drawing>
+      </w:r>
+    </w:p>
+    <w:p>
+      <w:pPr>
+        <w:spacing w:before="40" w:after="160"/>
+        <w:jc w:val="both"/>
+      </w:pPr>
+      <w:r>
+        <w:rPr>
+          <w:rFonts w:ascii="Calibri" w:hAnsi="Calibri"/>
+          <w:i/>
+          <w:color w:val="2D3748"/>
+          <w:sz w:val="17"/>
+        </w:rPr>
+        <w:t>Fig. 1: Operational architecture of the proposed Hybrid TGN-XGBoost model: detailing the five sequential and parallel algorithmic phases from input transaction quintuple e_k = (u_k, v_k, t_k, a_k, c_k) and causal trailing windowing H_k^(W), through tri-branch tabular, streaming topology, and continuous TGN dynamic memory extraction, to hybrid direct-sum fusion z_k, imbalance-calibrated XGBoost scoring via margin focal loss ℓ_focal, and operational threshold decision gating.</w:t>
       </w:r>
     </w:p>
     <w:p>
@@ -370,7 +370,22 @@
           <w:color w:val="2D3748"/>
           <w:sz w:val="20"/>
         </w:rPr>
-        <w:t>The architecture comprises six tightly coupled operational modules:</w:t>
+        <w:t>We model the incoming transactional ledger as a directed temporal streaming multigraph G = (V, E, T), where V = {v_1, v_2, ..., v_|V|} denotes the discrete universe of financial ledger accounts or counterparties, and T = {t_1, t_2, ...} ⊂ ℕ represents strictly ordered epoch posting timestamps (t_k ≤ t_{k+1}). Each transactional edge is represented as an ordered quintuple e_k = (u_k, v_k, t_k, a_k, c_k) ∈ E, where u_k ∈ V is the debiting source entity, v_k ∈ V is the crediting destination counterparty, t_k ∈ T is the posting epoch timestamp, a_k ∈ ℝ^+ is the positive monetary transfer volume, and c_k ∈ ℝ^{d_c} encodes ledger categorical voucher attributes (posting key, document type).</w:t>
+      </w:r>
+    </w:p>
+    <w:p>
+      <w:pPr>
+        <w:spacing w:after="80" w:line="276" w:lineRule="auto"/>
+        <w:jc w:val="both"/>
+      </w:pPr>
+      <w:r>
+        <w:rPr>
+          <w:rFonts w:ascii="Calibri" w:hAnsi="Calibri"/>
+          <w:i w:val="0"/>
+          <w:color w:val="2D3748"/>
+          <w:sz w:val="20"/>
+        </w:rPr>
+        <w:t>The proposed model architecture operates across five tightly integrated algorithmic phases:</w:t>
       </w:r>
     </w:p>
     <w:p>
@@ -386,7 +401,7 @@
           <w:color w:val="2D3748"/>
           <w:sz w:val="20"/>
         </w:rPr>
-        <w:t xml:space="preserve">1. Chronological Ingestion &amp; Graph Projection: </w:t>
+        <w:t xml:space="preserve">1. Phase 1: Chronological Ingestion &amp; Causal History Windowing: </w:t>
       </w:r>
       <w:r>
         <w:rPr>
@@ -394,7 +409,7 @@
           <w:color w:val="2D3748"/>
           <w:sz w:val="20"/>
         </w:rPr>
-        <w:t>Sequentially maps continuous transactions to dynamic graph edges under strict time sorting.</w:t>
+        <w:t>Ingests continuous financial transactions e_k = (u_k, v_k, t_k, a_k, c_k) under strict chronological time sorting. The engine maintains a trailing causal historical subgraph H_k^(W) = { e_j ∈ E : t_k - W ≤ t_j &lt; t_k } over multi-scale sliding windows W ∈ {1d, 7d, 30d}. To guarantee zero lookahead contamination, the architecture enforces the formal read-then-insert execution invariant (∀ e_j ∈ H_k^(W), t_j &lt; t_k ⟹ e_k ∉ H_k^(W)), ensuring all topological metrics are evaluated strictly against historical graph state prior to edge insertion.</w:t>
       </w:r>
     </w:p>
     <w:p>
@@ -410,7 +425,7 @@
           <w:color w:val="2D3748"/>
           <w:sz w:val="20"/>
         </w:rPr>
-        <w:t xml:space="preserve">2. Streaming Leakage-Free Topology Engine: </w:t>
+        <w:t xml:space="preserve">2. Phase 2: Tri-Branch Multi-Taxonomic Feature Extraction: </w:t>
       </w:r>
       <w:r>
         <w:rPr>
@@ -418,7 +433,7 @@
           <w:color w:val="2D3748"/>
           <w:sz w:val="20"/>
         </w:rPr>
-        <w:t>Evaluates sliding-window structural metrics solely against historical graph state G_{&lt; t_k}.</w:t>
+        <w:t>Decomposes the transaction into three parallel, complementary feature extraction pipelines: (a) Branch A (Tabular Domain x_tab): computes non-linear amount scaling log_10(a_k + 1), running historical z-scores via Welford's algorithm over past entity postings H_k(u_k) = {j &lt; k : u_j = u_k}, diurnal periodic harmonics (sin, cos)(2π h_k / 24) where h_k is posting hour, inter-event arrival intervals Δt_k = t_k - t_last(u_k), and dictionary-encoded voucher categorical embeddings; (b) Branch B (Streaming Topology Domain g_topo): traverses the in-memory causal multigraph H_k^(W) to extract thirteen structural indicators: source out-degree, destination in-degree, fan-in ratio, fan-out ratio, counterparty reciprocity, burstiness velocity, rolling amount recurrence count (LapMemory), and depth-bounded directed cycle motifs; (c) Branch C (Continuous Dynamic Graph Memory h_dyn): executes continuous-time representation learning via a Temporal Graph Network (TGN). For each interaction, interaction messages are generated, updated through dual asymmetric GRU node memory states (s_u(t), s_v(t)), encoded with Time2Vec temporal harmonic features, and aggregated via multi-head dynamic graph attention into a 16-dimensional continuous latent embedding h_dyn(e_k, t_k).</w:t>
       </w:r>
     </w:p>
     <w:p>
@@ -434,7 +449,7 @@
           <w:color w:val="2D3748"/>
           <w:sz w:val="20"/>
         </w:rPr>
-        <w:t xml:space="preserve">3. Continuous Dynamic Graph Representation (TGN): </w:t>
+        <w:t xml:space="preserve">3. Phase 3: Hybrid Multi-Modal Feature Fusion: </w:t>
       </w:r>
       <w:r>
         <w:rPr>
@@ -442,7 +457,7 @@
           <w:color w:val="2D3748"/>
           <w:sz w:val="20"/>
         </w:rPr>
-        <w:t>Maintains continuous-time node memory states via a Temporal Graph Network.</w:t>
+        <w:t>Unifies the three disparate feature representations via the direct-sum concatenation operator z_k = x_tab(e_k) ⊕ g_topo(e_k, H_k^(W)) ⊕ h_dyn(e_k, t_k) ∈ ℝ^D (Eq. 1), yielding a unified D-dimensional structural-temporal representation that captures immediate transaction attributes, local relational network topology, and dynamic counterparty interaction trajectories.</w:t>
       </w:r>
     </w:p>
     <w:p>
@@ -458,7 +473,7 @@
           <w:color w:val="2D3748"/>
           <w:sz w:val="20"/>
         </w:rPr>
-        <w:t xml:space="preserve">4. Imbalance-Calibrated Ensemble Classifier (XGBoost): </w:t>
+        <w:t xml:space="preserve">4. Phase 4: Imbalance-Calibrated XGBoost Classification Head: </w:t>
       </w:r>
       <w:r>
         <w:rPr>
@@ -466,7 +481,7 @@
           <w:color w:val="2D3748"/>
           <w:sz w:val="20"/>
         </w:rPr>
-        <w:t>Scores transactions via an XGBoost gradient-boosted decision tree head optimized with an α-free focal loss.</w:t>
+        <w:t>Routes the fused composite vector z_k into an ensemble of gradient-boosted decision trees T_GBDT, mapping z_k → s_k ∈ ℝ (log-odds forensic margin score). The trees are trained under custom margin-space α-free focal loss ℓ_focal (Eq. 2), which suppresses gradient overwhelm from the overwhelming 99.9% non-fraud majority via the dynamic modulating factor (1 - p_k)^γ.</w:t>
       </w:r>
     </w:p>
     <w:p>
@@ -482,7 +497,7 @@
           <w:color w:val="2D3748"/>
           <w:sz w:val="20"/>
         </w:rPr>
-        <w:t xml:space="preserve">5. Privacy-Preserving Federated Consensus: </w:t>
+        <w:t xml:space="preserve">5. Phase 5: Operational Decision Gating &amp; Risk Inference: </w:t>
       </w:r>
       <w:r>
         <w:rPr>
@@ -490,31 +505,7 @@
           <w:color w:val="2D3748"/>
           <w:sz w:val="20"/>
         </w:rPr>
-        <w:t>Aggregates decentralized bank models via validation reliability weighting (FedProx).</w:t>
-      </w:r>
-    </w:p>
-    <w:p>
-      <w:pPr>
-        <w:pStyle w:val="ListBullet"/>
-        <w:spacing w:after="60" w:line="276" w:lineRule="auto"/>
-        <w:jc w:val="both"/>
-      </w:pPr>
-      <w:r>
-        <w:rPr>
-          <w:rFonts w:ascii="Calibri" w:hAnsi="Calibri"/>
-          <w:b/>
-          <w:color w:val="2D3748"/>
-          <w:sz w:val="20"/>
-        </w:rPr>
-        <w:t xml:space="preserve">6. Forensic Explainability &amp; Alert Synthesis: </w:t>
-      </w:r>
-      <w:r>
-        <w:rPr>
-          <w:rFonts w:ascii="Calibri" w:hAnsi="Calibri"/>
-          <w:color w:val="2D3748"/>
-          <w:sz w:val="20"/>
-        </w:rPr>
-        <w:t>Computes exact margin-space TreeSHAP feature attributions and extracts 2-hop causal subgraphs via Neo4j Cypher queries.</w:t>
+        <w:t>Converts the margin score s_k via sigmoid activation into calibrated posterior fraud probability p_k = σ(s_k) ∈ (0, 1). The score is gated against a validation-frozen operational decision threshold θ_audit* (ŷ_k = 𝕀(p_k ≥ θ_audit*)) to generate deterministic, triage-ready fraud alerts.</w:t>
       </w:r>
     </w:p>
     <w:p>

</xml_diff>